<commit_message>
paper 02: fix Unicode minus; rerender manuscript and online appendix paper 08: add siunitx to PDF headers; rerender manuscript and online appendix
</commit_message>
<xml_diff>
--- a/papers/02_meaning_of_democracy_revision/output/manuscript/md-manuscript.docx
+++ b/papers/02_meaning_of_democracy_revision/output/manuscript/md-manuscript.docx
@@ -23,7 +23,7 @@
         <w:pStyle w:val="Date"/>
       </w:pPr>
       <w:r>
-        <w:t xml:space="preserve">2026-03-01</w:t>
+        <w:t xml:space="preserve">2026-03-03</w:t>
       </w:r>
     </w:p>
     <w:p>
@@ -39,10 +39,10 @@
         <w:pStyle w:val="Abstract"/>
       </w:pPr>
       <w:r>
-        <w:t xml:space="preserve">Does democratic erosion reshape not just how citizens evaluate democracy but what they understand it to mean? This article estimates multinomial logit models drawing on Asian Barometer Survey data from eleven countries and four survey waves (2005–2022), with an analytic sample of 23,464 respondents who reported a vote choice and completed the democratic conceptions battery, to examine whether electoral winners and losers hold systematically different conceptions of democracy—and whether those differences respond to political context. The central finding is that they do: losers consistently gravitate toward liberal-procedural definitions of democracy, emphasizing free expression, media freedom, and judicial accountability, while winners orient toward substantive outcomes such as economic equality and welfare provision. The gap is individually small. What makes it consequential is context. In Thailand, the procedural-substantive gap widened from near zero to over twenty percentage points across a single decade of democratic erosion culminating in the 2014 military coup and its aftermath; in South Korea, where a political crisis of comparable severity was resolved through constitutional channels, the gap barely moved. Three empirical checks support a positional updating interpretation over stable cultural sorting: the loser effect amplifies among citizens who perceive elections as unfair, does not extend to non-procedural domains such as material welfare, and persists after demographic reweighting that holds coalition composition constant. If these patterns reflect updating rather than sorting, the implications for democratic resilience are troubling—erosion would concentrate procedural commitments among citizens whom the political system has rendered least capable of defending them.</w:t>
-      </w:r>
-    </w:p>
-    <w:bookmarkStart w:id="20" w:name="introduction"/>
+        <w:t xml:space="preserve">Does democratic erosion reshape not just how citizens evaluate democracy but what they understand it to mean? Electoral losers across eleven Asian democracies consistently gravitate toward liberal-procedural conceptions of democracy—free expression, media freedom, judicial accountability—while winners orient toward substantive outcomes like economic equality and welfare. The gap is small in the aggregate. Context makes it consequential. In Thailand, the procedural-substantive divide between winners and losers widened from near zero to over twenty percentage points across a single decade of democratic erosion culminating in the 2014 coup; in South Korea, where a constitutional crisis of comparable severity was resolved through institutional channels, it barely moved. Drawing on four waves of Asian Barometer Survey data (2005–2022, n = 23,464 respondents with vote choice and democratic conceptions items), multinomial logit models with country and wave fixed effects estimate this winner-loser gap while three mechanism tests distinguish positional updating from stable cultural sorting: the loser effect amplifies where citizens perceive elections as unfair, does not extend to non-procedural domains such as material welfare, and persists after demographic reweighting holds coalition composition constant. If exclusion from political authority—rather than prior disposition—drives how citizens define democracy, the implications for democratic resilience are troubling. Erosion concentrates procedural commitments among those whom the political system has rendered least capable of defending them.</w:t>
+      </w:r>
+    </w:p>
+    <w:bookmarkStart w:id="21" w:name="introduction"/>
     <w:p>
       <w:pPr>
         <w:pStyle w:val="Heading1"/>
@@ -56,7 +56,25 @@
         <w:pStyle w:val="FirstParagraph"/>
       </w:pPr>
       <w:r>
-        <w:t xml:space="preserve">Between 2010 and 2020, Thailand experienced a constitutional court’s annulment of an election, a military coup, six years of junta governance, and the return to civilian rule under a military-drafted constitution that ensured the army’s continued dominance. During this same decade, the gap between how electoral winners and losers conceptualized democracy widened from near zero to over 24 percentage points. Supporters of the excluded Thaksin-aligned parties increasingly defined democracy in terms of free elections, civil liberties, and government accountability; supporters of the military-backed order increasingly emphasized economic welfare and public services. This is not a story about who was more satisfied with democracy or more trusting of government—the attitudes that the winner-loser literature has studied extensively</w:t>
+        <w:t xml:space="preserve">Between 2010 and 2020, Thailand experienced a constitutional court’s annulment of an election, a military coup, six years of junta governance, and the return to civilian rule under a military-drafted constitution that ensured the army’s continued dominance. During this same decade, the gap between how electoral winners and losers conceptualized democracy—measured by the difference in procedural versus substantive responses on the Asian Barometer Survey—widened from near zero to over 24 percentage points</w:t>
+      </w:r>
+      <w:r>
+        <w:t xml:space="preserve">(Hu et al. 2008, 2012, 2016; Chu et al. 2022)</w:t>
+      </w:r>
+      <w:r>
+        <w:t xml:space="preserve">.</w:t>
+      </w:r>
+      <w:r>
+        <w:rPr>
+          <w:rStyle w:val="FootnoteReference"/>
+        </w:rPr>
+        <w:footnoteReference w:id="20"/>
+      </w:r>
+      <w:r>
+        <w:t xml:space="preserve"> </w:t>
+      </w:r>
+      <w:r>
+        <w:t xml:space="preserve">Supporters of the excluded Thaksin-aligned parties increasingly defined democracy in terms of free elections, civil liberties, and government accountability; supporters of the military-backed order increasingly emphasized economic welfare and public services. This is not a story about who was more satisfied with democracy or more trusting of government—the attitudes that the winner-loser literature has studied extensively</w:t>
       </w:r>
       <w:r>
         <w:t xml:space="preserve"> </w:t>
@@ -65,20 +83,7 @@
         <w:t xml:space="preserve">(Anderson et al. 2005; Singh et al. 2012)</w:t>
       </w:r>
       <w:r>
-        <w:t xml:space="preserve">. It is a story about what citizens came to believe democracy</w:t>
-      </w:r>
-      <w:r>
-        <w:t xml:space="preserve"> </w:t>
-      </w:r>
-      <w:r>
-        <w:rPr>
-          <w:i/>
-          <w:iCs/>
-        </w:rPr>
-        <w:t xml:space="preserve">means</w:t>
-      </w:r>
-      <w:r>
-        <w:t xml:space="preserve">.</w:t>
+        <w:t xml:space="preserve">. It is a story about what democracy means to citizens, and how the association between that meaning and electoral status varies across repeated cross-sections.</w:t>
       </w:r>
     </w:p>
     <w:p>
@@ -86,7 +91,46 @@
         <w:pStyle w:val="BodyText"/>
       </w:pPr>
       <w:r>
-        <w:t xml:space="preserve">South Korea offers the contrast. Over the same period, the country weathered its own crisis: the impeachment and criminal prosecution of President Park Geun-hye, mass candlelight protests, and the election of a progressive successor. Yet the gap between winners’ and losers’ conceptions of democracy never exceeded five percentage points. The critical difference was institutional. South Korea’s crisis was resolved through constitutional procedures—impeachment, judicial review, a free election—that demonstrated the system’s capacity for self-correction. Thailand’s crisis was resolved by tanks. Where institutions held, winners and losers converged on what democracy meant; where institutions collapsed, democratic meaning itself fractured along the winner-loser divide.</w:t>
+        <w:t xml:space="preserve">South Korea offers the contrast. Over the same period, the country weathered its own crisis: the impeachment and criminal prosecution of President Park Geun-hye, mass candlelight protests, and the election of a progressive successor. Yet the gap between winners’ and losers’ conceptions of democracy never exceeded five percentage points. The critical difference was institutional. South Korea’s crisis was resolved through constitutional procedures—impeachment, judicial review, a free election—that demonstrated the system’s capacity for self-correction. Thailand’s crisis was resolved by tanks. Where institutions held, winners and losers converged on what democracy meant; where institutions collapsed, democratic meaning itself fractured along the winner-loser divide. These trajectories are not isolated episodes but instances of a broader regional pattern of democratic deconsolidation across Southeast Asia</w:t>
+      </w:r>
+      <w:r>
+        <w:t xml:space="preserve"> </w:t>
+      </w:r>
+      <w:r>
+        <w:t xml:space="preserve">(Mietzner 2021)</w:t>
+      </w:r>
+      <w:r>
+        <w:t xml:space="preserve">. The literatures that should explain these trajectories have developed in parallel. Research on democratic conceptions documents considerable variation in how citizens define democracy—whether in procedural terms emphasizing elections and rights, or substantive terms emphasizing welfare and equality</w:t>
+      </w:r>
+      <w:r>
+        <w:t xml:space="preserve"> </w:t>
+      </w:r>
+      <w:r>
+        <w:t xml:space="preserve">(Dalton and Klingemann 2007; Chu et al. 2008; Ferrin and Kriesi 2016)</w:t>
+      </w:r>
+      <w:r>
+        <w:t xml:space="preserve">—but has largely treated those conceptions as stable cultural orientations, shaped by socialization and slow-moving value change. The winner-loser gap literature, meanwhile, has demonstrated that electoral status predicts satisfaction with democracy, institutional trust, and willingness to accept political outcomes</w:t>
+      </w:r>
+      <w:r>
+        <w:t xml:space="preserve"> </w:t>
+      </w:r>
+      <w:r>
+        <w:t xml:space="preserve">(Anderson et al. 2005; Anderson and LoTempio 2002; Esaiasson 2011)</w:t>
+      </w:r>
+      <w:r>
+        <w:t xml:space="preserve">. Both literatures assume, implicitly, that winners and losers are evaluating the same object when they express views about</w:t>
+      </w:r>
+      <w:r>
+        <w:t xml:space="preserve"> </w:t>
+      </w:r>
+      <w:r>
+        <w:t xml:space="preserve">“democracy.”</w:t>
+      </w:r>
+      <w:r>
+        <w:t xml:space="preserve"> </w:t>
+      </w:r>
+      <w:r>
+        <w:t xml:space="preserve">Neither has examined whether electoral status shapes not just how citizens evaluate democracy but how they understand it.</w:t>
       </w:r>
     </w:p>
     <w:p>
@@ -94,69 +138,7 @@
         <w:pStyle w:val="BodyText"/>
       </w:pPr>
       <w:r>
-        <w:t xml:space="preserve">These contrasting trajectories point to a question that two established research literatures have not addressed together. One body of scholarship documents how citizens conceptualize democracy—whether in procedural terms emphasizing elections and rights, or substantive terms emphasizing welfare and equality—and finds considerable variation across and within countries</w:t>
-      </w:r>
-      <w:r>
-        <w:t xml:space="preserve"> </w:t>
-      </w:r>
-      <w:r>
-        <w:t xml:space="preserve">(Dalton and Klingemann 2007; Chu et al. 2008; Ferrin and Kriesi 2016)</w:t>
-      </w:r>
-      <w:r>
-        <w:t xml:space="preserve">. A separate literature demonstrates that electoral winners and losers differ systematically in their satisfaction with democracy, their institutional trust, and their willingness to accept political outcomes</w:t>
-      </w:r>
-      <w:r>
-        <w:t xml:space="preserve"> </w:t>
-      </w:r>
-      <w:r>
-        <w:t xml:space="preserve">(Anderson et al. 2005; Anderson and LoTempio 2002; Esaiasson 2011)</w:t>
-      </w:r>
-      <w:r>
-        <w:t xml:space="preserve">. But while the first literature has treated democratic conceptions as relatively stable cultural orientations, and the second has assumed that winners and losers are evaluating the same thing when they express views about</w:t>
-      </w:r>
-      <w:r>
-        <w:t xml:space="preserve"> </w:t>
-      </w:r>
-      <w:r>
-        <w:t xml:space="preserve">“democracy,”</w:t>
-      </w:r>
-      <w:r>
-        <w:t xml:space="preserve"> </w:t>
-      </w:r>
-      <w:r>
-        <w:t xml:space="preserve">neither has examined whether electoral status shapes not just how citizens</w:t>
-      </w:r>
-      <w:r>
-        <w:t xml:space="preserve"> </w:t>
-      </w:r>
-      <w:r>
-        <w:rPr>
-          <w:i/>
-          <w:iCs/>
-        </w:rPr>
-        <w:t xml:space="preserve">evaluate</w:t>
-      </w:r>
-      <w:r>
-        <w:t xml:space="preserve"> </w:t>
-      </w:r>
-      <w:r>
-        <w:t xml:space="preserve">democracy but how they</w:t>
-      </w:r>
-      <w:r>
-        <w:t xml:space="preserve"> </w:t>
-      </w:r>
-      <w:r>
-        <w:rPr>
-          <w:i/>
-          <w:iCs/>
-        </w:rPr>
-        <w:t xml:space="preserve">understand</w:t>
-      </w:r>
-      <w:r>
-        <w:t xml:space="preserve"> </w:t>
-      </w:r>
-      <w:r>
-        <w:t xml:space="preserve">it.</w:t>
+        <w:t xml:space="preserve">I estimate multinomial logit models on four waves of Asian Barometer Survey data (2005–2022), with an analytic sample of 23,464 voters across 11 countries. Electoral losers consistently gravitate toward procedural elements of democracy—competitive elections, civil liberties, government accountability—at the expense of substantive outcomes like economic equality or welfare provision. In pooled cross-national estimates, these effects are individually small, on the order of two to four percentage points per item. But the pattern holds across twenty items drawn from five separate survey batteries, and it is the directional consistency—not any single coefficient—that constitutes the substantive finding. More importantly, the effect is not constant. It tracks democratic erosion in Thailand, holds steady amid institutional resilience in South Korea, and sits persistently high in Cambodia, where competitive authoritarianism ensured the stakes of losing were extreme from the start.</w:t>
       </w:r>
     </w:p>
     <w:p>
@@ -164,7 +146,7 @@
         <w:pStyle w:val="BodyText"/>
       </w:pPr>
       <w:r>
-        <w:t xml:space="preserve">This article presents evidence that it does. I estimate multinomial logit models on four waves of Asian Barometer Survey data (2005–2022), with an analytic sample of 23,464 voters across 11 countries, and find that electoral losers consistently gravitate toward procedural elements of democracy—competitive elections, civil liberties, government accountability—at the expense of substantive outcomes like economic equality or welfare provision. In pooled cross-national estimates, these effects are individually small, on the order of two to four percentage points per item. But the pattern holds across twenty items drawn from five separate survey batteries, and that directional consistency is what makes the finding substantively important. What matters most, though, is that the effect is not constant. It tracks democratic erosion in Thailand, holds steady amid institutional resilience in South Korea, and sits persistently high in Cambodia, where the competitive authoritarian regime ensured the stakes of losing were extreme from the start.</w:t>
+        <w:t xml:space="preserve">I interpret this pattern through a framework I call positional updating: citizens excluded from political authority gravitate toward procedural safeguards—the institutional architecture that might restore their access to power. The strongest evidence for this reading comes from the fairness mechanism test—the loser effect amplifies sharply among respondents who perceive elections as unfair, exactly the circumstance in which procedural threat is most palpable. That the amplification does not spill over into material welfare perceptions rules out generalized discontent as the driver. A demographic reweighting exercise, meanwhile, confirms that Thailand’s widening gap is not an artifact of changing coalition composition. None of these tests establishes causation definitively. But taken together, they sit uneasily with accounts that treat democratic conceptions as stable cultural orientations.</w:t>
       </w:r>
     </w:p>
     <w:p>
@@ -172,7 +154,16 @@
         <w:pStyle w:val="BodyText"/>
       </w:pPr>
       <w:r>
-        <w:t xml:space="preserve">I interpret this pattern as evidence of positional updating, and three empirical checks support the interpretation. The loser effect grows stronger among respondents who perceive elections as unfair—exactly the circumstance in which procedural threat is most palpable. A placebo test demonstrates that this amplification does not spill over into material welfare perceptions, which rules out a generalized discontent story. And a demographic reweighting exercise confirms that Thailand’s widening gap is not an artifact of changing coalition composition. None of these tests can nail down causation with certainty, but taken together they sit uneasily with accounts that treat democratic conceptions as stable cultural orientations. The weight of the evidence favors a positional reading.</w:t>
+        <w:t xml:space="preserve">The weight of the evidence points toward a dynamic that complicates recent optimism about democratic resilience. Scholars have asked whether broad public commitment to democracy might function as a check on backsliding</w:t>
+      </w:r>
+      <w:r>
+        <w:t xml:space="preserve"> </w:t>
+      </w:r>
+      <w:r>
+        <w:t xml:space="preserve">(Claassen 2020; Svolik 2019; Graham and Svolik 2020)</w:t>
+      </w:r>
+      <w:r>
+        <w:t xml:space="preserve">. The results here suggest something closer to the opposite: in the places where erosion cuts deepest, it is the people with the least political leverage who end up caring most about procedural safeguards. Winners who benefit from the prevailing order feel no particular need to define democracy in terms of free elections and civil liberties. Losers do—but they cannot do anything about it. If this dynamic is widespread, then aggregate measures of democratic support may paint an overly reassuring picture, averaging together winners who do not care much about procedures and losers who care deeply but lack the power to defend them.</w:t>
       </w:r>
     </w:p>
     <w:p>
@@ -180,16 +171,90 @@
         <w:pStyle w:val="BodyText"/>
       </w:pPr>
       <w:r>
-        <w:t xml:space="preserve">These findings have an uncomfortable implication for how we think about democratic resilience. Scholars have recently asked whether broad public commitment to democracy might function as a check on backsliding</w:t>
-      </w:r>
-      <w:r>
-        <w:t xml:space="preserve"> </w:t>
-      </w:r>
-      <w:r>
-        <w:t xml:space="preserve">(Claassen 2020; Svolik 2019; Graham and Svolik 2020)</w:t>
-      </w:r>
-      <w:r>
-        <w:t xml:space="preserve">. But the results here suggest something close to the opposite: in the places where erosion cuts deepest, it is the people with the least political leverage who end up caring most about procedural safeguards. The citizens who prize free elections and civil liberties above all else are the same citizens whose side has been shut out of power. If this dynamic is widespread, then aggregate measures of democratic support may paint an overly reassuring picture—averaging together winners who do not care much about procedures and losers who care deeply but cannot do anything about it.</w:t>
+        <w:t xml:space="preserve">The item-level results—visible regardless of modeling approach but preserved by the multinomial specification’s refusal to collapse responses into binary indicators—highlight one further pattern worth flagging. Losers’ procedural orientation centers on the liberal components of democracy—media freedom, free expression, the right to organize—not elections per se. The distinction matters for how we understand the relationship between electoral experience and democratic commitment, and I return to it in the discussion.</w:t>
+      </w:r>
+    </w:p>
+    <w:bookmarkEnd w:id="21"/>
+    <w:bookmarkStart w:id="26" w:name="X4847605da6811474624618573a5708060835a16"/>
+    <w:p>
+      <w:pPr>
+        <w:pStyle w:val="Heading1"/>
+      </w:pPr>
+      <w:r>
+        <w:t xml:space="preserve">Positional Updating and Democratic Conceptions</w:t>
+      </w:r>
+    </w:p>
+    <w:p>
+      <w:pPr>
+        <w:pStyle w:val="FirstParagraph"/>
+      </w:pPr>
+      <w:r>
+        <w:t xml:space="preserve">The argument begins with the observation that citizens hold meaningfully different conceptions of democracy, varying in the weight they assign to procedural rules versus substantive outcomes. From there it draws on the winner-loser gap literature to argue that electoral status creates systematically different orientations toward these dimensions, before specifying the mechanism—positional updating—and deriving predictions that distinguish it from competing accounts.</w:t>
+      </w:r>
+    </w:p>
+    <w:bookmarkStart w:id="22" w:name="the-procedural-substantive-distinction"/>
+    <w:p>
+      <w:pPr>
+        <w:pStyle w:val="Heading2"/>
+      </w:pPr>
+      <w:r>
+        <w:t xml:space="preserve">The procedural-substantive distinction</w:t>
+      </w:r>
+    </w:p>
+    <w:p>
+      <w:pPr>
+        <w:pStyle w:val="FirstParagraph"/>
+      </w:pPr>
+      <w:r>
+        <w:t xml:space="preserve">A foundational line of comparative research draws a distinction between procedural and substantive visions of democracy. On one side sit definitions anchored in rules and institutions—competitive elections, civil liberties, the rule of law, and the accountability mechanisms that keep officeholders in check</w:t>
+      </w:r>
+      <w:r>
+        <w:t xml:space="preserve"> </w:t>
+      </w:r>
+      <w:r>
+        <w:t xml:space="preserve">(Dahl 1977; Schumpeter 2013; Schedler 1998)</w:t>
+      </w:r>
+      <w:r>
+        <w:t xml:space="preserve">. On the other sit definitions organized around what government actually delivers: reduced inequality, social protection, and responsiveness to popular demands</w:t>
+      </w:r>
+      <w:r>
+        <w:t xml:space="preserve"> </w:t>
+      </w:r>
+      <w:r>
+        <w:t xml:space="preserve">(Diamond 1999; Linz and Stepan 1996)</w:t>
+      </w:r>
+      <w:r>
+        <w:t xml:space="preserve">. Survey research has repeatedly shown that ordinary people hold both kinds of conceptions, though the balance tips depending on context. Publics in younger democracies lean toward substantive criteria, while citizens in consolidated democracies invoke procedural ones more readily</w:t>
+      </w:r>
+      <w:r>
+        <w:t xml:space="preserve"> </w:t>
+      </w:r>
+      <w:r>
+        <w:t xml:space="preserve">(Dalton and Klingemann 2007; Bratton and Mattes 2001)</w:t>
+      </w:r>
+      <w:r>
+        <w:t xml:space="preserve">. Across Asia, the picture is especially layered: people blend procedural and substantive elements in ways that vary enormously both across and within countries</w:t>
+      </w:r>
+      <w:r>
+        <w:t xml:space="preserve"> </w:t>
+      </w:r>
+      <w:r>
+        <w:t xml:space="preserve">(Chu et al. 2008; Chu and Huang 2010; Cho 2014; Shin and Kim 2018)</w:t>
+      </w:r>
+      <w:r>
+        <w:t xml:space="preserve">. Partisan dynamics matter too.</w:t>
+      </w:r>
+      <w:r>
+        <w:t xml:space="preserve"> </w:t>
+      </w:r>
+      <w:r>
+        <w:t xml:space="preserve">Hsiao and Yu (2020)</w:t>
+      </w:r>
+      <w:r>
+        <w:t xml:space="preserve"> </w:t>
+      </w:r>
+      <w:r>
+        <w:t xml:space="preserve">demonstrate that affective polarization in Taiwan attenuates support for democracy, indicating that political position—not just cultural background—mediates how citizens relate to democratic principles.</w:t>
       </w:r>
     </w:p>
     <w:p>
@@ -197,43 +262,527 @@
         <w:pStyle w:val="BodyText"/>
       </w:pPr>
       <w:r>
-        <w:t xml:space="preserve">The analysis bridges the study of democratic conceptions and the winner-loser gap by demonstrating that electoral status shapes democratic</w:t>
-      </w:r>
-      <w:r>
-        <w:t xml:space="preserve"> </w:t>
-      </w:r>
-      <w:r>
-        <w:rPr>
-          <w:i/>
-          <w:iCs/>
-        </w:rPr>
-        <w:t xml:space="preserve">meaning</w:t>
-      </w:r>
-      <w:r>
-        <w:t xml:space="preserve">, not merely democratic</w:t>
-      </w:r>
-      <w:r>
-        <w:t xml:space="preserve"> </w:t>
-      </w:r>
-      <w:r>
-        <w:rPr>
-          <w:i/>
-          <w:iCs/>
-        </w:rPr>
-        <w:t xml:space="preserve">evaluation</w:t>
-      </w:r>
-      <w:r>
-        <w:t xml:space="preserve">—and that this effect is dynamic, tracking political conditions within countries over time. The multinomial logit approach, which preserves the full structure of respondents’ choices across twenty items rather than collapsing responses into binary procedural-substantive indicators, reveals an additional finding: losers’ procedural orientation centers on the liberal components of democracy (media freedom, free expression, the right to organize), not elections per se, a distinction with implications for how we understand the relationship between electoral experience and democratic commitment.</w:t>
-      </w:r>
-    </w:p>
-    <w:bookmarkEnd w:id="20"/>
-    <w:bookmarkStart w:id="25" w:name="X4847605da6811474624618573a5708060835a16"/>
+        <w:t xml:space="preserve">The stakes of this variation are concrete: how citizens define democracy shapes how they evaluate it. If democracy means free elections, competitive voting may suffice for legitimacy; if it means economic equality, procedural compliance without material progress breeds disillusionment. Yet existing scholarship has largely treated conceptions as stable attributes of individuals or societies: cultural inheritances shaped by historical experience, regime type, or modernization trajectories</w:t>
+      </w:r>
+      <w:r>
+        <w:t xml:space="preserve"> </w:t>
+      </w:r>
+      <w:r>
+        <w:t xml:space="preserve">(Shin 2011; Inglehart 1997; Canache 2012; Ferrin and Kriesi 2016)</w:t>
+      </w:r>
+      <w:r>
+        <w:t xml:space="preserve">. What remains largely unexplored is what drives</w:t>
+      </w:r>
+      <w:r>
+        <w:t xml:space="preserve"> </w:t>
+      </w:r>
+      <w:r>
+        <w:rPr>
+          <w:i/>
+          <w:iCs/>
+        </w:rPr>
+        <w:t xml:space="preserve">within-country, within-period</w:t>
+      </w:r>
+      <w:r>
+        <w:t xml:space="preserve"> </w:t>
+      </w:r>
+      <w:r>
+        <w:t xml:space="preserve">variation in how individual citizens conceptualize democracy.</w:t>
+      </w:r>
+    </w:p>
+    <w:bookmarkEnd w:id="22"/>
+    <w:bookmarkStart w:id="23" w:name="X11a8e346ff56b38bee222de48b8988c588c9339"/>
+    <w:p>
+      <w:pPr>
+        <w:pStyle w:val="Heading2"/>
+      </w:pPr>
+      <w:r>
+        <w:t xml:space="preserve">Electoral status as a source of conceptual divergence</w:t>
+      </w:r>
+    </w:p>
+    <w:p>
+      <w:pPr>
+        <w:pStyle w:val="FirstParagraph"/>
+      </w:pPr>
+      <w:r>
+        <w:t xml:space="preserve">The winner-loser gap literature provides a candidate answer. Decades of research have established that citizens whose preferred party prevailed in the most recent election look different attitudinally from those whose party lost: winners report higher institutional trust, greater satisfaction with democracy, and more willingness to accept political outcomes</w:t>
+      </w:r>
+      <w:r>
+        <w:t xml:space="preserve"> </w:t>
+      </w:r>
+      <w:r>
+        <w:t xml:space="preserve">(Anderson et al. 2005; Anderson and LoTempio 2002; Nadeau and Blais 1993)</w:t>
+      </w:r>
+      <w:r>
+        <w:t xml:space="preserve">. How large these gaps are depends on institutional design—losers in majoritarian systems tend to be more discontented than losers in consensus democracies</w:t>
+      </w:r>
+      <w:r>
+        <w:t xml:space="preserve"> </w:t>
+      </w:r>
+      <w:r>
+        <w:t xml:space="preserve">(Anderson and Guillory 1997; Singh et al. 2012)</w:t>
+      </w:r>
+      <w:r>
+        <w:t xml:space="preserve">—and perceptions of procedural fairness play a mediating role</w:t>
+      </w:r>
+      <w:r>
+        <w:t xml:space="preserve"> </w:t>
+      </w:r>
+      <w:r>
+        <w:t xml:space="preserve">(Esaiasson 2011; Esaiasson and Öhberg 2020)</w:t>
+      </w:r>
+      <w:r>
+        <w:t xml:space="preserve">. More recent work has extended these findings to non-Western contexts and hybrid regimes</w:t>
+      </w:r>
+      <w:r>
+        <w:t xml:space="preserve"> </w:t>
+      </w:r>
+      <w:r>
+        <w:t xml:space="preserve">(Blais et al. 2025; Mauk 2020)</w:t>
+      </w:r>
+      <w:r>
+        <w:t xml:space="preserve">, while</w:t>
+      </w:r>
+      <w:r>
+        <w:t xml:space="preserve"> </w:t>
+      </w:r>
+      <w:r>
+        <w:t xml:space="preserve">Monsiváis-Carrillo (2020)</w:t>
+      </w:r>
+      <w:r>
+        <w:t xml:space="preserve"> </w:t>
+      </w:r>
+      <w:r>
+        <w:t xml:space="preserve">finds that winners are</w:t>
+      </w:r>
+      <w:r>
+        <w:t xml:space="preserve"> </w:t>
+      </w:r>
+      <w:r>
+        <w:t xml:space="preserve">“permissive”</w:t>
+      </w:r>
+      <w:r>
+        <w:t xml:space="preserve"> </w:t>
+      </w:r>
+      <w:r>
+        <w:t xml:space="preserve">in their assessments of democratic freedoms regardless of actual institutional quality—it is losers who discriminate between functioning and degraded protections. In a particularly relevant study,</w:t>
+      </w:r>
+      <w:r>
+        <w:t xml:space="preserve"> </w:t>
+      </w:r>
+      <w:r>
+        <w:t xml:space="preserve">Ricks and Hicken (2025)</w:t>
+      </w:r>
+      <w:r>
+        <w:t xml:space="preserve"> </w:t>
+      </w:r>
+      <w:r>
+        <w:t xml:space="preserve">show that Thailand’s 2023 election—held under a hybrid regime with military-drafted rules—nonetheless generated the classic winner-loser divergence in attitudes toward state institutions, evidence that the mechanism is not confined to full democracies.</w:t>
+      </w:r>
+    </w:p>
+    <w:p>
+      <w:pPr>
+        <w:pStyle w:val="BodyText"/>
+      </w:pPr>
+      <w:r>
+        <w:t xml:space="preserve">The limitation is one of scope: this literature has focused on</w:t>
+      </w:r>
+      <w:r>
+        <w:t xml:space="preserve"> </w:t>
+      </w:r>
+      <w:r>
+        <w:rPr>
+          <w:i/>
+          <w:iCs/>
+        </w:rPr>
+        <w:t xml:space="preserve">evaluations</w:t>
+      </w:r>
+      <w:r>
+        <w:t xml:space="preserve">—how much citizens support, trust, or feel satisfied with democracy—while treating the underlying object of evaluation as shared. Winners and losers are assumed to mean the same thing when they express views about</w:t>
+      </w:r>
+      <w:r>
+        <w:t xml:space="preserve"> </w:t>
+      </w:r>
+      <w:r>
+        <w:t xml:space="preserve">“democracy”</w:t>
+      </w:r>
+      <w:r>
+        <w:t xml:space="preserve">; they simply differ in how positively they assess it. If electoral status shapes not only evaluations but</w:t>
+      </w:r>
+      <w:r>
+        <w:t xml:space="preserve"> </w:t>
+      </w:r>
+      <w:r>
+        <w:rPr>
+          <w:i/>
+          <w:iCs/>
+        </w:rPr>
+        <w:t xml:space="preserve">conceptions</w:t>
+      </w:r>
+      <w:r>
+        <w:t xml:space="preserve">—if winners and losers are in fact evaluating different things—then the winner-loser gap may be deeper than the existing literature has recognized, and the two literatures’ isolation from one another represents a missed theoretical opportunity.</w:t>
+      </w:r>
+    </w:p>
+    <w:p>
+      <w:pPr>
+        <w:pStyle w:val="BodyText"/>
+      </w:pPr>
+      <w:r>
+        <w:t xml:space="preserve">The question of whether electoral status shapes conceptions, not just evaluations, has begun to attract attention, though the existing work stops short of the dynamic, erosion-conditional account developed here.</w:t>
+      </w:r>
+      <w:r>
+        <w:t xml:space="preserve"> </w:t>
+      </w:r>
+      <w:r>
+        <w:t xml:space="preserve">Cohen et al. (2023)</w:t>
+      </w:r>
+      <w:r>
+        <w:t xml:space="preserve"> </w:t>
+      </w:r>
+      <w:r>
+        <w:t xml:space="preserve">invert the classic</w:t>
+      </w:r>
+      <w:r>
+        <w:t xml:space="preserve"> </w:t>
+      </w:r>
+      <w:r>
+        <w:t xml:space="preserve">“losers’ consent”</w:t>
+      </w:r>
+      <w:r>
+        <w:t xml:space="preserve"> </w:t>
+      </w:r>
+      <w:r>
+        <w:t xml:space="preserve">framework by tracking Brazilian voters through Bolsonaro’s 2018 victory; they find that winners’ abstract support for democracy rose even as their tolerance for executive self-coups—closing Congress, sidelining the Supreme Court—increased in tandem. The result is a portrait of superficial democratic commitment: winners embrace the system’s label while hollowing out its procedural substance. Cohen et al. do not, however, examine whether winners and losers come to define democracy differently; their dependent variables remain evaluations of democratic institutions rather than conceptions of what those institutions should look like.</w:t>
+      </w:r>
+      <w:r>
+        <w:t xml:space="preserve"> </w:t>
+      </w:r>
+      <w:r>
+        <w:t xml:space="preserve">Wu and Wu (2022)</w:t>
+      </w:r>
+      <w:r>
+        <w:t xml:space="preserve"> </w:t>
+      </w:r>
+      <w:r>
+        <w:t xml:space="preserve">take up the conceptual question directly, using the same Asian Barometer data employed here to show that the winner-loser gap in liberal democratic values is substantially larger in competitive authoritarian regimes than in democracies—a finding consistent with H2 above. Yet their framework treats regime type as a static cross-sectional moderator; the analysis cannot capture the emergence of conceptual divergence as a country slides from democracy into authoritarianism, which is precisely what the Thai trajectory documents.</w:t>
+      </w:r>
+      <w:r>
+        <w:t xml:space="preserve"> </w:t>
+      </w:r>
+      <w:r>
+        <w:t xml:space="preserve">Bryan (2023)</w:t>
+      </w:r>
+      <w:r>
+        <w:t xml:space="preserve"> </w:t>
+      </w:r>
+      <w:r>
+        <w:t xml:space="preserve">pushes furthest, demonstrating across seventy-four countries that partisans in power hold more illiberal conceptions of democracy while maintaining explicit support for the democratic label, framing the pattern as partisan-motivated reasoning operating universally. The global scope is impressive, but the universality of the account is also its limitation: if conceptual divergence is a general feature of being in power, then it should appear everywhere and always, which sits uneasily with cases like South Korea where the gap remains negligible despite dramatic political upheaval. The positional updating framework advanced here differs from all three in specifying democratic erosion as the conditioning variable—not a single authoritarian victory</w:t>
+      </w:r>
+      <w:r>
+        <w:t xml:space="preserve"> </w:t>
+      </w:r>
+      <w:r>
+        <w:t xml:space="preserve">(Cohen et al. 2023)</w:t>
+      </w:r>
+      <w:r>
+        <w:t xml:space="preserve">, not a static regime category</w:t>
+      </w:r>
+      <w:r>
+        <w:t xml:space="preserve"> </w:t>
+      </w:r>
+      <w:r>
+        <w:t xml:space="preserve">(Wu and Wu 2022)</w:t>
+      </w:r>
+      <w:r>
+        <w:t xml:space="preserve">, and not an unconditional cognitive bias (Bryan), but a dynamic process that raises the stakes of exclusion and thereby amplifies losers’ procedural orientation.</w:t>
+      </w:r>
+    </w:p>
+    <w:bookmarkEnd w:id="23"/>
+    <w:bookmarkStart w:id="24" w:name="X337516c19cfec44fb568e8aec80a3f7df0bb688"/>
+    <w:p>
+      <w:pPr>
+        <w:pStyle w:val="Heading2"/>
+      </w:pPr>
+      <w:r>
+        <w:t xml:space="preserve">Positional updating: mechanism and predictions</w:t>
+      </w:r>
+    </w:p>
+    <w:p>
+      <w:pPr>
+        <w:pStyle w:val="FirstParagraph"/>
+      </w:pPr>
+      <w:r>
+        <w:t xml:space="preserve">I propose that electoral status shapes democratic conceptions through what I call positional updating. The core logic turns on asymmetric salience: procedures and outcomes carry different weight depending on whether one is in or out of power. If your party runs the government, your attention naturally drifts toward policy outputs—what is being built, distributed, reformed. If your party lost, you start to care a great deal about the rules of the game: Is there a fair shot at winning next time? Can the press still criticize? Can the courts still push back?</w:t>
+      </w:r>
+    </w:p>
+    <w:p>
+      <w:pPr>
+        <w:pStyle w:val="BodyText"/>
+      </w:pPr>
+      <w:r>
+        <w:t xml:space="preserve">Experimental and quasi-experimental evidence reinforces this logic:</w:t>
+      </w:r>
+      <w:r>
+        <w:t xml:space="preserve"> </w:t>
+      </w:r>
+      <w:r>
+        <w:t xml:space="preserve">Halliez and Thornton (2023)</w:t>
+      </w:r>
+      <w:r>
+        <w:t xml:space="preserve"> </w:t>
+      </w:r>
+      <w:r>
+        <w:t xml:space="preserve">show that the winner-loser gap in democratic satisfaction forms only once electoral uncertainty resolves, suggesting the operative mechanism is the experience of</w:t>
+      </w:r>
+      <w:r>
+        <w:t xml:space="preserve"> </w:t>
+      </w:r>
+      <w:r>
+        <w:rPr>
+          <w:i/>
+          <w:iCs/>
+        </w:rPr>
+        <w:t xml:space="preserve">knowing</w:t>
+      </w:r>
+      <w:r>
+        <w:t xml:space="preserve"> </w:t>
+      </w:r>
+      <w:r>
+        <w:t xml:space="preserve">one’s status rather than pre-existing dispositional differences. This selective attention runs on motivated cognition</w:t>
+      </w:r>
+      <w:r>
+        <w:t xml:space="preserve"> </w:t>
+      </w:r>
+      <w:r>
+        <w:t xml:space="preserve">(Kunda 1990; Taber and Lodge 2006)</w:t>
+      </w:r>
+      <w:r>
+        <w:t xml:space="preserve">. Citizens do not arrive at their understanding of democracy through disinterested reflection; rather, they attend to and weight those dimensions of democracy that are instrumentally relevant to their political position. Losers orient toward procedural features because procedures are the tools of the excluded—the mechanisms through which power can be contested, checked, and ultimately recaptured. Winners orient toward substantive outcomes because they occupy the position from which outcomes are delivered. In this sense, the mechanism parallels the political conditioning of economic perceptions documented in other domains: just as partisan position shapes whether citizens view the economy favorably</w:t>
+      </w:r>
+      <w:r>
+        <w:t xml:space="preserve"> </w:t>
+      </w:r>
+      <w:r>
+        <w:t xml:space="preserve">(Evans and Andersen 2006; Fiorina 1978)</w:t>
+      </w:r>
+      <w:r>
+        <w:t xml:space="preserve">, electoral status shapes which features of democracy citizens attend to and prioritize. Emphasizing procedural democracy also serves losers’ discursive interests: a government can be criticized for violating democratic procedures in ways that a government cannot easily be criticized for failing to realize one’s preferred substantive vision.</w:t>
+      </w:r>
+    </w:p>
+    <w:p>
+      <w:pPr>
+        <w:pStyle w:val="BodyText"/>
+      </w:pPr>
+      <w:r>
+        <w:t xml:space="preserve">A clarification is in order: this framework does not require losers to sit down and calculate their odds of returning to power. The mechanism is more basic than that. People who backed the losing side—whatever their party’s organizational heft—find themselves on the outside of the coalition that runs the state, makes policy, and allocates resources. That structural fact sharpens their awareness of the procedural guardrails that limit what incumbents can do. It is not that losers cynically adopt a procedural vocabulary; it is that procedural protections become more relevant to people who lack access to executive power.</w:t>
+      </w:r>
+    </w:p>
+    <w:p>
+      <w:pPr>
+        <w:pStyle w:val="BodyText"/>
+      </w:pPr>
+      <w:r>
+        <w:t xml:space="preserve">This exclusion-based reading yields a testable distinction. If positional updating were really about partisan strategy—opposition leaders rallying their base around procedural rhetoric—we would expect the effect to cluster among supporters of the main opposition party, whose leadership has both the organizational muscle and the electoral motive to wave the procedural banner. But if what drives the effect is the more diffuse experience of being locked out of government, then the procedural orientation should show up across the board: minor-party supporters, independents, anyone who did not back the winner. The supplementary analysis in Appendix J confirms the latter pattern.</w:t>
+      </w:r>
+    </w:p>
+    <w:p>
+      <w:pPr>
+        <w:pStyle w:val="BodyText"/>
+      </w:pPr>
+      <w:r>
+        <w:t xml:space="preserve">From this positional account I derive three predictions. Each one helps separate the positional story from the most obvious rival—that democratic conceptions are essentially stable cultural orientations or fixed personality traits.</w:t>
+      </w:r>
+    </w:p>
+    <w:p>
+      <w:pPr>
+        <w:pStyle w:val="BodyText"/>
+      </w:pPr>
+      <w:r>
+        <w:t xml:space="preserve">The first prediction is shared with the cultural account: losers should lean procedural and winners should lean substantive. A cultural explanation could generate the same cross-sectional pattern by pointing to the ideological profiles of parties that happen to be in opposition. So H1 alone cannot adjudicate between the two.</w:t>
+      </w:r>
+    </w:p>
+    <w:p>
+      <w:pPr>
+        <w:pStyle w:val="BodyText"/>
+      </w:pPr>
+      <w:r>
+        <w:rPr>
+          <w:i/>
+          <w:iCs/>
+        </w:rPr>
+        <w:t xml:space="preserve">H1:</w:t>
+      </w:r>
+      <w:r>
+        <w:t xml:space="preserve"> </w:t>
+      </w:r>
+      <w:r>
+        <w:t xml:space="preserve">Electoral losers will be more likely than winners to prioritize procedural over substantive conceptions of democracy.</w:t>
+      </w:r>
+    </w:p>
+    <w:p>
+      <w:pPr>
+        <w:pStyle w:val="BodyText"/>
+      </w:pPr>
+      <w:r>
+        <w:t xml:space="preserve">The second prediction is where the positional logic starts to bite. If what matters is the</w:t>
+      </w:r>
+      <w:r>
+        <w:t xml:space="preserve"> </w:t>
+      </w:r>
+      <w:r>
+        <w:rPr>
+          <w:i/>
+          <w:iCs/>
+        </w:rPr>
+        <w:t xml:space="preserve">stakes</w:t>
+      </w:r>
+      <w:r>
+        <w:t xml:space="preserve"> </w:t>
+      </w:r>
+      <w:r>
+        <w:t xml:space="preserve">of losing, then the gap should widen where losing really hurts—where institutions are weak, alternation is rare, and exclusion from power threatens to become permanent. Loss aversion</w:t>
+      </w:r>
+      <w:r>
+        <w:t xml:space="preserve"> </w:t>
+      </w:r>
+      <w:r>
+        <w:t xml:space="preserve">(Kahneman and Tversky 1979)</w:t>
+      </w:r>
+      <w:r>
+        <w:t xml:space="preserve"> </w:t>
+      </w:r>
+      <w:r>
+        <w:t xml:space="preserve">reinforces the point: the prospect of losing established rights weighs more heavily than the prospect of gaining new benefits, which should amplify losers’ procedural orientation in high-stakes environments.</w:t>
+      </w:r>
+    </w:p>
+    <w:p>
+      <w:pPr>
+        <w:pStyle w:val="BodyText"/>
+      </w:pPr>
+      <w:r>
+        <w:rPr>
+          <w:i/>
+          <w:iCs/>
+        </w:rPr>
+        <w:t xml:space="preserve">H2:</w:t>
+      </w:r>
+      <w:r>
+        <w:t xml:space="preserve"> </w:t>
+      </w:r>
+      <w:r>
+        <w:t xml:space="preserve">The loser effect will be larger in political contexts where losing is more consequential—where democratic institutions are weaker or power alternation less frequent.</w:t>
+      </w:r>
+    </w:p>
+    <w:p>
+      <w:pPr>
+        <w:pStyle w:val="BodyText"/>
+      </w:pPr>
+      <w:r>
+        <w:t xml:space="preserve">Third, and most critically for distinguishing positional updating from cultural accounts: if conceptions are cultural inheritances or stable dispositions, they should not shift appreciably within countries over periods shorter than a generation. The positional account, by contrast, predicts that conceptions will respond dynamically to changes in the political stakes of losing—growing when institutions weaken and shrinking when institutional protections are restored through alternation or constitutional resolution of crises.</w:t>
+      </w:r>
+    </w:p>
+    <w:p>
+      <w:pPr>
+        <w:pStyle w:val="BodyText"/>
+      </w:pPr>
+      <w:r>
+        <w:rPr>
+          <w:i/>
+          <w:iCs/>
+        </w:rPr>
+        <w:t xml:space="preserve">H3:</w:t>
+      </w:r>
+      <w:r>
+        <w:t xml:space="preserve"> </w:t>
+      </w:r>
+      <w:r>
+        <w:t xml:space="preserve">Within countries, the loser effect will respond to changes in political context, growing when democratic institutions weaken and shrinking when power alternates.</w:t>
+      </w:r>
+    </w:p>
+    <w:p>
+      <w:pPr>
+        <w:pStyle w:val="BodyText"/>
+      </w:pPr>
+      <w:r>
+        <w:t xml:space="preserve">H3 is the hypothesis that most sharply distinguishes the positional account from its alternatives, and the one whose confirmation would represent the strongest evidence for the theoretical framework advanced here. The within-country trajectories examined below provide the most direct test.</w:t>
+      </w:r>
+    </w:p>
+    <w:bookmarkEnd w:id="24"/>
+    <w:bookmarkStart w:id="25" w:name="positional-updating-and-elite-cueing"/>
+    <w:p>
+      <w:pPr>
+        <w:pStyle w:val="Heading2"/>
+      </w:pPr>
+      <w:r>
+        <w:t xml:space="preserve">Positional Updating and Elite Cueing</w:t>
+      </w:r>
+    </w:p>
+    <w:p>
+      <w:pPr>
+        <w:pStyle w:val="FirstParagraph"/>
+      </w:pPr>
+      <w:r>
+        <w:t xml:space="preserve">The most plausible rival to positional updating is not stable dispositions but elite cueing: the possibility that party elites strategically reframe democratic rhetoric, and their supporters absorb the new language. In Thailand’s post-2006 turmoil, the Democrat Party and its allied movements increasingly invoked judicial independence and media freedom as bulwarks against Thaksin’s perceived majoritarian excesses. If losers adopted procedural language because their party told them to, the observed pattern would look identical to positional updating without any independent cognitive response to exclusion.</w:t>
+      </w:r>
+    </w:p>
+    <w:p>
+      <w:pPr>
+        <w:pStyle w:val="BodyText"/>
+      </w:pPr>
+      <w:r>
+        <w:t xml:space="preserve">Two observable implications distinguish the mechanisms—imperfectly but usefully. Elite cueing predicts that the procedural shift should concentrate among strong partisans with high exposure to party messaging. Positional updating, by contrast, predicts a broader effect: even weakly attached losers and supporters of minor parties, who lack a coherent elite signal, should exhibit procedural orientations if the operative mechanism is exclusion from governing authority rather than absorption of party rhetoric. The three-way decomposition in Appendix J provides suggestive evidence on this point. Other Losers—a category that includes minor party supporters and independents with minimal exposure to organized opposition messaging—display procedural orientations comparable to Key Opposition supporters in all three countries where the decomposition is feasible. The loser effect does not appear to be an artifact of opposition party mobilization alone.</w:t>
+      </w:r>
+    </w:p>
+    <w:p>
+      <w:pPr>
+        <w:pStyle w:val="BodyText"/>
+      </w:pPr>
+      <w:r>
+        <w:t xml:space="preserve">A second distinguishing implication concerns temporal dynamics. Elite cueing should track specific rhetorical campaigns and their reach; it should spike when elites actively contest democratic norms and dissipate when the rhetorical environment shifts. Positional updating tied to institutional exclusion, by contrast, should cumulate as erosion deepens and institutions become demonstrably less protective. Thailand’s trajectory—where the procedural gap widens monotonically from Wave 3 through Wave 6 despite substantial shifts in the rhetorical landscape, including a military government that actively suppressed opposition messaging after 2014—fits the exclusion story better than a cueing account that requires sustained rhetorical transmission.</w:t>
+      </w:r>
+    </w:p>
+    <w:p>
+      <w:pPr>
+        <w:pStyle w:val="BodyText"/>
+      </w:pPr>
+      <w:r>
+        <w:t xml:space="preserve">These tests are suggestive, not definitive. Elite cueing and positional updating likely operate simultaneously, and the data cannot cleanly separate their contributions. The claim here is narrower: the patterns are not</w:t>
+      </w:r>
+      <w:r>
+        <w:t xml:space="preserve"> </w:t>
+      </w:r>
+      <w:r>
+        <w:rPr>
+          <w:i/>
+          <w:iCs/>
+        </w:rPr>
+        <w:t xml:space="preserve">solely</w:t>
+      </w:r>
+      <w:r>
+        <w:t xml:space="preserve"> </w:t>
+      </w:r>
+      <w:r>
+        <w:t xml:space="preserve">attributable to elite cueing, and the exclusion-based mechanism adds explanatory value beyond what a cueing account alone would predict.</w:t>
+      </w:r>
+    </w:p>
+    <w:bookmarkEnd w:id="25"/>
+    <w:bookmarkEnd w:id="26"/>
+    <w:bookmarkStart w:id="33" w:name="data-and-methods"/>
     <w:p>
       <w:pPr>
         <w:pStyle w:val="Heading1"/>
       </w:pPr>
       <w:r>
-        <w:t xml:space="preserve">Positional Updating and Democratic Conceptions</w:t>
+        <w:t xml:space="preserve">Data and Methods</w:t>
+      </w:r>
+    </w:p>
+    <w:bookmarkStart w:id="28" w:name="data"/>
+    <w:p>
+      <w:pPr>
+        <w:pStyle w:val="Heading2"/>
+      </w:pPr>
+      <w:r>
+        <w:t xml:space="preserve">Data</w:t>
       </w:r>
     </w:p>
     <w:p>
@@ -241,559 +790,7 @@
         <w:pStyle w:val="FirstParagraph"/>
       </w:pPr>
       <w:r>
-        <w:t xml:space="preserve">The argument begins with the observation that citizens hold meaningfully different conceptions of democracy, varying in the weight they assign to procedural rules versus substantive outcomes. From there it draws on the winner-loser gap literature to argue that electoral status creates systematically different orientations toward these dimensions, before specifying the mechanism—positional updating—and deriving predictions that distinguish it from competing accounts.</w:t>
-      </w:r>
-    </w:p>
-    <w:bookmarkStart w:id="21" w:name="the-procedural-substantive-distinction"/>
-    <w:p>
-      <w:pPr>
-        <w:pStyle w:val="Heading2"/>
-      </w:pPr>
-      <w:r>
-        <w:t xml:space="preserve">The procedural-substantive distinction</w:t>
-      </w:r>
-    </w:p>
-    <w:p>
-      <w:pPr>
-        <w:pStyle w:val="FirstParagraph"/>
-      </w:pPr>
-      <w:r>
-        <w:t xml:space="preserve">A foundational line of comparative research draws a distinction between procedural and substantive visions of democracy. On one side sit definitions anchored in rules and institutions—competitive elections, civil liberties, the rule of law, and the accountability mechanisms that keep officeholders in check</w:t>
-      </w:r>
-      <w:r>
-        <w:t xml:space="preserve"> </w:t>
-      </w:r>
-      <w:r>
-        <w:t xml:space="preserve">(Dahl 1977; Schumpeter 2013; Schedler 1998)</w:t>
-      </w:r>
-      <w:r>
-        <w:t xml:space="preserve">. On the other sit definitions organized around what government actually delivers: reduced inequality, social protection, and responsiveness to popular demands</w:t>
-      </w:r>
-      <w:r>
-        <w:t xml:space="preserve"> </w:t>
-      </w:r>
-      <w:r>
-        <w:t xml:space="preserve">(Diamond 1999; Linz and Stepan 1996)</w:t>
-      </w:r>
-      <w:r>
-        <w:t xml:space="preserve">. Survey research has repeatedly shown that ordinary people hold both kinds of conceptions, though the balance tips depending on context. Publics in younger democracies lean toward substantive criteria, while citizens in consolidated democracies invoke procedural ones more readily</w:t>
-      </w:r>
-      <w:r>
-        <w:t xml:space="preserve"> </w:t>
-      </w:r>
-      <w:r>
-        <w:t xml:space="preserve">(Dalton and Klingemann 2007; Bratton and Mattes 2001)</w:t>
-      </w:r>
-      <w:r>
-        <w:t xml:space="preserve">. Across Asia, the picture is especially layered: people blend procedural and substantive elements in ways that vary enormously both across and within countries</w:t>
-      </w:r>
-      <w:r>
-        <w:t xml:space="preserve"> </w:t>
-      </w:r>
-      <w:r>
-        <w:t xml:space="preserve">(Chu et al. 2008; Chu and Huang 2010; Cho 2014; Shin and Kim 2018)</w:t>
-      </w:r>
-      <w:r>
-        <w:t xml:space="preserve">. Partisan dynamics matter too.</w:t>
-      </w:r>
-      <w:r>
-        <w:t xml:space="preserve"> </w:t>
-      </w:r>
-      <w:r>
-        <w:t xml:space="preserve">Hsiao and Yu (2020)</w:t>
-      </w:r>
-      <w:r>
-        <w:t xml:space="preserve"> </w:t>
-      </w:r>
-      <w:r>
-        <w:t xml:space="preserve">demonstrate that affective polarization in Taiwan attenuates support for democracy, indicating that political position—not just cultural background—mediates how citizens relate to democratic principles.</w:t>
-      </w:r>
-    </w:p>
-    <w:p>
-      <w:pPr>
-        <w:pStyle w:val="BodyText"/>
-      </w:pPr>
-      <w:r>
-        <w:t xml:space="preserve">The stakes of this variation are concrete: how citizens define democracy shapes how they evaluate it. If democracy means free elections, competitive voting may suffice for legitimacy; if it means economic equality, procedural compliance without material progress breeds disillusionment. Yet existing scholarship has largely treated conceptions as stable attributes of individuals or societies: cultural inheritances shaped by historical experience, regime type, or modernization trajectories</w:t>
-      </w:r>
-      <w:r>
-        <w:t xml:space="preserve"> </w:t>
-      </w:r>
-      <w:r>
-        <w:t xml:space="preserve">(Shin 2011; Inglehart 1997; Canache 2012; Ferrin and Kriesi 2016)</w:t>
-      </w:r>
-      <w:r>
-        <w:t xml:space="preserve">. What remains largely unexplored is what drives</w:t>
-      </w:r>
-      <w:r>
-        <w:t xml:space="preserve"> </w:t>
-      </w:r>
-      <w:r>
-        <w:rPr>
-          <w:i/>
-          <w:iCs/>
-        </w:rPr>
-        <w:t xml:space="preserve">within-country, within-period</w:t>
-      </w:r>
-      <w:r>
-        <w:t xml:space="preserve"> </w:t>
-      </w:r>
-      <w:r>
-        <w:t xml:space="preserve">variation in how individual citizens conceptualize democracy.</w:t>
-      </w:r>
-    </w:p>
-    <w:bookmarkEnd w:id="21"/>
-    <w:bookmarkStart w:id="22" w:name="X11a8e346ff56b38bee222de48b8988c588c9339"/>
-    <w:p>
-      <w:pPr>
-        <w:pStyle w:val="Heading2"/>
-      </w:pPr>
-      <w:r>
-        <w:t xml:space="preserve">Electoral status as a source of conceptual divergence</w:t>
-      </w:r>
-    </w:p>
-    <w:p>
-      <w:pPr>
-        <w:pStyle w:val="FirstParagraph"/>
-      </w:pPr>
-      <w:r>
-        <w:t xml:space="preserve">The winner-loser gap literature provides a candidate answer. Decades of research have established that citizens whose preferred party prevailed in the most recent election look different attitudinally from those whose party lost: winners report higher institutional trust, greater satisfaction with democracy, and more willingness to accept political outcomes</w:t>
-      </w:r>
-      <w:r>
-        <w:t xml:space="preserve"> </w:t>
-      </w:r>
-      <w:r>
-        <w:t xml:space="preserve">(Anderson et al. 2005; Anderson and LoTempio 2002; Nadeau and Blais 1993)</w:t>
-      </w:r>
-      <w:r>
-        <w:t xml:space="preserve">. How large these gaps are depends on institutional design—losers in majoritarian systems tend to be more discontented than losers in consensus democracies</w:t>
-      </w:r>
-      <w:r>
-        <w:t xml:space="preserve"> </w:t>
-      </w:r>
-      <w:r>
-        <w:t xml:space="preserve">(Anderson and Guillory 1997; Singh et al. 2012)</w:t>
-      </w:r>
-      <w:r>
-        <w:t xml:space="preserve">—and perceptions of procedural fairness play a mediating role</w:t>
-      </w:r>
-      <w:r>
-        <w:t xml:space="preserve"> </w:t>
-      </w:r>
-      <w:r>
-        <w:t xml:space="preserve">(Esaiasson 2011; Esaiasson and Öhberg 2020)</w:t>
-      </w:r>
-      <w:r>
-        <w:t xml:space="preserve">. More recent work has extended these findings to non-Western contexts and hybrid regimes</w:t>
-      </w:r>
-      <w:r>
-        <w:t xml:space="preserve"> </w:t>
-      </w:r>
-      <w:r>
-        <w:t xml:space="preserve">(Blais et al. 2025; Mauk 2020)</w:t>
-      </w:r>
-      <w:r>
-        <w:t xml:space="preserve">. In a particularly relevant study,</w:t>
-      </w:r>
-      <w:r>
-        <w:t xml:space="preserve"> </w:t>
-      </w:r>
-      <w:r>
-        <w:t xml:space="preserve">Ricks and Hicken (2025)</w:t>
-      </w:r>
-      <w:r>
-        <w:t xml:space="preserve"> </w:t>
-      </w:r>
-      <w:r>
-        <w:t xml:space="preserve">show that Thailand’s 2023 election—held under a hybrid regime with military-drafted rules—nonetheless generated the classic winner-loser divergence in attitudes toward state institutions, evidence that the mechanism is not confined to full democracies.</w:t>
-      </w:r>
-    </w:p>
-    <w:p>
-      <w:pPr>
-        <w:pStyle w:val="BodyText"/>
-      </w:pPr>
-      <w:r>
-        <w:t xml:space="preserve">The limitation is one of scope: this literature has focused on</w:t>
-      </w:r>
-      <w:r>
-        <w:t xml:space="preserve"> </w:t>
-      </w:r>
-      <w:r>
-        <w:rPr>
-          <w:i/>
-          <w:iCs/>
-        </w:rPr>
-        <w:t xml:space="preserve">evaluations</w:t>
-      </w:r>
-      <w:r>
-        <w:t xml:space="preserve">—how much citizens support, trust, or feel satisfied with democracy—while treating the underlying object of evaluation as shared. Winners and losers are assumed to mean the same thing when they express views about</w:t>
-      </w:r>
-      <w:r>
-        <w:t xml:space="preserve"> </w:t>
-      </w:r>
-      <w:r>
-        <w:t xml:space="preserve">“democracy”</w:t>
-      </w:r>
-      <w:r>
-        <w:t xml:space="preserve">; they simply differ in how positively they assess it. If electoral status shapes not only evaluations but</w:t>
-      </w:r>
-      <w:r>
-        <w:t xml:space="preserve"> </w:t>
-      </w:r>
-      <w:r>
-        <w:rPr>
-          <w:i/>
-          <w:iCs/>
-        </w:rPr>
-        <w:t xml:space="preserve">conceptions</w:t>
-      </w:r>
-      <w:r>
-        <w:t xml:space="preserve">—if winners and losers are in fact evaluating different things—then the winner-loser gap may be deeper than the existing literature has recognized, and the two literatures’ isolation from one another represents a missed theoretical opportunity.</w:t>
-      </w:r>
-    </w:p>
-    <w:p>
-      <w:pPr>
-        <w:pStyle w:val="BodyText"/>
-      </w:pPr>
-      <w:r>
-        <w:t xml:space="preserve">The question of whether electoral status shapes conceptions, not just evaluations, has begun to attract attention, though the existing work stops short of the dynamic, erosion-conditional account developed here.</w:t>
-      </w:r>
-      <w:r>
-        <w:t xml:space="preserve"> </w:t>
-      </w:r>
-      <w:r>
-        <w:t xml:space="preserve">Cohen et al. (2023)</w:t>
-      </w:r>
-      <w:r>
-        <w:t xml:space="preserve"> </w:t>
-      </w:r>
-      <w:r>
-        <w:t xml:space="preserve">invert the classic</w:t>
-      </w:r>
-      <w:r>
-        <w:t xml:space="preserve"> </w:t>
-      </w:r>
-      <w:r>
-        <w:t xml:space="preserve">“losers’ consent”</w:t>
-      </w:r>
-      <w:r>
-        <w:t xml:space="preserve"> </w:t>
-      </w:r>
-      <w:r>
-        <w:t xml:space="preserve">framework by tracking Brazilian voters through Bolsonaro’s 2018 victory; they find that winners’ abstract support for democracy rose even as their tolerance for executive self-coups—closing Congress, sidelining the Supreme Court—increased in tandem. The result is a portrait of superficial democratic commitment: winners embrace the system’s label while hollowing out its procedural substance. Cohen et al. do not, however, examine whether winners and losers come to define democracy differently; their dependent variables remain evaluations of democratic institutions rather than conceptions of what those institutions should look like.</w:t>
-      </w:r>
-      <w:r>
-        <w:t xml:space="preserve"> </w:t>
-      </w:r>
-      <w:r>
-        <w:t xml:space="preserve">Wu and Wu (2022)</w:t>
-      </w:r>
-      <w:r>
-        <w:t xml:space="preserve"> </w:t>
-      </w:r>
-      <w:r>
-        <w:t xml:space="preserve">take up the conceptual question directly, using the same Asian Barometer data employed here to show that the winner-loser gap in liberal democratic values is substantially larger in competitive authoritarian regimes than in democracies—a finding consistent with H2 above. Yet their framework treats regime type as a static cross-sectional moderator; the analysis cannot capture the emergence of conceptual divergence as a country slides from democracy into authoritarianism, which is precisely what the Thai trajectory documents.</w:t>
-      </w:r>
-      <w:r>
-        <w:t xml:space="preserve"> </w:t>
-      </w:r>
-      <w:r>
-        <w:t xml:space="preserve">Bryan (2023)</w:t>
-      </w:r>
-      <w:r>
-        <w:t xml:space="preserve"> </w:t>
-      </w:r>
-      <w:r>
-        <w:t xml:space="preserve">pushes furthest, demonstrating across seventy-four countries that partisans in power hold more illiberal conceptions of democracy while maintaining explicit support for the democratic label, framing the pattern as partisan-motivated reasoning operating universally. The global scope is impressive, but the universality of the account is also its limitation: if conceptual divergence is a general feature of being in power, then it should appear everywhere and always, which sits uneasily with cases like South Korea where the gap remains negligible despite dramatic political upheaval. The positional updating framework advanced here differs from all three in specifying democratic erosion as the conditioning variable—not a single authoritarian victory (Cohen et al.), not a static regime category (Wu and Chang), and not an unconditional cognitive bias (Bryan), but a dynamic process that raises the stakes of exclusion and thereby amplifies losers’ procedural orientation.</w:t>
-      </w:r>
-    </w:p>
-    <w:bookmarkEnd w:id="22"/>
-    <w:bookmarkStart w:id="23" w:name="X337516c19cfec44fb568e8aec80a3f7df0bb688"/>
-    <w:p>
-      <w:pPr>
-        <w:pStyle w:val="Heading2"/>
-      </w:pPr>
-      <w:r>
-        <w:t xml:space="preserve">Positional updating: mechanism and predictions</w:t>
-      </w:r>
-    </w:p>
-    <w:p>
-      <w:pPr>
-        <w:pStyle w:val="FirstParagraph"/>
-      </w:pPr>
-      <w:r>
-        <w:t xml:space="preserve">I propose that electoral status shapes democratic conceptions through what I call positional updating. The core logic turns on asymmetric salience: procedures and outcomes carry different weight depending on whether one is in or out of power. If your party runs the government, your attention naturally drifts toward policy outputs—what is being built, distributed, reformed. If your party lost, you start to care a great deal about the rules of the game: Is there a fair shot at winning next time? Can the press still criticize? Can the courts still push back?</w:t>
-      </w:r>
-    </w:p>
-    <w:p>
-      <w:pPr>
-        <w:pStyle w:val="BodyText"/>
-      </w:pPr>
-      <w:r>
-        <w:t xml:space="preserve">This selective attention runs on motivated cognition</w:t>
-      </w:r>
-      <w:r>
-        <w:t xml:space="preserve"> </w:t>
-      </w:r>
-      <w:r>
-        <w:t xml:space="preserve">(Kunda 1990; Taber and Lodge 2006)</w:t>
-      </w:r>
-      <w:r>
-        <w:t xml:space="preserve">. Citizens do not arrive at their understanding of democracy through disinterested reflection; rather, they attend to and weight those dimensions of democracy that are instrumentally relevant to their political position. Losers orient toward procedural features because procedures are the tools of the excluded—the mechanisms through which power can be contested, checked, and ultimately recaptured. Winners orient toward substantive outcomes because they occupy the position from which outcomes are delivered. In this sense, the mechanism parallels the political conditioning of economic perceptions documented in other domains: just as partisan position shapes whether citizens view the economy favorably</w:t>
-      </w:r>
-      <w:r>
-        <w:t xml:space="preserve"> </w:t>
-      </w:r>
-      <w:r>
-        <w:t xml:space="preserve">(Evans and Andersen 2006; Fiorina 1978)</w:t>
-      </w:r>
-      <w:r>
-        <w:t xml:space="preserve">, electoral status shapes which features of democracy citizens attend to and prioritize. Emphasizing procedural democracy also serves losers’ discursive interests: a government can be criticized for violating democratic procedures in ways that a government cannot easily be criticized for failing to realize one’s preferred substantive vision.</w:t>
-      </w:r>
-    </w:p>
-    <w:p>
-      <w:pPr>
-        <w:pStyle w:val="BodyText"/>
-      </w:pPr>
-      <w:r>
-        <w:t xml:space="preserve">A clarification is in order: this framework does not require losers to sit down and calculate their odds of returning to power. The mechanism is more basic than that. People who backed the losing side—whatever their party’s organizational heft—find themselves on the outside of the coalition that runs the state, makes policy, and allocates resources. That structural fact sharpens their awareness of the procedural guardrails that limit what incumbents can do. It is not that losers cynically adopt a procedural vocabulary; it is that procedural protections become more relevant to people who lack access to executive power.</w:t>
-      </w:r>
-    </w:p>
-    <w:p>
-      <w:pPr>
-        <w:pStyle w:val="BodyText"/>
-      </w:pPr>
-      <w:r>
-        <w:t xml:space="preserve">This exclusion-based reading yields a testable distinction. If positional updating were really about partisan strategy—opposition leaders rallying their base around procedural rhetoric—we would expect the effect to cluster among supporters of the main opposition party, whose leadership has both the organizational muscle and the electoral motive to wave the procedural banner. But if what drives the effect is the more diffuse experience of being locked out of government, then the procedural orientation should show up across the board: minor-party supporters, independents, anyone who did not back the winner. The supplementary analysis in Appendix J confirms the latter pattern.</w:t>
-      </w:r>
-    </w:p>
-    <w:p>
-      <w:pPr>
-        <w:pStyle w:val="BodyText"/>
-      </w:pPr>
-      <w:r>
-        <w:t xml:space="preserve">From this positional account I derive three predictions. Each one helps separate the positional story from the most obvious rival—that democratic conceptions are essentially stable cultural orientations or fixed personality traits.</w:t>
-      </w:r>
-    </w:p>
-    <w:p>
-      <w:pPr>
-        <w:pStyle w:val="BodyText"/>
-      </w:pPr>
-      <w:r>
-        <w:t xml:space="preserve">The first prediction is shared with the cultural account: losers should lean procedural and winners should lean substantive. A cultural explanation could generate the same cross-sectional pattern by pointing to the ideological profiles of parties that happen to be in opposition. So H1 alone cannot adjudicate between the two.</w:t>
-      </w:r>
-    </w:p>
-    <w:p>
-      <w:pPr>
-        <w:pStyle w:val="BodyText"/>
-      </w:pPr>
-      <w:r>
-        <w:rPr>
-          <w:i/>
-          <w:iCs/>
-        </w:rPr>
-        <w:t xml:space="preserve">H1:</w:t>
-      </w:r>
-      <w:r>
-        <w:t xml:space="preserve"> </w:t>
-      </w:r>
-      <w:r>
-        <w:t xml:space="preserve">Electoral losers will be more likely than winners to prioritize procedural over substantive conceptions of democracy.</w:t>
-      </w:r>
-    </w:p>
-    <w:p>
-      <w:pPr>
-        <w:pStyle w:val="BodyText"/>
-      </w:pPr>
-      <w:r>
-        <w:t xml:space="preserve">The second prediction is where the positional logic starts to bite. If what matters is the</w:t>
-      </w:r>
-      <w:r>
-        <w:t xml:space="preserve"> </w:t>
-      </w:r>
-      <w:r>
-        <w:rPr>
-          <w:i/>
-          <w:iCs/>
-        </w:rPr>
-        <w:t xml:space="preserve">stakes</w:t>
-      </w:r>
-      <w:r>
-        <w:t xml:space="preserve"> </w:t>
-      </w:r>
-      <w:r>
-        <w:t xml:space="preserve">of losing, then the gap should widen where losing really hurts—where institutions are weak, alternation is rare, and exclusion from power threatens to become permanent. Loss aversion</w:t>
-      </w:r>
-      <w:r>
-        <w:t xml:space="preserve"> </w:t>
-      </w:r>
-      <w:r>
-        <w:t xml:space="preserve">(Kahneman and Tversky 1979)</w:t>
-      </w:r>
-      <w:r>
-        <w:t xml:space="preserve"> </w:t>
-      </w:r>
-      <w:r>
-        <w:t xml:space="preserve">reinforces the point: the prospect of losing established rights weighs more heavily than the prospect of gaining new benefits, which should amplify losers’ procedural orientation in high-stakes environments.</w:t>
-      </w:r>
-    </w:p>
-    <w:p>
-      <w:pPr>
-        <w:pStyle w:val="BodyText"/>
-      </w:pPr>
-      <w:r>
-        <w:rPr>
-          <w:i/>
-          <w:iCs/>
-        </w:rPr>
-        <w:t xml:space="preserve">H2:</w:t>
-      </w:r>
-      <w:r>
-        <w:t xml:space="preserve"> </w:t>
-      </w:r>
-      <w:r>
-        <w:t xml:space="preserve">The loser effect will be larger in political contexts where losing is more consequential—where democratic institutions are weaker or power alternation less frequent.</w:t>
-      </w:r>
-    </w:p>
-    <w:p>
-      <w:pPr>
-        <w:pStyle w:val="BodyText"/>
-      </w:pPr>
-      <w:r>
-        <w:t xml:space="preserve">Third, and most critically for distinguishing positional updating from cultural accounts: if conceptions are cultural inheritances or stable dispositions, they should not shift appreciably within countries over periods shorter than a generation. The positional account, by contrast, predicts that conceptions will respond dynamically to changes in the political stakes of losing—growing when institutions weaken and shrinking when institutional protections are restored through alternation or constitutional resolution of crises.</w:t>
-      </w:r>
-    </w:p>
-    <w:p>
-      <w:pPr>
-        <w:pStyle w:val="BodyText"/>
-      </w:pPr>
-      <w:r>
-        <w:rPr>
-          <w:i/>
-          <w:iCs/>
-        </w:rPr>
-        <w:t xml:space="preserve">H3:</w:t>
-      </w:r>
-      <w:r>
-        <w:t xml:space="preserve"> </w:t>
-      </w:r>
-      <w:r>
-        <w:t xml:space="preserve">Within countries, the loser effect will respond to changes in political context, growing when democratic institutions weaken and shrinking when power alternates.</w:t>
-      </w:r>
-    </w:p>
-    <w:p>
-      <w:pPr>
-        <w:pStyle w:val="BodyText"/>
-      </w:pPr>
-      <w:r>
-        <w:t xml:space="preserve">H3 is the hypothesis that most sharply distinguishes the positional account from its alternatives, and the one whose confirmation would represent the strongest evidence for the theoretical framework advanced here. The within-country trajectories examined below provide the most direct test.</w:t>
-      </w:r>
-    </w:p>
-    <w:bookmarkEnd w:id="23"/>
-    <w:bookmarkStart w:id="24" w:name="positional-updating-and-elite-cueing"/>
-    <w:p>
-      <w:pPr>
-        <w:pStyle w:val="Heading2"/>
-      </w:pPr>
-      <w:r>
-        <w:t xml:space="preserve">Positional Updating and Elite Cueing</w:t>
-      </w:r>
-    </w:p>
-    <w:p>
-      <w:pPr>
-        <w:pStyle w:val="FirstParagraph"/>
-      </w:pPr>
-      <w:r>
-        <w:t xml:space="preserve">The most plausible rival to positional updating is not stable dispositions but elite cueing: the possibility that party elites strategically reframe democratic rhetoric, and their supporters absorb the new language. In Thailand’s post-2006 turmoil, the Democrat Party and its allied movements increasingly invoked judicial independence and media freedom as bulwarks against Thaksin’s perceived majoritarian excesses. If losers adopted procedural language because their party told them to, the observed pattern would look identical to positional updating without any independent cognitive response to exclusion.</w:t>
-      </w:r>
-    </w:p>
-    <w:p>
-      <w:pPr>
-        <w:pStyle w:val="BodyText"/>
-      </w:pPr>
-      <w:r>
-        <w:t xml:space="preserve">Two observable implications distinguish the mechanisms—imperfectly but usefully. Elite cueing predicts that the procedural shift should concentrate among strong partisans with high exposure to party messaging. Positional updating, by contrast, predicts a broader effect: even weakly attached losers and supporters of minor parties, who lack a coherent elite signal, should exhibit procedural orientations if the operative mechanism is exclusion from governing authority rather than absorption of party rhetoric. The three-way decomposition in Appendix J provides suggestive evidence on this point. Other Losers—a category that includes minor party supporters and independents with minimal exposure to organized opposition messaging—display procedural orientations comparable to Key Opposition supporters in all three countries where the decomposition is feasible. The loser effect does not appear to be an artifact of opposition party mobilization alone.</w:t>
-      </w:r>
-    </w:p>
-    <w:p>
-      <w:pPr>
-        <w:pStyle w:val="BodyText"/>
-      </w:pPr>
-      <w:r>
-        <w:t xml:space="preserve">A second distinguishing implication concerns temporal dynamics. Elite cueing should track specific rhetorical campaigns and their reach; it should spike when elites actively contest democratic norms and dissipate when the rhetorical environment shifts. Positional updating tied to institutional exclusion, by contrast, should cumulate as erosion deepens and institutions become demonstrably less protective. Thailand’s trajectory—where the procedural gap widens monotonically from Wave 3 through Wave 6 despite substantial shifts in the rhetorical landscape, including a military government that actively suppressed opposition messaging after 2014—fits the exclusion story better than a cueing account that requires sustained rhetorical transmission.</w:t>
-      </w:r>
-    </w:p>
-    <w:p>
-      <w:pPr>
-        <w:pStyle w:val="BodyText"/>
-      </w:pPr>
-      <w:r>
-        <w:t xml:space="preserve">These tests are suggestive, not definitive. Elite cueing and positional updating likely operate simultaneously, and the data cannot cleanly separate their contributions. The claim here is narrower: the patterns are not</w:t>
-      </w:r>
-      <w:r>
-        <w:t xml:space="preserve"> </w:t>
-      </w:r>
-      <w:r>
-        <w:rPr>
-          <w:i/>
-          <w:iCs/>
-        </w:rPr>
-        <w:t xml:space="preserve">solely</w:t>
-      </w:r>
-      <w:r>
-        <w:t xml:space="preserve"> </w:t>
-      </w:r>
-      <w:r>
-        <w:t xml:space="preserve">attributable to elite cueing, and the exclusion-based mechanism adds explanatory value beyond what a cueing account alone would predict.</w:t>
-      </w:r>
-    </w:p>
-    <w:bookmarkEnd w:id="24"/>
-    <w:bookmarkEnd w:id="25"/>
-    <w:bookmarkStart w:id="33" w:name="data-and-methods"/>
-    <w:p>
-      <w:pPr>
-        <w:pStyle w:val="Heading1"/>
-      </w:pPr>
-      <w:r>
-        <w:t xml:space="preserve">Data and Methods</w:t>
-      </w:r>
-    </w:p>
-    <w:bookmarkStart w:id="28" w:name="data"/>
-    <w:p>
-      <w:pPr>
-        <w:pStyle w:val="Heading2"/>
-      </w:pPr>
-      <w:r>
-        <w:t xml:space="preserve">Data</w:t>
-      </w:r>
-    </w:p>
-    <w:p>
-      <w:pPr>
-        <w:pStyle w:val="FirstParagraph"/>
-      </w:pPr>
-      <w:r>
-        <w:t xml:space="preserve">The analysis draws on the Asian Barometer Survey (ABS), a regional comparative project tracking democratic values across Asia since 2001</w:t>
-      </w:r>
-      <w:r>
-        <w:t xml:space="preserve"> </w:t>
-      </w:r>
-      <w:r>
-        <w:t xml:space="preserve">(Hu et al. 2008, 2012, 2016; Chu et al. 2022)</w:t>
-      </w:r>
-      <w:r>
-        <w:t xml:space="preserve">.</w:t>
-      </w:r>
-      <w:r>
-        <w:rPr>
-          <w:rStyle w:val="FootnoteReference"/>
-        </w:rPr>
-        <w:footnoteReference w:id="26"/>
-      </w:r>
-      <w:r>
-        <w:t xml:space="preserve"> </w:t>
-      </w:r>
-      <w:r>
-        <w:t xml:space="preserve">The ABS covers countries spanning the full range of regime types</w:t>
+        <w:t xml:space="preserve">The analysis draws on the Asian Barometer Survey (ABS), a regional comparative project tracking democratic values across Asia since 2001. The ABS covers countries spanning the full range of regime types</w:t>
       </w:r>
       <w:r>
         <w:t xml:space="preserve"> </w:t>
@@ -975,6 +972,14 @@
       </w:r>
       <w:r>
         <w:t xml:space="preserve">of person supporting winners versus losers shifts across waves—could mimic updating even if no individual changes their views. Demographic reweighting tests (Appendix G) address this partially but cannot rule out realignment on unobserved political dimensions. Elite cueing, where parties reframe democratic rhetoric and supporters absorb it, represents a complementary rather than competing mechanism; the Discussion addresses how the observable implications differ.</w:t>
+      </w:r>
+    </w:p>
+    <w:p>
+      <w:pPr>
+        <w:pStyle w:val="BodyText"/>
+      </w:pPr>
+      <w:r>
+        <w:t xml:space="preserve">What would falsify the positional interpretation? Panel data showing that individual citizens do not revise their conceptions after switching from winner to loser status—or vice versa—would be the most direct disconfirmation. Short of that, two cross-sectional patterns would weaken the case substantially: if the fairness amplification extended equally to non-procedural domains (suggesting generalized negativity rather than procedural-specific updating), or if Thailand’s trajectory could be accounted for by observable demographic realignment between winning and losing coalitions. The mechanism tests below probe exactly these possibilities.</w:t>
       </w:r>
     </w:p>
     <w:p>
@@ -1866,7 +1871,7 @@
               <w:jc w:val="left"/>
             </w:pPr>
             <w:r>
-              <w:t xml:space="preserve">Elections (W2)</w:t>
+              <w:t xml:space="preserve">Organize groups</w:t>
             </w:r>
           </w:p>
         </w:tc>
@@ -1890,7 +1895,7 @@
               <w:jc w:val="left"/>
             </w:pPr>
             <w:r>
-              <w:t xml:space="preserve">+2.8</w:t>
+              <w:t xml:space="preserve">+2.3</w:t>
             </w:r>
           </w:p>
         </w:tc>
@@ -1902,7 +1907,7 @@
               <w:jc w:val="right"/>
             </w:pPr>
             <w:r>
-              <w:t xml:space="preserve">1.4</w:t>
+              <w:t xml:space="preserve">1.2</w:t>
             </w:r>
           </w:p>
         </w:tc>
@@ -1928,7 +1933,7 @@
               <w:jc w:val="left"/>
             </w:pPr>
             <w:r>
-              <w:t xml:space="preserve">Organize groups</w:t>
+              <w:t xml:space="preserve">Party competition</w:t>
             </w:r>
           </w:p>
         </w:tc>
@@ -1952,7 +1957,7 @@
               <w:jc w:val="left"/>
             </w:pPr>
             <w:r>
-              <w:t xml:space="preserve">+2.3</w:t>
+              <w:t xml:space="preserve">+2.1</w:t>
             </w:r>
           </w:p>
         </w:tc>
@@ -1964,7 +1969,7 @@
               <w:jc w:val="right"/>
             </w:pPr>
             <w:r>
-              <w:t xml:space="preserve">1.2</w:t>
+              <w:t xml:space="preserve">1.1</w:t>
             </w:r>
           </w:p>
         </w:tc>
@@ -1976,7 +1981,7 @@
               <w:jc w:val="right"/>
             </w:pPr>
             <w:r>
-              <w:t xml:space="preserve">*</w:t>
+              <w:t xml:space="preserve">†</w:t>
             </w:r>
           </w:p>
         </w:tc>
@@ -1990,7 +1995,7 @@
               <w:jc w:val="left"/>
             </w:pPr>
             <w:r>
-              <w:t xml:space="preserve">Party competition</w:t>
+              <w:t xml:space="preserve">Protest freedom</w:t>
             </w:r>
           </w:p>
         </w:tc>
@@ -2014,7 +2019,7 @@
               <w:jc w:val="left"/>
             </w:pPr>
             <w:r>
-              <w:t xml:space="preserve">+2.1</w:t>
+              <w:t xml:space="preserve">+1.2</w:t>
             </w:r>
           </w:p>
         </w:tc>
@@ -2026,20 +2031,16 @@
               <w:jc w:val="right"/>
             </w:pPr>
             <w:r>
-              <w:t xml:space="preserve">1.1</w:t>
-            </w:r>
-          </w:p>
-        </w:tc>
-        <w:tc>
-          <w:tcPr/>
-          <w:p>
-            <w:pPr>
-              <w:pStyle w:val="Compact"/>
-              <w:jc w:val="right"/>
-            </w:pPr>
-            <w:r>
-              <w:t xml:space="preserve">†</w:t>
-            </w:r>
+              <w:t xml:space="preserve">0.8</w:t>
+            </w:r>
+          </w:p>
+        </w:tc>
+        <w:tc>
+          <w:tcPr/>
+          <w:p>
+            <w:pPr>
+              <w:pStyle w:val="Compact"/>
+            </w:pPr>
           </w:p>
         </w:tc>
       </w:tr>
@@ -2052,7 +2053,7 @@
               <w:jc w:val="left"/>
             </w:pPr>
             <w:r>
-              <w:t xml:space="preserve">Protest freedom</w:t>
+              <w:t xml:space="preserve">Legislature oversight</w:t>
             </w:r>
           </w:p>
         </w:tc>
@@ -2076,7 +2077,7 @@
               <w:jc w:val="left"/>
             </w:pPr>
             <w:r>
-              <w:t xml:space="preserve">+1.2</w:t>
+              <w:t xml:space="preserve">+1.0</w:t>
             </w:r>
           </w:p>
         </w:tc>
@@ -2088,7 +2089,7 @@
               <w:jc w:val="right"/>
             </w:pPr>
             <w:r>
-              <w:t xml:space="preserve">0.8</w:t>
+              <w:t xml:space="preserve">0.9</w:t>
             </w:r>
           </w:p>
         </w:tc>
@@ -2110,7 +2111,7 @@
               <w:jc w:val="left"/>
             </w:pPr>
             <w:r>
-              <w:t xml:space="preserve">Legislature oversight</w:t>
+              <w:t xml:space="preserve">Court protection</w:t>
             </w:r>
           </w:p>
         </w:tc>
@@ -2134,7 +2135,7 @@
               <w:jc w:val="left"/>
             </w:pPr>
             <w:r>
-              <w:t xml:space="preserve">+1.0</w:t>
+              <w:t xml:space="preserve">+0.3</w:t>
             </w:r>
           </w:p>
         </w:tc>
@@ -2168,7 +2169,7 @@
               <w:jc w:val="left"/>
             </w:pPr>
             <w:r>
-              <w:t xml:space="preserve">Criticize power (W2)</w:t>
+              <w:t xml:space="preserve">No waste</w:t>
             </w:r>
           </w:p>
         </w:tc>
@@ -2180,7 +2181,7 @@
               <w:jc w:val="left"/>
             </w:pPr>
             <w:r>
-              <w:t xml:space="preserve">Procedural</w:t>
+              <w:t xml:space="preserve">Governance</w:t>
             </w:r>
           </w:p>
         </w:tc>
@@ -2192,7 +2193,7 @@
               <w:jc w:val="left"/>
             </w:pPr>
             <w:r>
-              <w:t xml:space="preserve">+0.7</w:t>
+              <w:t xml:space="preserve">-0.7</w:t>
             </w:r>
           </w:p>
         </w:tc>
@@ -2204,7 +2205,7 @@
               <w:jc w:val="right"/>
             </w:pPr>
             <w:r>
-              <w:t xml:space="preserve">1.1</w:t>
+              <w:t xml:space="preserve">0.8</w:t>
             </w:r>
           </w:p>
         </w:tc>
@@ -2226,7 +2227,7 @@
               <w:jc w:val="left"/>
             </w:pPr>
             <w:r>
-              <w:t xml:space="preserve">Court protection</w:t>
+              <w:t xml:space="preserve">Clean politics</w:t>
             </w:r>
           </w:p>
         </w:tc>
@@ -2238,7 +2239,7 @@
               <w:jc w:val="left"/>
             </w:pPr>
             <w:r>
-              <w:t xml:space="preserve">Procedural</w:t>
+              <w:t xml:space="preserve">Governance</w:t>
             </w:r>
           </w:p>
         </w:tc>
@@ -2250,7 +2251,7 @@
               <w:jc w:val="left"/>
             </w:pPr>
             <w:r>
-              <w:t xml:space="preserve">+0.3</w:t>
+              <w:t xml:space="preserve">-0.7</w:t>
             </w:r>
           </w:p>
         </w:tc>
@@ -2284,7 +2285,7 @@
               <w:jc w:val="left"/>
             </w:pPr>
             <w:r>
-              <w:t xml:space="preserve">No waste</w:t>
+              <w:t xml:space="preserve">Unemployment aid</w:t>
             </w:r>
           </w:p>
         </w:tc>
@@ -2296,7 +2297,7 @@
               <w:jc w:val="left"/>
             </w:pPr>
             <w:r>
-              <w:t xml:space="preserve">Governance</w:t>
+              <w:t xml:space="preserve">Substantive</w:t>
             </w:r>
           </w:p>
         </w:tc>
@@ -2308,7 +2309,7 @@
               <w:jc w:val="left"/>
             </w:pPr>
             <w:r>
-              <w:t xml:space="preserve">-0.7</w:t>
+              <w:t xml:space="preserve">-0.8</w:t>
             </w:r>
           </w:p>
         </w:tc>
@@ -2320,7 +2321,7 @@
               <w:jc w:val="right"/>
             </w:pPr>
             <w:r>
-              <w:t xml:space="preserve">0.8</w:t>
+              <w:t xml:space="preserve">1.0</w:t>
             </w:r>
           </w:p>
         </w:tc>
@@ -2342,7 +2343,7 @@
               <w:jc w:val="left"/>
             </w:pPr>
             <w:r>
-              <w:t xml:space="preserve">Clean politics</w:t>
+              <w:t xml:space="preserve">Jobs for all</w:t>
             </w:r>
           </w:p>
         </w:tc>
@@ -2354,7 +2355,7 @@
               <w:jc w:val="left"/>
             </w:pPr>
             <w:r>
-              <w:t xml:space="preserve">Governance</w:t>
+              <w:t xml:space="preserve">Substantive</w:t>
             </w:r>
           </w:p>
         </w:tc>
@@ -2366,7 +2367,7 @@
               <w:jc w:val="left"/>
             </w:pPr>
             <w:r>
-              <w:t xml:space="preserve">-0.7</w:t>
+              <w:t xml:space="preserve">-0.9</w:t>
             </w:r>
           </w:p>
         </w:tc>
@@ -2378,7 +2379,7 @@
               <w:jc w:val="right"/>
             </w:pPr>
             <w:r>
-              <w:t xml:space="preserve">0.9</w:t>
+              <w:t xml:space="preserve">1.3</w:t>
             </w:r>
           </w:p>
         </w:tc>
@@ -2400,7 +2401,7 @@
               <w:jc w:val="left"/>
             </w:pPr>
             <w:r>
-              <w:t xml:space="preserve">Unemployment aid</w:t>
+              <w:t xml:space="preserve">Free elections</w:t>
             </w:r>
           </w:p>
         </w:tc>
@@ -2412,7 +2413,7 @@
               <w:jc w:val="left"/>
             </w:pPr>
             <w:r>
-              <w:t xml:space="preserve">Substantive</w:t>
+              <w:t xml:space="preserve">Procedural</w:t>
             </w:r>
           </w:p>
         </w:tc>
@@ -2424,7 +2425,7 @@
               <w:jc w:val="left"/>
             </w:pPr>
             <w:r>
-              <w:t xml:space="preserve">-0.8</w:t>
+              <w:t xml:space="preserve">-1.0</w:t>
             </w:r>
           </w:p>
         </w:tc>
@@ -2436,7 +2437,7 @@
               <w:jc w:val="right"/>
             </w:pPr>
             <w:r>
-              <w:t xml:space="preserve">1.0</w:t>
+              <w:t xml:space="preserve">0.8</w:t>
             </w:r>
           </w:p>
         </w:tc>
@@ -2458,7 +2459,7 @@
               <w:jc w:val="left"/>
             </w:pPr>
             <w:r>
-              <w:t xml:space="preserve">Jobs for all</w:t>
+              <w:t xml:space="preserve">Quality services</w:t>
             </w:r>
           </w:p>
         </w:tc>
@@ -2470,7 +2471,7 @@
               <w:jc w:val="left"/>
             </w:pPr>
             <w:r>
-              <w:t xml:space="preserve">Substantive</w:t>
+              <w:t xml:space="preserve">Governance</w:t>
             </w:r>
           </w:p>
         </w:tc>
@@ -2482,7 +2483,7 @@
               <w:jc w:val="left"/>
             </w:pPr>
             <w:r>
-              <w:t xml:space="preserve">-0.9</w:t>
+              <w:t xml:space="preserve">-1.2</w:t>
             </w:r>
           </w:p>
         </w:tc>
@@ -2494,7 +2495,7 @@
               <w:jc w:val="right"/>
             </w:pPr>
             <w:r>
-              <w:t xml:space="preserve">1.3</w:t>
+              <w:t xml:space="preserve">1.6</w:t>
             </w:r>
           </w:p>
         </w:tc>
@@ -2516,7 +2517,7 @@
               <w:jc w:val="left"/>
             </w:pPr>
             <w:r>
-              <w:t xml:space="preserve">Free elections</w:t>
+              <w:t xml:space="preserve">Reduce gap rich/poor</w:t>
             </w:r>
           </w:p>
         </w:tc>
@@ -2528,7 +2529,7 @@
               <w:jc w:val="left"/>
             </w:pPr>
             <w:r>
-              <w:t xml:space="preserve">Procedural</w:t>
+              <w:t xml:space="preserve">Substantive</w:t>
             </w:r>
           </w:p>
         </w:tc>
@@ -2540,7 +2541,7 @@
               <w:jc w:val="left"/>
             </w:pPr>
             <w:r>
-              <w:t xml:space="preserve">-1.0</w:t>
+              <w:t xml:space="preserve">-1.5</w:t>
             </w:r>
           </w:p>
         </w:tc>
@@ -2561,7 +2562,11 @@
           <w:p>
             <w:pPr>
               <w:pStyle w:val="Compact"/>
-            </w:pPr>
+              <w:jc w:val="right"/>
+            </w:pPr>
+            <w:r>
+              <w:t xml:space="preserve">†</w:t>
+            </w:r>
           </w:p>
         </w:tc>
       </w:tr>
@@ -2574,7 +2579,7 @@
               <w:jc w:val="left"/>
             </w:pPr>
             <w:r>
-              <w:t xml:space="preserve">Quality services</w:t>
+              <w:t xml:space="preserve">Basic necessities</w:t>
             </w:r>
           </w:p>
         </w:tc>
@@ -2586,7 +2591,7 @@
               <w:jc w:val="left"/>
             </w:pPr>
             <w:r>
-              <w:t xml:space="preserve">Governance</w:t>
+              <w:t xml:space="preserve">Substantive</w:t>
             </w:r>
           </w:p>
         </w:tc>
@@ -2598,7 +2603,7 @@
               <w:jc w:val="left"/>
             </w:pPr>
             <w:r>
-              <w:t xml:space="preserve">-1.2</w:t>
+              <w:t xml:space="preserve">-2.1</w:t>
             </w:r>
           </w:p>
         </w:tc>
@@ -2610,16 +2615,20 @@
               <w:jc w:val="right"/>
             </w:pPr>
             <w:r>
-              <w:t xml:space="preserve">1.6</w:t>
-            </w:r>
-          </w:p>
-        </w:tc>
-        <w:tc>
-          <w:tcPr/>
-          <w:p>
-            <w:pPr>
-              <w:pStyle w:val="Compact"/>
-            </w:pPr>
+              <w:t xml:space="preserve">0.9</w:t>
+            </w:r>
+          </w:p>
+        </w:tc>
+        <w:tc>
+          <w:tcPr/>
+          <w:p>
+            <w:pPr>
+              <w:pStyle w:val="Compact"/>
+              <w:jc w:val="right"/>
+            </w:pPr>
+            <w:r>
+              <w:t xml:space="preserve">*</w:t>
+            </w:r>
           </w:p>
         </w:tc>
       </w:tr>
@@ -2632,7 +2641,7 @@
               <w:jc w:val="left"/>
             </w:pPr>
             <w:r>
-              <w:t xml:space="preserve">Income equality (W2)</w:t>
+              <w:t xml:space="preserve">Law and order</w:t>
             </w:r>
           </w:p>
         </w:tc>
@@ -2644,7 +2653,7 @@
               <w:jc w:val="left"/>
             </w:pPr>
             <w:r>
-              <w:t xml:space="preserve">Substantive</w:t>
+              <w:t xml:space="preserve">Governance</w:t>
             </w:r>
           </w:p>
         </w:tc>
@@ -2656,7 +2665,7 @@
               <w:jc w:val="left"/>
             </w:pPr>
             <w:r>
-              <w:t xml:space="preserve">-1.3</w:t>
+              <w:t xml:space="preserve">-5.0</w:t>
             </w:r>
           </w:p>
         </w:tc>
@@ -2668,7 +2677,7 @@
               <w:jc w:val="right"/>
             </w:pPr>
             <w:r>
-              <w:t xml:space="preserve">0.6</w:t>
+              <w:t xml:space="preserve">1.0</w:t>
             </w:r>
           </w:p>
         </w:tc>
@@ -2680,7 +2689,7 @@
               <w:jc w:val="right"/>
             </w:pPr>
             <w:r>
-              <w:t xml:space="preserve">*</w:t>
+              <w:t xml:space="preserve">***</w:t>
             </w:r>
           </w:p>
         </w:tc>
@@ -2694,7 +2703,7 @@
               <w:jc w:val="left"/>
             </w:pPr>
             <w:r>
-              <w:t xml:space="preserve">Reduce gap rich/poor</w:t>
+              <w:t xml:space="preserve">Elections</w:t>
             </w:r>
           </w:p>
         </w:tc>
@@ -2706,7 +2715,7 @@
               <w:jc w:val="left"/>
             </w:pPr>
             <w:r>
-              <w:t xml:space="preserve">Substantive</w:t>
+              <w:t xml:space="preserve">Procedural</w:t>
             </w:r>
           </w:p>
         </w:tc>
@@ -2718,7 +2727,7 @@
               <w:jc w:val="left"/>
             </w:pPr>
             <w:r>
-              <w:t xml:space="preserve">-1.5</w:t>
+              <w:t xml:space="preserve">+2.8</w:t>
             </w:r>
           </w:p>
         </w:tc>
@@ -2730,7 +2739,7 @@
               <w:jc w:val="right"/>
             </w:pPr>
             <w:r>
-              <w:t xml:space="preserve">0.8</w:t>
+              <w:t xml:space="preserve">1.4</w:t>
             </w:r>
           </w:p>
         </w:tc>
@@ -2742,7 +2751,7 @@
               <w:jc w:val="right"/>
             </w:pPr>
             <w:r>
-              <w:t xml:space="preserve">†</w:t>
+              <w:t xml:space="preserve">*</w:t>
             </w:r>
           </w:p>
         </w:tc>
@@ -2756,7 +2765,7 @@
               <w:jc w:val="left"/>
             </w:pPr>
             <w:r>
-              <w:t xml:space="preserve">Basic necessities (W2)</w:t>
+              <w:t xml:space="preserve">Criticize power</w:t>
             </w:r>
           </w:p>
         </w:tc>
@@ -2768,7 +2777,7 @@
               <w:jc w:val="left"/>
             </w:pPr>
             <w:r>
-              <w:t xml:space="preserve">Substantive</w:t>
+              <w:t xml:space="preserve">Procedural</w:t>
             </w:r>
           </w:p>
         </w:tc>
@@ -2780,7 +2789,7 @@
               <w:jc w:val="left"/>
             </w:pPr>
             <w:r>
-              <w:t xml:space="preserve">-2.1</w:t>
+              <w:t xml:space="preserve">+0.7</w:t>
             </w:r>
           </w:p>
         </w:tc>
@@ -2801,11 +2810,7 @@
           <w:p>
             <w:pPr>
               <w:pStyle w:val="Compact"/>
-              <w:jc w:val="right"/>
-            </w:pPr>
-            <w:r>
-              <w:t xml:space="preserve">†</w:t>
-            </w:r>
+            </w:pPr>
           </w:p>
         </w:tc>
       </w:tr>
@@ -2818,7 +2823,7 @@
               <w:jc w:val="left"/>
             </w:pPr>
             <w:r>
-              <w:t xml:space="preserve">Basic necessities</w:t>
+              <w:t xml:space="preserve">Income equality</w:t>
             </w:r>
           </w:p>
         </w:tc>
@@ -2842,7 +2847,7 @@
               <w:jc w:val="left"/>
             </w:pPr>
             <w:r>
-              <w:t xml:space="preserve">-2.1</w:t>
+              <w:t xml:space="preserve">-1.3</w:t>
             </w:r>
           </w:p>
         </w:tc>
@@ -2854,7 +2859,7 @@
               <w:jc w:val="right"/>
             </w:pPr>
             <w:r>
-              <w:t xml:space="preserve">0.9</w:t>
+              <w:t xml:space="preserve">0.6</w:t>
             </w:r>
           </w:p>
         </w:tc>
@@ -2880,7 +2885,7 @@
               <w:jc w:val="left"/>
             </w:pPr>
             <w:r>
-              <w:t xml:space="preserve">Law and order</w:t>
+              <w:t xml:space="preserve">Basic necessities</w:t>
             </w:r>
           </w:p>
         </w:tc>
@@ -2892,7 +2897,7 @@
               <w:jc w:val="left"/>
             </w:pPr>
             <w:r>
-              <w:t xml:space="preserve">Governance</w:t>
+              <w:t xml:space="preserve">Substantive</w:t>
             </w:r>
           </w:p>
         </w:tc>
@@ -2904,7 +2909,7 @@
               <w:jc w:val="left"/>
             </w:pPr>
             <w:r>
-              <w:t xml:space="preserve">-5.0</w:t>
+              <w:t xml:space="preserve">-2.1</w:t>
             </w:r>
           </w:p>
         </w:tc>
@@ -2916,7 +2921,7 @@
               <w:jc w:val="right"/>
             </w:pPr>
             <w:r>
-              <w:t xml:space="preserve">1.0</w:t>
+              <w:t xml:space="preserve">1.1</w:t>
             </w:r>
           </w:p>
         </w:tc>
@@ -2928,7 +2933,7 @@
               <w:jc w:val="right"/>
             </w:pPr>
             <w:r>
-              <w:t xml:space="preserve">***</w:t>
+              <w:t xml:space="preserve">†</w:t>
             </w:r>
           </w:p>
         </w:tc>
@@ -3040,7 +3045,7 @@
         <w:pStyle w:val="BodyText"/>
       </w:pPr>
       <w:r>
-        <w:t xml:space="preserve">The governance items reveal an additional pattern. Winners are consistently more likely to select governance items emphasizing order and state capacity, with Law and order showing the largest effect (-5.0 pp,</w:t>
+        <w:t xml:space="preserve">The governance items reveal an additional pattern that complicates any account framing the winner-loser divide as purely procedural versus substantive. Winners are consistently more likely to select governance items emphasizing order and state capacity, with Law and order showing the largest effect (-5.0 pp,</w:t>
       </w:r>
       <w:r>
         <w:t xml:space="preserve"> </w:t>
@@ -3054,7 +3059,29 @@
         <w:t xml:space="preserve"> </w:t>
       </w:r>
       <w:r>
-        <w:t xml:space="preserve">&lt; 0.001). Winners conceive of democracy as a framework for stability and effective administration; losers conceive of it as a framework for contestation and the protection of rights. This order-versus-contestation tension is explored further in the discussion.</w:t>
+        <w:t xml:space="preserve">&lt; 0.001)—the single largest coefficient in Table 1, exceeding even media freedom. Winners do not merely favor substantive outcomes; they favor a vision of democracy organized around stability, effective administration, and the suppression of disorder. This parallels</w:t>
+      </w:r>
+      <w:r>
+        <w:t xml:space="preserve"> </w:t>
+      </w:r>
+      <w:r>
+        <w:t xml:space="preserve">Eck and Paulis (2025)</w:t>
+      </w:r>
+      <w:r>
+        <w:t xml:space="preserve">’s finding that electoral winners are less supportive of referendums and other institutional alternatives that might disrupt the status quo, especially under conditions of affective polarization. Losers, conversely, do not merely favor procedures; they favor the procedures of</w:t>
+      </w:r>
+      <w:r>
+        <w:t xml:space="preserve"> </w:t>
+      </w:r>
+      <w:r>
+        <w:rPr>
+          <w:i/>
+          <w:iCs/>
+        </w:rPr>
+        <w:t xml:space="preserve">contestation</w:t>
+      </w:r>
+      <w:r>
+        <w:t xml:space="preserve">—the institutional infrastructure that enables challenge to incumbent power. The procedural-substantive gap computation used throughout this article, which sets governance items aside, is therefore conservative: it measures the dimension most directly predicted by the theory while leaving aside a pattern that reinforces the broader finding from a different angle. The order-versus-contestation tension is explored further in the discussion.</w:t>
       </w:r>
     </w:p>
     <w:bookmarkStart w:id="34" w:name="a-note-on-effect-sizes"/>
@@ -3071,7 +3098,30 @@
         <w:pStyle w:val="FirstParagraph"/>
       </w:pPr>
       <w:r>
-        <w:t xml:space="preserve">Individual item AMEs are small—typically one to three percentage points—which invites the objection that the loser effect is statistically detectable but substantively trivial. Two considerations complicate that conclusion. First, these are average marginal effects from a multinomial outcome with twenty items; probability mass that shifts toward one item must come from others. The consistency of the pattern—9 of 10 procedural items positive, 6 of 6 substantive items negative—matters more than any single coefficient. Under the null hypothesis that loser status is unrelated to democratic conceptions, each item has a 50% probability of showing a positive (or negative) loser effect. The observed directional consistency is unlikely to reflect chance (Section 9 of the online appendix reports a formal sign test).</w:t>
+        <w:t xml:space="preserve">Individual item AMEs are small—typically one to three percentage points—which invites the objection that the loser effect is statistically detectable but substantively trivial. Two considerations complicate that conclusion. First, these are average marginal effects from a multinomial outcome with twenty items; probability mass that shifts toward one item must come from others. The consistency of the pattern—9 of 10 procedural items positive, 6 of 6 substantive items negative—matters more than any single coefficient. Under the null hypothesis that loser status is unrelated to democratic conceptions, each item has a 50% probability of showing a positive (or negative) loser effect. The observed directional consistency (15 of 16 items in the predicted direction) yields</w:t>
+      </w:r>
+      <w:r>
+        <w:t xml:space="preserve"> </w:t>
+      </w:r>
+      <m:oMath>
+        <m:r>
+          <m:t>p</m:t>
+        </m:r>
+        <m:r>
+          <m:rPr>
+            <m:sty m:val="p"/>
+          </m:rPr>
+          <m:t>&lt;</m:t>
+        </m:r>
+        <m:r>
+          <m:t>0.001</m:t>
+        </m:r>
+      </m:oMath>
+      <w:r>
+        <w:t xml:space="preserve"> </w:t>
+      </w:r>
+      <w:r>
+        <w:t xml:space="preserve">on a one-sided binomial test, confirming that the pattern is unlikely to reflect chance.</w:t>
       </w:r>
     </w:p>
     <w:p>
@@ -3283,7 +3333,15 @@
         <w:t xml:space="preserve"> </w:t>
       </w:r>
       <w:r>
-        <w:t xml:space="preserve">has been stripped of its democratic content. That the gap does persist—albeit modestly—is consistent with the exclusion mechanism, though alternative interpretations (including generalized regime dissatisfaction) cannot be ruled out in this case. Among the remaining countries (Table 2), Malaysia’s gap narrows across waves, potentially reflecting the political opening that would culminate in the extraordinary 2018 alternation—the first change in government since independence. Taiwan reverses from positive to negative by Wave 6, a pattern that likely reflects cross-strait identity politics more than the winner-loser dynamic examined here. (Myanmar’s single data point captures a strikingly large gap consistent with the stakes of its fragile transition, though little can be inferred from one observation.) Japan, as expected for a consolidated democracy, shows a modest and stable gap throughout.</w:t>
+        <w:t xml:space="preserve">has been stripped of its democratic content. That the gap does persist—albeit modestly—is consistent with the exclusion mechanism, though alternative interpretations (including generalized regime dissatisfaction) cannot be ruled out in this case. The remaining countries present a more varied picture that resists easy theoretical assimilation (Table 2). Taiwan reverses from a positive gap in Waves 3 and 4 to a negative gap by Wave 6 (–4.7 pp). The timing coincides with Tsai Ing-wen’s decisive 2020 victory and the DPP’s consolidation of power amid intensifying cross-strait tensions. Under these conditions, the KMT’s supporters—coded as losers—may have shifted toward sovereignty-related substantive concerns (economic ties with the mainland, cross-strait stability) rather than toward the procedural orientation the theory predicts, a pattern shaped more by the unique geopolitics of cross-strait identity than by the democratic erosion logic central to this article. The Philippines shows a different kind of instability: a positive gap in Waves 3 and 4 that collapses to near zero in Wave 6, coinciding with the transition from the Duterte presidency to the Marcos Jr. administration. Whether this reflects a genuine convergence in democratic conceptions or the disruption of stable partisan alignments by populist realignment deserves closer investigation than the present data permit. Malaysia’s narrowing gap across Waves 3 and 4 is more readily interpretable: the political opening that culminated in the extraordinary 2018 alternation—the first change in government since independence—plausibly reduced the stakes of losing and thereby compressed the procedural-substantive divide, consistent with H3’s prediction that the gap should shrink when institutional protections are restored. Mongolia’s trajectory, from near zero to +5.0 pp by Wave 6, may reflect the contested 2017 presidential election and subsequent political turbulence, though the magnitudes are modest and the confidence intervals wide.</w:t>
+      </w:r>
+    </w:p>
+    <w:p>
+      <w:pPr>
+        <w:pStyle w:val="BodyText"/>
+      </w:pPr>
+      <w:r>
+        <w:t xml:space="preserve">Japan, as expected for a consolidated democracy with regular alternation, shows a modest and stable gap throughout. (Myanmar’s single data point captures a strikingly large gap consistent with the stakes of its fragile transition, though little can be inferred from one observation.) The heterogeneity across these remaining cases does not invalidate the theoretical framework—the theory predicts context-dependence, not uniformity—but it does underscore that the Thailand-South Korea contrast, while the most dramatic and cleanest test, should not be mistaken for the full story.</w:t>
       </w:r>
     </w:p>
     <w:tbl>
@@ -4329,19 +4387,23 @@
         <w:t xml:space="preserve"> </w:t>
       </w:r>
       <w:r>
-        <w:t xml:space="preserve">= 23,124), indicating substantial overlap rather than collinearity. It remains unclear whether the interaction reflects genuine updating or pre-existing differences in outlook. The protective-participatory divergence mitigates but does not eliminate this concern, since motivated reasoning could produce domain-specific patterns. However, a pure</w:t>
-      </w:r>
-      <w:r>
-        <w:t xml:space="preserve"> </w:t>
-      </w:r>
-      <w:r>
-        <w:t xml:space="preserve">“sore loser”</w:t>
-      </w:r>
-      <w:r>
-        <w:t xml:space="preserve"> </w:t>
-      </w:r>
-      <w:r>
-        <w:t xml:space="preserve">interpretation is difficult to reconcile with the item-level structure of the results: if losers who perceive unfairness were simply expressing generalized grievance, the interaction should run uniformly in the same direction across all procedural items rather than diverging sharply between protective items (positive) and participatory items (negative). Because this test alone cannot definitively distinguish the mechanisms, two additional tests are needed.</w:t>
+        <w:t xml:space="preserve">= 23,124), indicating substantial overlap rather than collinearity. The interaction could reflect genuine updating in response to perceived procedural threat, or it could reflect motivated reasoning: losers who feel cheated may gravitate toward whichever procedural vocabulary best validates their grievance. The protective-participatory divergence constrains the set of plausible accounts—generalized negativity would not produce domain-specific patterns—but does not eliminate motivated reasoning as a contributor, since motivated cognition can itself be domain-specific. The strongest version of the positional claim is therefore not that motivated reasoning plays no role, but that the</w:t>
+      </w:r>
+      <w:r>
+        <w:t xml:space="preserve"> </w:t>
+      </w:r>
+      <w:r>
+        <w:rPr>
+          <w:i/>
+          <w:iCs/>
+        </w:rPr>
+        <w:t xml:space="preserve">structure</w:t>
+      </w:r>
+      <w:r>
+        <w:t xml:space="preserve"> </w:t>
+      </w:r>
+      <w:r>
+        <w:t xml:space="preserve">of the domain-specific pattern—protective items up, participatory items down, material welfare flat—is more parsimoniously explained by differential institutional salience than by a grievance account that would need to explain why losers’ resentment selectively targets elections but not courts. An alternative specification would treat perceived fairness as a mediator rather than a moderator—electoral loss shaping fairness perceptions, which in turn shape conceptions. This causal ordering is plausible but cannot be tested with cross-sectional data; the two framings yield complementary rather than competing insights. Because this test alone cannot definitively distinguish the mechanisms, two additional tests are needed.</w:t>
       </w:r>
     </w:p>
     <w:bookmarkEnd w:id="45"/>
@@ -4454,7 +4516,7 @@
         <w:pStyle w:val="BodyText"/>
       </w:pPr>
       <w:r>
-        <w:t xml:space="preserve">So the trajectory is not about who ended up in the winner and loser camps—it is about how people in those camps came to think differently about democracy over time. The exercise does not rule out realignment along unmeasured dimensions like ideology or political interest. But age, education, and urbanization are the fault lines that structure Thai politics most powerfully</w:t>
+        <w:t xml:space="preserve">The trajectory, then, is not about who ended up in the winner and loser camps—it is about how people in those camps differ in how they conceptualize democracy, with that divergence growing across waves. The reweighting covers age, gender, education, and urban residence—the observable dimensions that most powerfully structure Thai political alignments</w:t>
       </w:r>
       <w:r>
         <w:t xml:space="preserve"> </w:t>
@@ -4463,7 +4525,7 @@
         <w:t xml:space="preserve">(Ockey 2004; McCargo 2019)</w:t>
       </w:r>
       <w:r>
-        <w:t xml:space="preserve">, and controlling for them changes almost nothing.</w:t>
+        <w:t xml:space="preserve">—and controlling for them changes almost nothing. Realignment along unmeasured dimensions (partisan ideology, media consumption, political sophistication) remains a possible confound that these data cannot rule out. Adding political interest as a control changes the mean procedural average marginal effect by 0.1 percentage point, indicating the trajectory is not driven by differential political engagement across coalitions.</w:t>
       </w:r>
     </w:p>
     <w:bookmarkEnd w:id="47"/>
@@ -4489,7 +4551,15 @@
         <w:pStyle w:val="BodyText"/>
       </w:pPr>
       <w:r>
-        <w:t xml:space="preserve">These three pieces of evidence do not amount to proof that individuals changed their minds—establishing individual-level change would require panel data, and repeated cross-sections cannot deliver it. But the patterns are hard to square with the idea that democratic conceptions are stable cultural inheritances, hardwired personality traits, or byproducts of coalition shuffling. For the rival explanation to work, you would need ideological or dispositional differences between the winning and losing coalitions to have blown apart in Thailand while holding perfectly steady in South Korea, Cambodia, and nearly everywhere else—a scenario for which there is no independent evidence. The evidence at hand, taken as a whole, points toward positional updating: people rethinking what democracy means in light of where they stand politically and what the institutional landscape looks like around them.</w:t>
+        <w:t xml:space="preserve">A supplementary within-loser analysis sharpens the mechanism interpretation. Restricting the sample to electoral losers and examining variation in perceived electoral fairness, protective procedural items—media freedom, free expression, legislative oversight, protest freedom—show a mean unfairness amplification of approximately 2.2 percentage points among the 30.8% of losers who perceive elections as unfair, while participatory items (free elections, party competition) show a smaller and less consistent pattern. The domain structure—concentrated on liberal protections rather than elections or material welfare—is consistent with perceived threat activating specific institutional commitments rather than generalized negativity.</w:t>
+      </w:r>
+    </w:p>
+    <w:p>
+      <w:pPr>
+        <w:pStyle w:val="BodyText"/>
+      </w:pPr>
+      <w:r>
+        <w:t xml:space="preserve">These tests do not amount to proof that individuals changed their minds. But the patterns are hard to square with the idea that democratic conceptions are stable cultural inheritances, hardwired personality traits, or byproducts of coalition shuffling. The evidence at hand, taken as a whole, fits the positional account better than any of the alternatives considered: the patterns are systematically organized in ways that stable cultural accounts do not predict and that compositional change does not explain.</w:t>
       </w:r>
     </w:p>
     <w:bookmarkEnd w:id="48"/>
@@ -4576,6 +4646,74 @@
         <w:pStyle w:val="BodyText"/>
       </w:pPr>
       <w:r>
+        <w:t xml:space="preserve">The qualitative case comparison invites the question of whether the pattern generalizes beyond the Thailand–South Korea contrast. A country-wave-level analysis correlating the procedural-substantive gap with changes in the V-Dem Liberal Democracy Index yields a negative association (</w:t>
+      </w:r>
+      <m:oMath>
+        <m:r>
+          <m:t>r</m:t>
+        </m:r>
+        <m:r>
+          <m:rPr>
+            <m:sty m:val="p"/>
+          </m:rPr>
+          <m:t>=</m:t>
+        </m:r>
+        <m:r>
+          <m:rPr>
+            <m:sty m:val="p"/>
+          </m:rPr>
+          <m:t>−</m:t>
+        </m:r>
+        <m:r>
+          <m:t>0.23</m:t>
+        </m:r>
+      </m:oMath>
+      <w:r>
+        <w:t xml:space="preserve">,</w:t>
+      </w:r>
+      <w:r>
+        <w:t xml:space="preserve"> </w:t>
+      </w:r>
+      <m:oMath>
+        <m:r>
+          <m:t>N</m:t>
+        </m:r>
+        <m:r>
+          <m:rPr>
+            <m:sty m:val="p"/>
+          </m:rPr>
+          <m:t>=</m:t>
+        </m:r>
+        <m:r>
+          <m:t>27</m:t>
+        </m:r>
+      </m:oMath>
+      <w:r>
+        <w:t xml:space="preserve">): country-waves experiencing greater democratic erosion tend to show larger winner-loser gaps in procedural orientations. The direction is consistent with the case evidence, but the association does not reach conventional significance (</w:t>
+      </w:r>
+      <m:oMath>
+        <m:r>
+          <m:t>p</m:t>
+        </m:r>
+        <m:r>
+          <m:rPr>
+            <m:sty m:val="p"/>
+          </m:rPr>
+          <m:t>=</m:t>
+        </m:r>
+        <m:r>
+          <m:t>0.253</m:t>
+        </m:r>
+      </m:oMath>
+      <w:r>
+        <w:t xml:space="preserve">). With 27 observations and a single continuous moderator, the analysis is substantially underpowered—detecting a correlation of this magnitude at conventional thresholds would require roughly 140 country-wave cells. The V-Dem result should therefore be read as descriptively consistent with the theoretical framework rather than as a formal test of it (Appendix L). The case evidence—Thailand’s dramatic widening set against South Korea’s stability—carries the inferential weight; the cross-national correlation provides modest corroboration but cannot substitute for additional cases of erosion and resilience.</w:t>
+      </w:r>
+    </w:p>
+    <w:p>
+      <w:pPr>
+        <w:pStyle w:val="BodyText"/>
+      </w:pPr>
+      <w:r>
         <w:t xml:space="preserve">Non-voters provide another angle on the voter-restriction choice. Their procedural-substantive gap (14.3 pp) resembles that of winners (13.9 pp) rather than losers (17.3 pp), confirming that restricting the sample to voters does not inflate the estimated loser effect (Appendix H). A three-way decomposition distinguishing key opposition supporters from other losers pushes on the mechanism from a different direction: both subgroups display comparable procedural orientations across the three countries where decomposition was feasible (Appendix J). If the effect were driven by partisan strategic signaling—opposition leaders rallying their base around procedural rhetoric—it should concentrate among principal opposition supporters. That it does not is more consistent with the exclusion-based mechanism, where distance from state authority rather than organizational affiliation drives procedural attention.</w:t>
       </w:r>
     </w:p>
@@ -4584,7 +4722,7 @@
         <w:pStyle w:val="BodyText"/>
       </w:pPr>
       <w:r>
-        <w:t xml:space="preserve">Finally, the use of repeated cross-sections rather than panel data means within-country trajectories cannot definitively rule out compositional change. The Thai case offers the strongest counterargument: party loyalties in Thailand’s color-coded politics are notably stable, and the gap’s tracking of documented political events, rather than gradual demographic shifts, favors the positional interpretation.</w:t>
+        <w:t xml:space="preserve">Party loyalties in Thailand’s color-coded politics are notably stable, and the gap’s tracking of documented political events, rather than gradual demographic shifts, favors the positional interpretation over compositional change.</w:t>
       </w:r>
     </w:p>
     <w:bookmarkEnd w:id="52"/>
@@ -4620,7 +4758,16 @@
         <w:t xml:space="preserve">(Sinpeng 2021; McCargo 2019)</w:t>
       </w:r>
       <w:r>
-        <w:t xml:space="preserve">. The cumulative evidence—fairness amplification, domain specificity, and compositional stability—tilts toward the positional interpretation.</w:t>
+        <w:t xml:space="preserve">. The geographic concentration of pro-Thaksin support in the north and northeast was effectively unchanged across the three elections bracketing this period</w:t>
+      </w:r>
+      <w:r>
+        <w:t xml:space="preserve"> </w:t>
+      </w:r>
+      <w:r>
+        <w:t xml:space="preserve">(Ricks 2019; McCargo 2019)</w:t>
+      </w:r>
+      <w:r>
+        <w:t xml:space="preserve">, and the demographic reweighting exercise (Appendix G)—which holds the age, education, gender, and urban-rural profile of winning and losing coalitions constant at their Wave 3 distributions—shifts the loser effects by less than one percentage point on average. The cumulative evidence—fairness amplification, domain specificity, and compositional stability—tilts toward the positional interpretation.</w:t>
       </w:r>
     </w:p>
     <w:p>
@@ -4628,7 +4775,7 @@
         <w:pStyle w:val="BodyText"/>
       </w:pPr>
       <w:r>
-        <w:t xml:space="preserve">While repeated cross-sections cannot pin down individual-level attitude change with certainty, the within-country dynamics—especially the Thailand-South Korea contrast—fit the positional updating story far better than they fit stable sorting on unobservable characteristics. The alternative would require that ideological or dispositional differences between winners and losers widened dramatically in Thailand during this period while staying flat in South Korea, Cambodia, and nearly everywhere else. No one has produced evidence for that kind of asymmetric realignment. The conditional character of the effect also helps distinguish positional updating from the motivated reasoning account advanced by</w:t>
+        <w:t xml:space="preserve">The within-country dynamics—especially the Thailand–South Korea contrast—are more readily explained by the positional account than by stable sorting on unobservable characteristics, though repeated cross-sections cannot pin down individual-level attitude change and a definitive test awaits panel data. The strongest alternative is not cultural determinism but ideological sorting: the possibility that Thai winners and losers diverged on procedural values because the coalitions themselves were reshuffled along ideological lines that the demographic reweighting does not capture—media consumption, political sophistication, urban-rural identity beyond the binary control variable. For this sorting account to explain the full pattern, ideological or dispositional differences between winning and losing coalitions would need to have widened dramatically in Thailand during this period while staying flat in South Korea, Cambodia, and nearly everywhere else. No independent evidence supports that kind of asymmetric realignment, but the possibility cannot be ruled out with the available data. The conditional character of the effect also helps distinguish positional updating from the motivated reasoning account advanced by</w:t>
       </w:r>
       <w:r>
         <w:t xml:space="preserve"> </w:t>
@@ -4637,7 +4784,7 @@
         <w:t xml:space="preserve">Bryan (2023)</w:t>
       </w:r>
       <w:r>
-        <w:t xml:space="preserve">, who treats conceptual divergence as an automatic consequence of holding power. If the mechanism were purely cognitive—partisans reflexively molding democratic meaning to fit their position—then South Korea’s crisis should have produced the same divergence as Thailand’s, since both cases involved sharp partisan conflict over institutional legitimacy. That it did not suggests the mechanism is better understood as a response to the institutional stakes of exclusion rather than to partisan status per se.</w:t>
+        <w:t xml:space="preserve">, who treats conceptual divergence as an automatic consequence of holding power. If the mechanism were purely cognitive—partisans reflexively molding democratic meaning to fit their position—then South Korea’s crisis should have produced comparable divergence, since both cases involved sharp partisan conflict over institutional legitimacy. That it did not suggests the mechanism responds to the institutional stakes of exclusion rather than to partisan status per se.</w:t>
       </w:r>
     </w:p>
     <w:p>
@@ -4675,7 +4822,35 @@
         <w:t xml:space="preserve"> </w:t>
       </w:r>
       <w:r>
-        <w:t xml:space="preserve">document a parallel dynamic in Brazil: after Bolsonaro’s victory, winners who expressed broad support for the democratic system simultaneously became more willing to countenance executive overreach, suggesting that system-level endorsement and procedural commitment can move in opposite directions. The Asian patterns reported here indicate that this decoupling is not confined to dramatic authoritarian victories but unfolds gradually across extended erosion trajectories.</w:t>
+        <w:t xml:space="preserve">document a parallel dynamic in Brazil: after Bolsonaro’s victory, winners who expressed broad support for the democratic system simultaneously became more willing to countenance executive overreach, suggesting that system-level endorsement and procedural commitment can move in opposite directions.</w:t>
+      </w:r>
+      <w:r>
+        <w:t xml:space="preserve"> </w:t>
+      </w:r>
+      <w:r>
+        <w:t xml:space="preserve">Sadowski (2024)</w:t>
+      </w:r>
+      <w:r>
+        <w:t xml:space="preserve"> </w:t>
+      </w:r>
+      <w:r>
+        <w:t xml:space="preserve">identifies a similar paradox in Poland, where democratic backsliding under PiS was accompanied by</w:t>
+      </w:r>
+      <w:r>
+        <w:t xml:space="preserve"> </w:t>
+      </w:r>
+      <w:r>
+        <w:rPr>
+          <w:i/>
+          <w:iCs/>
+        </w:rPr>
+        <w:t xml:space="preserve">rising</w:t>
+      </w:r>
+      <w:r>
+        <w:t xml:space="preserve"> </w:t>
+      </w:r>
+      <w:r>
+        <w:t xml:space="preserve">aggregate support for democracy—a pattern consistent with losers intensifying their procedural commitments even as winners hollowed them out. The Asian patterns reported here indicate that this decoupling is not confined to dramatic authoritarian victories but unfolds gradually across extended erosion trajectories.</w:t>
       </w:r>
     </w:p>
     <w:p>
@@ -4718,17 +4893,7 @@
         <w:t xml:space="preserve"> </w:t>
       </w:r>
       <w:r>
-        <w:t xml:space="preserve">(</w:t>
-      </w:r>
-      <w:r>
-        <w:rPr>
-          <w:b/>
-          <w:bCs/>
-        </w:rPr>
-        <w:t xml:space="preserve">Rich2025-gd?</w:t>
-      </w:r>
-      <w:r>
-        <w:t xml:space="preserve">)</w:t>
+        <w:t xml:space="preserve">Rich (2025)</w:t>
       </w:r>
       <w:r>
         <w:t xml:space="preserve"> </w:t>
@@ -4857,7 +5022,7 @@
         <w:t xml:space="preserve"> </w:t>
       </w:r>
       <w:r>
-        <w:t xml:space="preserve">(Diamond 2015; Foa and Mounk 2016)</w:t>
+        <w:t xml:space="preserve">(Diamond 2015; Foa and Mounk 2016; though see Norris 2017; Wuttke et al. 2022 for challenges to the deconsolidation thesis)</w:t>
       </w:r>
       <w:r>
         <w:t xml:space="preserve">, knowing which vision predominates, and among whom, matters well beyond the region examined here.</w:t>
@@ -4868,7 +5033,47 @@
         <w:pStyle w:val="BodyText"/>
       </w:pPr>
       <w:r>
-        <w:t xml:space="preserve">The analysis faces limitations worth stating directly. The repeated cross-sectional design means I cannot directly watch individuals change their minds; the within-country trajectories are suggestive rather than dispositive. Eleven countries is not a large sample for cross-national inference—though it is worth noting that the Asian Barometer is among the very few surveys that has tracked democratic conceptions with forced-choice items over nearly two decades, and the consistency of the loser effect across such diverse political systems is itself informative. The compression of the gap in Wave 6 across most countries outside Thailand remains a puzzle. The pandemic’s tendency to make state capacity salient for everyone is a plausible explanation, though not a fully satisfying one, and post-pandemic survey rounds should be able to test it. And the restriction to voters, while theoretically justified, means the findings describe the electorally active public, not the population at large.</w:t>
+        <w:t xml:space="preserve">The analysis faces limitations that constrain interpretation. The repeated cross-sectional design—the most consequential constraint, discussed in detail in the methods section—means the within-country trajectories are suggestive rather than dispositive. Recent causal evidence on the winner-loser gap in satisfaction underscores both the challenge and the potential distinctiveness of the conceptual dimension studied here:</w:t>
+      </w:r>
+      <w:r>
+        <w:t xml:space="preserve"> </w:t>
+      </w:r>
+      <w:r>
+        <w:t xml:space="preserve">Daoust et al. (2024)</w:t>
+      </w:r>
+      <w:r>
+        <w:t xml:space="preserve"> </w:t>
+      </w:r>
+      <w:r>
+        <w:t xml:space="preserve">use a regression discontinuity design around government formation and find that the causal impact of winning or losing on satisfaction is indistinguishable from zero, while</w:t>
+      </w:r>
+      <w:r>
+        <w:t xml:space="preserve"> </w:t>
+      </w:r>
+      <w:r>
+        <w:t xml:space="preserve">Erhardt (2023)</w:t>
+      </w:r>
+      <w:r>
+        <w:t xml:space="preserve"> </w:t>
+      </w:r>
+      <w:r>
+        <w:t xml:space="preserve">shows with Dutch panel data that satisfaction effects are largely short-run. If the satisfaction gap is causally fragile, the persistent and context-sensitive</w:t>
+      </w:r>
+      <w:r>
+        <w:t xml:space="preserve"> </w:t>
+      </w:r>
+      <w:r>
+        <w:rPr>
+          <w:i/>
+          <w:iCs/>
+        </w:rPr>
+        <w:t xml:space="preserve">conceptual</w:t>
+      </w:r>
+      <w:r>
+        <w:t xml:space="preserve"> </w:t>
+      </w:r>
+      <w:r>
+        <w:t xml:space="preserve">gap documented here may operate through a different mechanism entirely—one that panel data on democratic conceptions, when available, could help identify. Eleven countries is not a large sample for cross-national inference—though it is worth noting that the Asian Barometer is among the very few surveys that has tracked democratic conceptions with forced-choice items over nearly two decades, and the consistency of the loser effect across such diverse political systems is itself informative. The compression of the gap in Wave 6 across most countries outside Thailand remains a puzzle. A natural candidate explanation—that the pandemic made state capacity salient for everyone, compressing the winner-loser distinction by pulling respondents toward governance-oriented definitions—is not supported by the data. Governance items (no waste, quality services, law and order, clean politics) fell by an average of 3.8 percentage points from Wave 4 to Wave 6 rather than rising, ruling out a blanket pandemic-salience account. The compression is real but unexplained, and future survey rounds in the post-pandemic period will be needed to determine whether it persists or proves transient. Political engagement is a further concern: unobserved shifts in political interest or partisan intensity within winning and losing coalitions could account for some portion of the within-country trajectories. The ABS includes a political interest measure with coverage exceeding 95% across Thailand’s survey waves. Adding political interest as a control to the Thailand-specific models changes the mean procedural AME by 0.1 percentage point—a negligible shift that indicates the trajectory is not driven by differential political engagement across coalitions. Partisan intensity, however, is not directly measured in the ABS and remains a plausible unmeasured confounder. The demographic reweighting results (Appendix G), which hold coalition composition constant on age, education, gender, and urban residence without altering the substantive findings, provide partial reassurance. And the restriction to voters, while theoretically justified, means the findings describe the electorally active public, not the population at large.</w:t>
       </w:r>
     </w:p>
     <w:bookmarkEnd w:id="53"/>
@@ -4902,11 +5107,11 @@
         <w:pStyle w:val="BodyText"/>
       </w:pPr>
       <w:r>
-        <w:t xml:space="preserve">The limits of repeated cross-sections warrant caution about causal claims. I cannot directly observe anyone changing their mind, and I cannot entirely rule out that the patterns reflect ideological sorting along dimensions my data do not measure. But the associations documented here—their consistency across items, their responsiveness to political context, their concentration among those who perceive procedural threats—point toward a dynamic relationship between electoral experience and democratic meaning that previous work has overlooked. Whether that relationship is best described as updating, sorting, or some blend of the two remains to be settled. What the evidence does suggest, fairly clearly, is that the positional account has more going for it than cultural determinism does.</w:t>
+        <w:t xml:space="preserve">The associations documented here—their consistency across items, their responsiveness to political context, their concentration among those who perceive procedural threats—point toward a dynamic relationship between electoral experience and democratic meaning that previous work has overlooked. Whether that relationship is best described as updating, sorting, or some blend of the two remains to be settled. What the evidence does suggest, fairly clearly, is that the positional account has more going for it than cultural determinism does.</w:t>
       </w:r>
     </w:p>
     <w:bookmarkEnd w:id="54"/>
-    <w:bookmarkStart w:id="163" w:name="references"/>
+    <w:bookmarkStart w:id="182" w:name="references"/>
     <w:p>
       <w:pPr>
         <w:pStyle w:val="Heading1"/>
@@ -4915,7 +5120,7 @@
         <w:t xml:space="preserve">References</w:t>
       </w:r>
     </w:p>
-    <w:bookmarkStart w:id="162" w:name="refs"/>
+    <w:bookmarkStart w:id="181" w:name="refs"/>
     <w:bookmarkStart w:id="56" w:name="ref-Anderson2005-uk"/>
     <w:p>
       <w:pPr>
@@ -5408,7 +5613,7 @@
           <w:i/>
           <w:iCs/>
         </w:rPr>
-        <w:t xml:space="preserve">How East Asians View Democracy</w:t>
+        <w:t xml:space="preserve">How East Asians view democracy</w:t>
       </w:r>
       <w:r>
         <w:t xml:space="preserve">. Columbia University Press.</w:t>
@@ -5738,12 +5943,64 @@
       </w:r>
     </w:p>
     <w:bookmarkEnd w:id="85"/>
-    <w:bookmarkStart w:id="87" w:name="ref-Diamond1999-wd"/>
+    <w:bookmarkStart w:id="87" w:name="ref-Daoust2024-ie"/>
     <w:p>
       <w:pPr>
         <w:pStyle w:val="Bibliography"/>
       </w:pPr>
       <w:r>
+        <w:t xml:space="preserve">Daoust, Jean-François, Miroslav Nemčok, Philipp Broniecki, and Peter J Loewen. 2024.</w:t>
+      </w:r>
+      <w:r>
+        <w:t xml:space="preserve"> </w:t>
+      </w:r>
+      <w:r>
+        <w:t xml:space="preserve">“</w:t>
+      </w:r>
+      <w:r>
+        <w:t xml:space="preserve">Reassessing the winner-loser gap in satisfaction with democracy</w:t>
+      </w:r>
+      <w:r>
+        <w:t xml:space="preserve">.”</w:t>
+      </w:r>
+      <w:r>
+        <w:t xml:space="preserve"> </w:t>
+      </w:r>
+      <w:r>
+        <w:rPr>
+          <w:i/>
+          <w:iCs/>
+        </w:rPr>
+        <w:t xml:space="preserve">PloS One</w:t>
+      </w:r>
+      <w:r>
+        <w:t xml:space="preserve"> </w:t>
+      </w:r>
+      <w:r>
+        <w:t xml:space="preserve">19 (December): e0314967.</w:t>
+      </w:r>
+      <w:r>
+        <w:t xml:space="preserve"> </w:t>
+      </w:r>
+      <w:hyperlink r:id="rId86">
+        <w:r>
+          <w:rPr>
+            <w:rStyle w:val="Hyperlink"/>
+          </w:rPr>
+          <w:t xml:space="preserve">https://doi.org/10.1371/journal.pone.0314967</w:t>
+        </w:r>
+      </w:hyperlink>
+      <w:r>
+        <w:t xml:space="preserve">.</w:t>
+      </w:r>
+    </w:p>
+    <w:bookmarkEnd w:id="87"/>
+    <w:bookmarkStart w:id="89" w:name="ref-Diamond1999-wd"/>
+    <w:p>
+      <w:pPr>
+        <w:pStyle w:val="Bibliography"/>
+      </w:pPr>
+      <w:r>
         <w:t xml:space="preserve">Diamond, Larry. 1999.</w:t>
       </w:r>
       <w:r>
@@ -5762,7 +6019,7 @@
       <w:r>
         <w:t xml:space="preserve"> </w:t>
       </w:r>
-      <w:hyperlink r:id="rId86">
+      <w:hyperlink r:id="rId88">
         <w:r>
           <w:rPr>
             <w:rStyle w:val="Hyperlink"/>
@@ -5774,8 +6031,8 @@
         <w:t xml:space="preserve">.</w:t>
       </w:r>
     </w:p>
-    <w:bookmarkEnd w:id="87"/>
-    <w:bookmarkStart w:id="89" w:name="ref-Diamond2015-yb"/>
+    <w:bookmarkEnd w:id="89"/>
+    <w:bookmarkStart w:id="91" w:name="ref-Diamond2015-yb"/>
     <w:p>
       <w:pPr>
         <w:pStyle w:val="Bibliography"/>
@@ -5814,7 +6071,7 @@
       <w:r>
         <w:t xml:space="preserve"> </w:t>
       </w:r>
-      <w:hyperlink r:id="rId88">
+      <w:hyperlink r:id="rId90">
         <w:r>
           <w:rPr>
             <w:rStyle w:val="Hyperlink"/>
@@ -5826,13 +6083,117 @@
         <w:t xml:space="preserve">.</w:t>
       </w:r>
     </w:p>
-    <w:bookmarkEnd w:id="89"/>
-    <w:bookmarkStart w:id="91" w:name="ref-Esaiasson2011-po"/>
+    <w:bookmarkEnd w:id="91"/>
+    <w:bookmarkStart w:id="93" w:name="ref-Eck2025-jl"/>
     <w:p>
       <w:pPr>
         <w:pStyle w:val="Bibliography"/>
       </w:pPr>
       <w:r>
+        <w:t xml:space="preserve">Eck, Bjarn, and Emilien Paulis. 2025.</w:t>
+      </w:r>
+      <w:r>
+        <w:t xml:space="preserve"> </w:t>
+      </w:r>
+      <w:r>
+        <w:t xml:space="preserve">“</w:t>
+      </w:r>
+      <w:r>
+        <w:t xml:space="preserve">Defending the status quo or seeking change? Electoral outcomes, affective polarization, and support for referendums</w:t>
+      </w:r>
+      <w:r>
+        <w:t xml:space="preserve">.”</w:t>
+      </w:r>
+      <w:r>
+        <w:t xml:space="preserve"> </w:t>
+      </w:r>
+      <w:r>
+        <w:rPr>
+          <w:i/>
+          <w:iCs/>
+        </w:rPr>
+        <w:t xml:space="preserve">British Journal of Political Science</w:t>
+      </w:r>
+      <w:r>
+        <w:t xml:space="preserve"> </w:t>
+      </w:r>
+      <w:r>
+        <w:t xml:space="preserve">55.</w:t>
+      </w:r>
+      <w:r>
+        <w:t xml:space="preserve"> </w:t>
+      </w:r>
+      <w:hyperlink r:id="rId92">
+        <w:r>
+          <w:rPr>
+            <w:rStyle w:val="Hyperlink"/>
+          </w:rPr>
+          <w:t xml:space="preserve">https://doi.org/10.1017/s0007123425000365</w:t>
+        </w:r>
+      </w:hyperlink>
+      <w:r>
+        <w:t xml:space="preserve">.</w:t>
+      </w:r>
+    </w:p>
+    <w:bookmarkEnd w:id="93"/>
+    <w:bookmarkStart w:id="95" w:name="ref-Erhardt2023-um"/>
+    <w:p>
+      <w:pPr>
+        <w:pStyle w:val="Bibliography"/>
+      </w:pPr>
+      <w:r>
+        <w:t xml:space="preserve">Erhardt, Julian. 2023.</w:t>
+      </w:r>
+      <w:r>
+        <w:t xml:space="preserve"> </w:t>
+      </w:r>
+      <w:r>
+        <w:t xml:space="preserve">“</w:t>
+      </w:r>
+      <w:r>
+        <w:t xml:space="preserve">Political support through representation by the government. Evidence from Dutch panel data</w:t>
+      </w:r>
+      <w:r>
+        <w:t xml:space="preserve">.”</w:t>
+      </w:r>
+      <w:r>
+        <w:t xml:space="preserve"> </w:t>
+      </w:r>
+      <w:r>
+        <w:rPr>
+          <w:i/>
+          <w:iCs/>
+        </w:rPr>
+        <w:t xml:space="preserve">Swiss Political Science Review</w:t>
+      </w:r>
+      <w:r>
+        <w:t xml:space="preserve"> </w:t>
+      </w:r>
+      <w:r>
+        <w:t xml:space="preserve">29 (June): 202–22.</w:t>
+      </w:r>
+      <w:r>
+        <w:t xml:space="preserve"> </w:t>
+      </w:r>
+      <w:hyperlink r:id="rId94">
+        <w:r>
+          <w:rPr>
+            <w:rStyle w:val="Hyperlink"/>
+          </w:rPr>
+          <w:t xml:space="preserve">https://doi.org/10.1111/spsr.12561</w:t>
+        </w:r>
+      </w:hyperlink>
+      <w:r>
+        <w:t xml:space="preserve">.</w:t>
+      </w:r>
+    </w:p>
+    <w:bookmarkEnd w:id="95"/>
+    <w:bookmarkStart w:id="97" w:name="ref-Esaiasson2011-po"/>
+    <w:p>
+      <w:pPr>
+        <w:pStyle w:val="Bibliography"/>
+      </w:pPr>
+      <w:r>
         <w:t xml:space="preserve">Esaiasson, Peter. 2011.</w:t>
       </w:r>
       <w:r>
@@ -5866,7 +6227,7 @@
       <w:r>
         <w:t xml:space="preserve"> </w:t>
       </w:r>
-      <w:hyperlink r:id="rId90">
+      <w:hyperlink r:id="rId96">
         <w:r>
           <w:rPr>
             <w:rStyle w:val="Hyperlink"/>
@@ -5878,8 +6239,8 @@
         <w:t xml:space="preserve">.</w:t>
       </w:r>
     </w:p>
-    <w:bookmarkEnd w:id="91"/>
-    <w:bookmarkStart w:id="93" w:name="ref-Esaiasson2020-av"/>
+    <w:bookmarkEnd w:id="97"/>
+    <w:bookmarkStart w:id="99" w:name="ref-Esaiasson2020-av"/>
     <w:p>
       <w:pPr>
         <w:pStyle w:val="Bibliography"/>
@@ -5918,7 +6279,7 @@
       <w:r>
         <w:t xml:space="preserve"> </w:t>
       </w:r>
-      <w:hyperlink r:id="rId92">
+      <w:hyperlink r:id="rId98">
         <w:r>
           <w:rPr>
             <w:rStyle w:val="Hyperlink"/>
@@ -5930,8 +6291,8 @@
         <w:t xml:space="preserve">.</w:t>
       </w:r>
     </w:p>
-    <w:bookmarkEnd w:id="93"/>
-    <w:bookmarkStart w:id="95" w:name="ref-Evans2006-np"/>
+    <w:bookmarkEnd w:id="99"/>
+    <w:bookmarkStart w:id="101" w:name="ref-Evans2006-np"/>
     <w:p>
       <w:pPr>
         <w:pStyle w:val="Bibliography"/>
@@ -5970,7 +6331,7 @@
       <w:r>
         <w:t xml:space="preserve"> </w:t>
       </w:r>
-      <w:hyperlink r:id="rId94">
+      <w:hyperlink r:id="rId100">
         <w:r>
           <w:rPr>
             <w:rStyle w:val="Hyperlink"/>
@@ -5982,8 +6343,8 @@
         <w:t xml:space="preserve">.</w:t>
       </w:r>
     </w:p>
-    <w:bookmarkEnd w:id="95"/>
-    <w:bookmarkStart w:id="97" w:name="ref-Ferrin2016-se"/>
+    <w:bookmarkEnd w:id="101"/>
+    <w:bookmarkStart w:id="103" w:name="ref-Ferrin2016-se"/>
     <w:p>
       <w:pPr>
         <w:pStyle w:val="Bibliography"/>
@@ -6007,7 +6368,7 @@
       <w:r>
         <w:t xml:space="preserve"> </w:t>
       </w:r>
-      <w:hyperlink r:id="rId96">
+      <w:hyperlink r:id="rId102">
         <w:r>
           <w:rPr>
             <w:rStyle w:val="Hyperlink"/>
@@ -6019,8 +6380,8 @@
         <w:t xml:space="preserve">.</w:t>
       </w:r>
     </w:p>
-    <w:bookmarkEnd w:id="97"/>
-    <w:bookmarkStart w:id="99" w:name="ref-Fiorina1978-wf"/>
+    <w:bookmarkEnd w:id="103"/>
+    <w:bookmarkStart w:id="105" w:name="ref-Fiorina1978-wf"/>
     <w:p>
       <w:pPr>
         <w:pStyle w:val="Bibliography"/>
@@ -6059,7 +6420,7 @@
       <w:r>
         <w:t xml:space="preserve"> </w:t>
       </w:r>
-      <w:hyperlink r:id="rId98">
+      <w:hyperlink r:id="rId104">
         <w:r>
           <w:rPr>
             <w:rStyle w:val="Hyperlink"/>
@@ -6071,8 +6432,8 @@
         <w:t xml:space="preserve">.</w:t>
       </w:r>
     </w:p>
-    <w:bookmarkEnd w:id="99"/>
-    <w:bookmarkStart w:id="101" w:name="ref-Foa2016-lq"/>
+    <w:bookmarkEnd w:id="105"/>
+    <w:bookmarkStart w:id="107" w:name="ref-Foa2016-lq"/>
     <w:p>
       <w:pPr>
         <w:pStyle w:val="Bibliography"/>
@@ -6111,7 +6472,7 @@
       <w:r>
         <w:t xml:space="preserve"> </w:t>
       </w:r>
-      <w:hyperlink r:id="rId100">
+      <w:hyperlink r:id="rId106">
         <w:r>
           <w:rPr>
             <w:rStyle w:val="Hyperlink"/>
@@ -6123,8 +6484,8 @@
         <w:t xml:space="preserve">.</w:t>
       </w:r>
     </w:p>
-    <w:bookmarkEnd w:id="101"/>
-    <w:bookmarkStart w:id="103" w:name="ref-Graham2020-jr"/>
+    <w:bookmarkEnd w:id="107"/>
+    <w:bookmarkStart w:id="109" w:name="ref-Graham2020-jr"/>
     <w:p>
       <w:pPr>
         <w:pStyle w:val="Bibliography"/>
@@ -6163,7 +6524,7 @@
       <w:r>
         <w:t xml:space="preserve"> </w:t>
       </w:r>
-      <w:hyperlink r:id="rId102">
+      <w:hyperlink r:id="rId108">
         <w:r>
           <w:rPr>
             <w:rStyle w:val="Hyperlink"/>
@@ -6175,13 +6536,65 @@
         <w:t xml:space="preserve">.</w:t>
       </w:r>
     </w:p>
-    <w:bookmarkEnd w:id="103"/>
-    <w:bookmarkStart w:id="105" w:name="ref-Hsiao2020-fz"/>
+    <w:bookmarkEnd w:id="109"/>
+    <w:bookmarkStart w:id="111" w:name="ref-Halliez2023-zu"/>
     <w:p>
       <w:pPr>
         <w:pStyle w:val="Bibliography"/>
       </w:pPr>
       <w:r>
+        <w:t xml:space="preserve">Halliez, Adrien A, and Judd R Thornton. 2023.</w:t>
+      </w:r>
+      <w:r>
+        <w:t xml:space="preserve"> </w:t>
+      </w:r>
+      <w:r>
+        <w:t xml:space="preserve">“</w:t>
+      </w:r>
+      <w:r>
+        <w:t xml:space="preserve">The winner-loser satisfaction gap in the absence of a clear outcome</w:t>
+      </w:r>
+      <w:r>
+        <w:t xml:space="preserve">.”</w:t>
+      </w:r>
+      <w:r>
+        <w:t xml:space="preserve"> </w:t>
+      </w:r>
+      <w:r>
+        <w:rPr>
+          <w:i/>
+          <w:iCs/>
+        </w:rPr>
+        <w:t xml:space="preserve">Party Politics</w:t>
+      </w:r>
+      <w:r>
+        <w:t xml:space="preserve"> </w:t>
+      </w:r>
+      <w:r>
+        <w:t xml:space="preserve">29 (March): 260–69.</w:t>
+      </w:r>
+      <w:r>
+        <w:t xml:space="preserve"> </w:t>
+      </w:r>
+      <w:hyperlink r:id="rId110">
+        <w:r>
+          <w:rPr>
+            <w:rStyle w:val="Hyperlink"/>
+          </w:rPr>
+          <w:t xml:space="preserve">https://doi.org/10.1177/13540688211058111</w:t>
+        </w:r>
+      </w:hyperlink>
+      <w:r>
+        <w:t xml:space="preserve">.</w:t>
+      </w:r>
+    </w:p>
+    <w:bookmarkEnd w:id="111"/>
+    <w:bookmarkStart w:id="113" w:name="ref-Hsiao2020-fz"/>
+    <w:p>
+      <w:pPr>
+        <w:pStyle w:val="Bibliography"/>
+      </w:pPr>
+      <w:r>
         <w:t xml:space="preserve">Hsiao, Yi-Ching, and Eric Chen-Hua Yu. 2020.</w:t>
       </w:r>
       <w:r>
@@ -6215,7 +6628,7 @@
       <w:r>
         <w:t xml:space="preserve"> </w:t>
       </w:r>
-      <w:hyperlink r:id="rId104">
+      <w:hyperlink r:id="rId112">
         <w:r>
           <w:rPr>
             <w:rStyle w:val="Hyperlink"/>
@@ -6227,8 +6640,8 @@
         <w:t xml:space="preserve">.</w:t>
       </w:r>
     </w:p>
-    <w:bookmarkEnd w:id="105"/>
-    <w:bookmarkStart w:id="106" w:name="ref-ABS-W2"/>
+    <w:bookmarkEnd w:id="113"/>
+    <w:bookmarkStart w:id="114" w:name="ref-ABS-W2"/>
     <w:p>
       <w:pPr>
         <w:pStyle w:val="Bibliography"/>
@@ -6250,8 +6663,8 @@
         <w:t xml:space="preserve">. Taipei: National Taiwan University; Academia Sinica.</w:t>
       </w:r>
     </w:p>
-    <w:bookmarkEnd w:id="106"/>
-    <w:bookmarkStart w:id="107" w:name="ref-ABS-W3"/>
+    <w:bookmarkEnd w:id="114"/>
+    <w:bookmarkStart w:id="115" w:name="ref-ABS-W3"/>
     <w:p>
       <w:pPr>
         <w:pStyle w:val="Bibliography"/>
@@ -6273,8 +6686,8 @@
         <w:t xml:space="preserve">. Taipei: National Taiwan University; Academia Sinica.</w:t>
       </w:r>
     </w:p>
-    <w:bookmarkEnd w:id="107"/>
-    <w:bookmarkStart w:id="108" w:name="ref-ABS-W4"/>
+    <w:bookmarkEnd w:id="115"/>
+    <w:bookmarkStart w:id="116" w:name="ref-ABS-W4"/>
     <w:p>
       <w:pPr>
         <w:pStyle w:val="Bibliography"/>
@@ -6296,8 +6709,8 @@
         <w:t xml:space="preserve">. Taipei: National Taiwan University; Academia Sinica.</w:t>
       </w:r>
     </w:p>
-    <w:bookmarkEnd w:id="108"/>
-    <w:bookmarkStart w:id="110" w:name="ref-Inglehart1997-gw"/>
+    <w:bookmarkEnd w:id="116"/>
+    <w:bookmarkStart w:id="118" w:name="ref-Inglehart1997-gw"/>
     <w:p>
       <w:pPr>
         <w:pStyle w:val="Bibliography"/>
@@ -6321,7 +6734,7 @@
       <w:r>
         <w:t xml:space="preserve"> </w:t>
       </w:r>
-      <w:hyperlink r:id="rId109">
+      <w:hyperlink r:id="rId117">
         <w:r>
           <w:rPr>
             <w:rStyle w:val="Hyperlink"/>
@@ -6333,8 +6746,8 @@
         <w:t xml:space="preserve">.</w:t>
       </w:r>
     </w:p>
-    <w:bookmarkEnd w:id="110"/>
-    <w:bookmarkStart w:id="112" w:name="ref-Kahneman1979-af"/>
+    <w:bookmarkEnd w:id="118"/>
+    <w:bookmarkStart w:id="120" w:name="ref-Kahneman1979-af"/>
     <w:p>
       <w:pPr>
         <w:pStyle w:val="Bibliography"/>
@@ -6373,7 +6786,7 @@
       <w:r>
         <w:t xml:space="preserve"> </w:t>
       </w:r>
-      <w:hyperlink r:id="rId111">
+      <w:hyperlink r:id="rId119">
         <w:r>
           <w:rPr>
             <w:rStyle w:val="Hyperlink"/>
@@ -6385,8 +6798,8 @@
         <w:t xml:space="preserve">.</w:t>
       </w:r>
     </w:p>
-    <w:bookmarkEnd w:id="112"/>
-    <w:bookmarkStart w:id="114" w:name="ref-Kuhonta2014-qk"/>
+    <w:bookmarkEnd w:id="120"/>
+    <w:bookmarkStart w:id="122" w:name="ref-Kuhonta2014-qk"/>
     <w:p>
       <w:pPr>
         <w:pStyle w:val="Bibliography"/>
@@ -6425,7 +6838,7 @@
       <w:r>
         <w:t xml:space="preserve"> </w:t>
       </w:r>
-      <w:hyperlink r:id="rId113">
+      <w:hyperlink r:id="rId121">
         <w:r>
           <w:rPr>
             <w:rStyle w:val="Hyperlink"/>
@@ -6437,8 +6850,8 @@
         <w:t xml:space="preserve">.</w:t>
       </w:r>
     </w:p>
-    <w:bookmarkEnd w:id="114"/>
-    <w:bookmarkStart w:id="116" w:name="ref-Kunda1990-uw"/>
+    <w:bookmarkEnd w:id="122"/>
+    <w:bookmarkStart w:id="124" w:name="ref-Kunda1990-uw"/>
     <w:p>
       <w:pPr>
         <w:pStyle w:val="Bibliography"/>
@@ -6477,7 +6890,7 @@
       <w:r>
         <w:t xml:space="preserve"> </w:t>
       </w:r>
-      <w:hyperlink r:id="rId115">
+      <w:hyperlink r:id="rId123">
         <w:r>
           <w:rPr>
             <w:rStyle w:val="Hyperlink"/>
@@ -6489,8 +6902,8 @@
         <w:t xml:space="preserve">.</w:t>
       </w:r>
     </w:p>
-    <w:bookmarkEnd w:id="116"/>
-    <w:bookmarkStart w:id="117" w:name="ref-Levitsky2018-dd"/>
+    <w:bookmarkEnd w:id="124"/>
+    <w:bookmarkStart w:id="125" w:name="ref-Levitsky2018-dd"/>
     <w:p>
       <w:pPr>
         <w:pStyle w:val="Bibliography"/>
@@ -6512,14 +6925,14 @@
         <w:t xml:space="preserve">. Viking.</w:t>
       </w:r>
     </w:p>
-    <w:bookmarkEnd w:id="117"/>
-    <w:bookmarkStart w:id="119" w:name="ref-Linz1996-qs"/>
+    <w:bookmarkEnd w:id="125"/>
+    <w:bookmarkStart w:id="127" w:name="ref-Linz1996-qs"/>
     <w:p>
       <w:pPr>
         <w:pStyle w:val="Bibliography"/>
       </w:pPr>
       <w:r>
-        <w:t xml:space="preserve">Linz, Juan J (juan Jose), and Alfred C Stepan. 1996.</w:t>
+        <w:t xml:space="preserve">Linz, Juan J, and Alfred C Stepan. 1996.</w:t>
       </w:r>
       <w:r>
         <w:t xml:space="preserve"> </w:t>
@@ -6552,7 +6965,7 @@
       <w:r>
         <w:t xml:space="preserve"> </w:t>
       </w:r>
-      <w:hyperlink r:id="rId118">
+      <w:hyperlink r:id="rId126">
         <w:r>
           <w:rPr>
             <w:rStyle w:val="Hyperlink"/>
@@ -6564,8 +6977,8 @@
         <w:t xml:space="preserve">.</w:t>
       </w:r>
     </w:p>
-    <w:bookmarkEnd w:id="119"/>
-    <w:bookmarkStart w:id="121" w:name="ref-Luhrmann2019-ow"/>
+    <w:bookmarkEnd w:id="127"/>
+    <w:bookmarkStart w:id="129" w:name="ref-Luhrmann2019-ow"/>
     <w:p>
       <w:pPr>
         <w:pStyle w:val="Bibliography"/>
@@ -6604,7 +7017,7 @@
       <w:r>
         <w:t xml:space="preserve"> </w:t>
       </w:r>
-      <w:hyperlink r:id="rId120">
+      <w:hyperlink r:id="rId128">
         <w:r>
           <w:rPr>
             <w:rStyle w:val="Hyperlink"/>
@@ -6616,8 +7029,8 @@
         <w:t xml:space="preserve">.</w:t>
       </w:r>
     </w:p>
-    <w:bookmarkEnd w:id="121"/>
-    <w:bookmarkStart w:id="123" w:name="ref-Mauk2020-bu"/>
+    <w:bookmarkEnd w:id="129"/>
+    <w:bookmarkStart w:id="131" w:name="ref-Mauk2020-bu"/>
     <w:p>
       <w:pPr>
         <w:pStyle w:val="Bibliography"/>
@@ -6641,7 +7054,7 @@
       <w:r>
         <w:t xml:space="preserve"> </w:t>
       </w:r>
-      <w:hyperlink r:id="rId122">
+      <w:hyperlink r:id="rId130">
         <w:r>
           <w:rPr>
             <w:rStyle w:val="Hyperlink"/>
@@ -6653,8 +7066,8 @@
         <w:t xml:space="preserve">.</w:t>
       </w:r>
     </w:p>
-    <w:bookmarkEnd w:id="123"/>
-    <w:bookmarkStart w:id="125" w:name="ref-McCargo2019-rx"/>
+    <w:bookmarkEnd w:id="131"/>
+    <w:bookmarkStart w:id="133" w:name="ref-McCargo2019-rx"/>
     <w:p>
       <w:pPr>
         <w:pStyle w:val="Bibliography"/>
@@ -6693,7 +7106,7 @@
       <w:r>
         <w:t xml:space="preserve"> </w:t>
       </w:r>
-      <w:hyperlink r:id="rId124">
+      <w:hyperlink r:id="rId132">
         <w:r>
           <w:rPr>
             <w:rStyle w:val="Hyperlink"/>
@@ -6705,13 +7118,99 @@
         <w:t xml:space="preserve">.</w:t>
       </w:r>
     </w:p>
-    <w:bookmarkEnd w:id="125"/>
-    <w:bookmarkStart w:id="127" w:name="ref-Nadeau1993-vo"/>
+    <w:bookmarkEnd w:id="133"/>
+    <w:bookmarkStart w:id="135" w:name="ref-Mietzner2021-jr"/>
     <w:p>
       <w:pPr>
         <w:pStyle w:val="Bibliography"/>
       </w:pPr>
       <w:r>
+        <w:t xml:space="preserve">Mietzner, Marcus. 2021.</w:t>
+      </w:r>
+      <w:r>
+        <w:t xml:space="preserve"> </w:t>
+      </w:r>
+      <w:r>
+        <w:rPr>
+          <w:i/>
+          <w:iCs/>
+        </w:rPr>
+        <w:t xml:space="preserve">Democratic deconsolidation in southeast Asia: Democratization and its obstacles in southeast Asia</w:t>
+      </w:r>
+      <w:r>
+        <w:t xml:space="preserve">. Edited by Edward Aspinall and Meredith L Weiss. Elements in Politics and Society in Southeast Asia. Cambridge University Press.</w:t>
+      </w:r>
+      <w:r>
+        <w:t xml:space="preserve"> </w:t>
+      </w:r>
+      <w:hyperlink r:id="rId134">
+        <w:r>
+          <w:rPr>
+            <w:rStyle w:val="Hyperlink"/>
+          </w:rPr>
+          <w:t xml:space="preserve">https://doi.org/10.1017/9781108677080</w:t>
+        </w:r>
+      </w:hyperlink>
+      <w:r>
+        <w:t xml:space="preserve">.</w:t>
+      </w:r>
+    </w:p>
+    <w:bookmarkEnd w:id="135"/>
+    <w:bookmarkStart w:id="137" w:name="ref-Monsivais-Carrillo2020-ck"/>
+    <w:p>
+      <w:pPr>
+        <w:pStyle w:val="Bibliography"/>
+      </w:pPr>
+      <w:r>
+        <w:t xml:space="preserve">Monsiváis-Carrillo, Alejandro. 2020.</w:t>
+      </w:r>
+      <w:r>
+        <w:t xml:space="preserve"> </w:t>
+      </w:r>
+      <w:r>
+        <w:t xml:space="preserve">“</w:t>
+      </w:r>
+      <w:r>
+        <w:t xml:space="preserve">Permissive winners? The winner–loser gap in the perception of freedoms</w:t>
+      </w:r>
+      <w:r>
+        <w:t xml:space="preserve">.”</w:t>
+      </w:r>
+      <w:r>
+        <w:t xml:space="preserve"> </w:t>
+      </w:r>
+      <w:r>
+        <w:rPr>
+          <w:i/>
+          <w:iCs/>
+        </w:rPr>
+        <w:t xml:space="preserve">Political Studies</w:t>
+      </w:r>
+      <w:r>
+        <w:t xml:space="preserve"> </w:t>
+      </w:r>
+      <w:r>
+        <w:t xml:space="preserve">70: 173–94. https://doi.org/</w:t>
+      </w:r>
+      <w:hyperlink r:id="rId136">
+        <w:r>
+          <w:rPr>
+            <w:rStyle w:val="Hyperlink"/>
+          </w:rPr>
+          <w:t xml:space="preserve">10.1177/0032321720952230https://doi.org/10.1177/0032321720952230the</w:t>
+        </w:r>
+      </w:hyperlink>
+      <w:r>
+        <w:t xml:space="preserve">.</w:t>
+      </w:r>
+    </w:p>
+    <w:bookmarkEnd w:id="137"/>
+    <w:bookmarkStart w:id="139" w:name="ref-Nadeau1993-vo"/>
+    <w:p>
+      <w:pPr>
+        <w:pStyle w:val="Bibliography"/>
+      </w:pPr>
+      <w:r>
         <w:t xml:space="preserve">Nadeau, Richard, and André Blais. 1993.</w:t>
       </w:r>
       <w:r>
@@ -6745,7 +7244,7 @@
       <w:r>
         <w:t xml:space="preserve"> </w:t>
       </w:r>
-      <w:hyperlink r:id="rId126">
+      <w:hyperlink r:id="rId138">
         <w:r>
           <w:rPr>
             <w:rStyle w:val="Hyperlink"/>
@@ -6757,8 +7256,8 @@
         <w:t xml:space="preserve">.</w:t>
       </w:r>
     </w:p>
-    <w:bookmarkEnd w:id="127"/>
-    <w:bookmarkStart w:id="129" w:name="ref-Norris2011-qz"/>
+    <w:bookmarkEnd w:id="139"/>
+    <w:bookmarkStart w:id="141" w:name="ref-Norris2011-qz"/>
     <w:p>
       <w:pPr>
         <w:pStyle w:val="Bibliography"/>
@@ -6782,7 +7281,7 @@
       <w:r>
         <w:t xml:space="preserve"> </w:t>
       </w:r>
-      <w:hyperlink r:id="rId128">
+      <w:hyperlink r:id="rId140">
         <w:r>
           <w:rPr>
             <w:rStyle w:val="Hyperlink"/>
@@ -6794,8 +7293,8 @@
         <w:t xml:space="preserve">.</w:t>
       </w:r>
     </w:p>
-    <w:bookmarkEnd w:id="129"/>
-    <w:bookmarkStart w:id="131" w:name="ref-Norris2012-er"/>
+    <w:bookmarkEnd w:id="141"/>
+    <w:bookmarkStart w:id="143" w:name="ref-Norris2012-er"/>
     <w:p>
       <w:pPr>
         <w:pStyle w:val="Bibliography"/>
@@ -6819,7 +7318,7 @@
       <w:r>
         <w:t xml:space="preserve"> </w:t>
       </w:r>
-      <w:hyperlink r:id="rId130">
+      <w:hyperlink r:id="rId142">
         <w:r>
           <w:rPr>
             <w:rStyle w:val="Hyperlink"/>
@@ -6831,13 +7330,48 @@
         <w:t xml:space="preserve">.</w:t>
       </w:r>
     </w:p>
-    <w:bookmarkEnd w:id="131"/>
-    <w:bookmarkStart w:id="133" w:name="ref-Ockey2004-ek"/>
+    <w:bookmarkEnd w:id="143"/>
+    <w:bookmarkStart w:id="144" w:name="ref-Norris2017-mk"/>
     <w:p>
       <w:pPr>
         <w:pStyle w:val="Bibliography"/>
       </w:pPr>
       <w:r>
+        <w:t xml:space="preserve">Norris, Pippa. 2017.</w:t>
+      </w:r>
+      <w:r>
+        <w:t xml:space="preserve"> </w:t>
+      </w:r>
+      <w:r>
+        <w:t xml:space="preserve">“</w:t>
+      </w:r>
+      <w:r>
+        <w:t xml:space="preserve">Is western democracy backsliding? Diagnosing the risks</w:t>
+      </w:r>
+      <w:r>
+        <w:t xml:space="preserve">.”</w:t>
+      </w:r>
+      <w:r>
+        <w:t xml:space="preserve"> </w:t>
+      </w:r>
+      <w:r>
+        <w:rPr>
+          <w:i/>
+          <w:iCs/>
+        </w:rPr>
+        <w:t xml:space="preserve">Journal of Democracy</w:t>
+      </w:r>
+      <w:r>
+        <w:t xml:space="preserve">.</w:t>
+      </w:r>
+    </w:p>
+    <w:bookmarkEnd w:id="144"/>
+    <w:bookmarkStart w:id="146" w:name="ref-Ockey2004-ek"/>
+    <w:p>
+      <w:pPr>
+        <w:pStyle w:val="Bibliography"/>
+      </w:pPr>
+      <w:r>
         <w:t xml:space="preserve">Ockey, James. 2004.</w:t>
       </w:r>
       <w:r>
@@ -6856,7 +7390,7 @@
       <w:r>
         <w:t xml:space="preserve"> </w:t>
       </w:r>
-      <w:hyperlink r:id="rId132">
+      <w:hyperlink r:id="rId145">
         <w:r>
           <w:rPr>
             <w:rStyle w:val="Hyperlink"/>
@@ -6868,8 +7402,8 @@
         <w:t xml:space="preserve">.</w:t>
       </w:r>
     </w:p>
-    <w:bookmarkEnd w:id="133"/>
-    <w:bookmarkStart w:id="135" w:name="ref-Pankaew2022-pr"/>
+    <w:bookmarkEnd w:id="146"/>
+    <w:bookmarkStart w:id="148" w:name="ref-Pankaew2022-pr"/>
     <w:p>
       <w:pPr>
         <w:pStyle w:val="Bibliography"/>
@@ -6908,7 +7442,7 @@
       <w:r>
         <w:t xml:space="preserve"> </w:t>
       </w:r>
-      <w:hyperlink r:id="rId134">
+      <w:hyperlink r:id="rId147">
         <w:r>
           <w:rPr>
             <w:rStyle w:val="Hyperlink"/>
@@ -6920,13 +7454,65 @@
         <w:t xml:space="preserve">.</w:t>
       </w:r>
     </w:p>
-    <w:bookmarkEnd w:id="135"/>
-    <w:bookmarkStart w:id="137" w:name="ref-Ricks2019-hs"/>
+    <w:bookmarkEnd w:id="148"/>
+    <w:bookmarkStart w:id="150" w:name="ref-Rich2025-sf"/>
     <w:p>
       <w:pPr>
         <w:pStyle w:val="Bibliography"/>
       </w:pPr>
       <w:r>
+        <w:t xml:space="preserve">Rich, Timothy S. 2025.</w:t>
+      </w:r>
+      <w:r>
+        <w:t xml:space="preserve"> </w:t>
+      </w:r>
+      <w:r>
+        <w:t xml:space="preserve">“</w:t>
+      </w:r>
+      <w:r>
+        <w:t xml:space="preserve">When the tables turn: Parties in power, losers’ consent, and institutional trust in Taiwan</w:t>
+      </w:r>
+      <w:r>
+        <w:t xml:space="preserve">.”</w:t>
+      </w:r>
+      <w:r>
+        <w:t xml:space="preserve"> </w:t>
+      </w:r>
+      <w:r>
+        <w:rPr>
+          <w:i/>
+          <w:iCs/>
+        </w:rPr>
+        <w:t xml:space="preserve">Asian Journal of Comparative Politics</w:t>
+      </w:r>
+      <w:r>
+        <w:t xml:space="preserve"> </w:t>
+      </w:r>
+      <w:r>
+        <w:t xml:space="preserve">10: 55–74.</w:t>
+      </w:r>
+      <w:r>
+        <w:t xml:space="preserve"> </w:t>
+      </w:r>
+      <w:hyperlink r:id="rId149">
+        <w:r>
+          <w:rPr>
+            <w:rStyle w:val="Hyperlink"/>
+          </w:rPr>
+          <w:t xml:space="preserve">https://doi.org/10.1177/20578911231225501</w:t>
+        </w:r>
+      </w:hyperlink>
+      <w:r>
+        <w:t xml:space="preserve">.</w:t>
+      </w:r>
+    </w:p>
+    <w:bookmarkEnd w:id="150"/>
+    <w:bookmarkStart w:id="152" w:name="ref-Ricks2019-hs"/>
+    <w:p>
+      <w:pPr>
+        <w:pStyle w:val="Bibliography"/>
+      </w:pPr>
+      <w:r>
         <w:t xml:space="preserve">Ricks, Jacob I. 2019.</w:t>
       </w:r>
       <w:r>
@@ -6960,7 +7546,7 @@
       <w:r>
         <w:t xml:space="preserve"> </w:t>
       </w:r>
-      <w:hyperlink r:id="rId136">
+      <w:hyperlink r:id="rId151">
         <w:r>
           <w:rPr>
             <w:rStyle w:val="Hyperlink"/>
@@ -6972,8 +7558,8 @@
         <w:t xml:space="preserve">.</w:t>
       </w:r>
     </w:p>
-    <w:bookmarkEnd w:id="137"/>
-    <w:bookmarkStart w:id="139" w:name="ref-Ricks2025-il"/>
+    <w:bookmarkEnd w:id="152"/>
+    <w:bookmarkStart w:id="154" w:name="ref-Ricks2025-il"/>
     <w:p>
       <w:pPr>
         <w:pStyle w:val="Bibliography"/>
@@ -7012,7 +7598,7 @@
       <w:r>
         <w:t xml:space="preserve"> </w:t>
       </w:r>
-      <w:hyperlink r:id="rId138">
+      <w:hyperlink r:id="rId153">
         <w:r>
           <w:rPr>
             <w:rStyle w:val="Hyperlink"/>
@@ -7024,13 +7610,65 @@
         <w:t xml:space="preserve">.</w:t>
       </w:r>
     </w:p>
-    <w:bookmarkEnd w:id="139"/>
-    <w:bookmarkStart w:id="141" w:name="ref-Schedler1998-dl"/>
+    <w:bookmarkEnd w:id="154"/>
+    <w:bookmarkStart w:id="156" w:name="ref-Sadowski2024-wq"/>
     <w:p>
       <w:pPr>
         <w:pStyle w:val="Bibliography"/>
       </w:pPr>
       <w:r>
+        <w:t xml:space="preserve">Sadowski, Ireneusz. 2024.</w:t>
+      </w:r>
+      <w:r>
+        <w:t xml:space="preserve"> </w:t>
+      </w:r>
+      <w:r>
+        <w:t xml:space="preserve">“</w:t>
+      </w:r>
+      <w:r>
+        <w:t xml:space="preserve">Democratic backsliding against a rising wave of support for democracy? Explaining trends in attitudes toward democracy in Poland (1995–2021)</w:t>
+      </w:r>
+      <w:r>
+        <w:t xml:space="preserve">.”</w:t>
+      </w:r>
+      <w:r>
+        <w:t xml:space="preserve"> </w:t>
+      </w:r>
+      <w:r>
+        <w:rPr>
+          <w:i/>
+          <w:iCs/>
+        </w:rPr>
+        <w:t xml:space="preserve">International Sociology: Journal of the International Sociological Association</w:t>
+      </w:r>
+      <w:r>
+        <w:t xml:space="preserve"> </w:t>
+      </w:r>
+      <w:r>
+        <w:t xml:space="preserve">39 (November): 698–720.</w:t>
+      </w:r>
+      <w:r>
+        <w:t xml:space="preserve"> </w:t>
+      </w:r>
+      <w:hyperlink r:id="rId155">
+        <w:r>
+          <w:rPr>
+            <w:rStyle w:val="Hyperlink"/>
+          </w:rPr>
+          <w:t xml:space="preserve">https://doi.org/10.1177/02685809241284284</w:t>
+        </w:r>
+      </w:hyperlink>
+      <w:r>
+        <w:t xml:space="preserve">.</w:t>
+      </w:r>
+    </w:p>
+    <w:bookmarkEnd w:id="156"/>
+    <w:bookmarkStart w:id="158" w:name="ref-Schedler1998-dl"/>
+    <w:p>
+      <w:pPr>
+        <w:pStyle w:val="Bibliography"/>
+      </w:pPr>
+      <w:r>
         <w:t xml:space="preserve">Schedler, Andreas. 1998.</w:t>
       </w:r>
       <w:r>
@@ -7064,7 +7702,7 @@
       <w:r>
         <w:t xml:space="preserve"> </w:t>
       </w:r>
-      <w:hyperlink r:id="rId140">
+      <w:hyperlink r:id="rId157">
         <w:r>
           <w:rPr>
             <w:rStyle w:val="Hyperlink"/>
@@ -7076,8 +7714,8 @@
         <w:t xml:space="preserve">.</w:t>
       </w:r>
     </w:p>
-    <w:bookmarkEnd w:id="141"/>
-    <w:bookmarkStart w:id="143" w:name="ref-Schumpeter2013-em"/>
+    <w:bookmarkEnd w:id="158"/>
+    <w:bookmarkStart w:id="160" w:name="ref-Schumpeter2013-em"/>
     <w:p>
       <w:pPr>
         <w:pStyle w:val="Bibliography"/>
@@ -7101,7 +7739,7 @@
       <w:r>
         <w:t xml:space="preserve"> </w:t>
       </w:r>
-      <w:hyperlink r:id="rId142">
+      <w:hyperlink r:id="rId159">
         <w:r>
           <w:rPr>
             <w:rStyle w:val="Hyperlink"/>
@@ -7113,8 +7751,8 @@
         <w:t xml:space="preserve">.</w:t>
       </w:r>
     </w:p>
-    <w:bookmarkEnd w:id="143"/>
-    <w:bookmarkStart w:id="145" w:name="ref-Shin2011-kc"/>
+    <w:bookmarkEnd w:id="160"/>
+    <w:bookmarkStart w:id="162" w:name="ref-Shin2011-kc"/>
     <w:p>
       <w:pPr>
         <w:pStyle w:val="Bibliography"/>
@@ -7138,7 +7776,7 @@
       <w:r>
         <w:t xml:space="preserve"> </w:t>
       </w:r>
-      <w:hyperlink r:id="rId144">
+      <w:hyperlink r:id="rId161">
         <w:r>
           <w:rPr>
             <w:rStyle w:val="Hyperlink"/>
@@ -7150,8 +7788,8 @@
         <w:t xml:space="preserve">.</w:t>
       </w:r>
     </w:p>
-    <w:bookmarkEnd w:id="145"/>
-    <w:bookmarkStart w:id="147" w:name="ref-Shin2018-mq"/>
+    <w:bookmarkEnd w:id="162"/>
+    <w:bookmarkStart w:id="164" w:name="ref-Shin2018-mq"/>
     <w:p>
       <w:pPr>
         <w:pStyle w:val="Bibliography"/>
@@ -7190,7 +7828,7 @@
       <w:r>
         <w:t xml:space="preserve"> </w:t>
       </w:r>
-      <w:hyperlink r:id="rId146">
+      <w:hyperlink r:id="rId163">
         <w:r>
           <w:rPr>
             <w:rStyle w:val="Hyperlink"/>
@@ -7202,8 +7840,8 @@
         <w:t xml:space="preserve">.</w:t>
       </w:r>
     </w:p>
-    <w:bookmarkEnd w:id="147"/>
-    <w:bookmarkStart w:id="149" w:name="ref-Singh2012-hj"/>
+    <w:bookmarkEnd w:id="164"/>
+    <w:bookmarkStart w:id="166" w:name="ref-Singh2012-hj"/>
     <w:p>
       <w:pPr>
         <w:pStyle w:val="Bibliography"/>
@@ -7242,7 +7880,7 @@
       <w:r>
         <w:t xml:space="preserve"> </w:t>
       </w:r>
-      <w:hyperlink r:id="rId148">
+      <w:hyperlink r:id="rId165">
         <w:r>
           <w:rPr>
             <w:rStyle w:val="Hyperlink"/>
@@ -7254,8 +7892,8 @@
         <w:t xml:space="preserve">.</w:t>
       </w:r>
     </w:p>
-    <w:bookmarkEnd w:id="149"/>
-    <w:bookmarkStart w:id="151" w:name="ref-Sinpeng2021-hd"/>
+    <w:bookmarkEnd w:id="166"/>
+    <w:bookmarkStart w:id="168" w:name="ref-Sinpeng2021-hd"/>
     <w:p>
       <w:pPr>
         <w:pStyle w:val="Bibliography"/>
@@ -7309,7 +7947,7 @@
       <w:r>
         <w:t xml:space="preserve"> </w:t>
       </w:r>
-      <w:hyperlink r:id="rId150">
+      <w:hyperlink r:id="rId167">
         <w:r>
           <w:rPr>
             <w:rStyle w:val="Hyperlink"/>
@@ -7321,8 +7959,8 @@
         <w:t xml:space="preserve">.</w:t>
       </w:r>
     </w:p>
-    <w:bookmarkEnd w:id="151"/>
-    <w:bookmarkStart w:id="153" w:name="ref-Slater2010-ba"/>
+    <w:bookmarkEnd w:id="168"/>
+    <w:bookmarkStart w:id="170" w:name="ref-Slater2010-ba"/>
     <w:p>
       <w:pPr>
         <w:pStyle w:val="Bibliography"/>
@@ -7346,7 +7984,7 @@
       <w:r>
         <w:t xml:space="preserve"> </w:t>
       </w:r>
-      <w:hyperlink r:id="rId152">
+      <w:hyperlink r:id="rId169">
         <w:r>
           <w:rPr>
             <w:rStyle w:val="Hyperlink"/>
@@ -7358,8 +7996,8 @@
         <w:t xml:space="preserve">.</w:t>
       </w:r>
     </w:p>
-    <w:bookmarkEnd w:id="153"/>
-    <w:bookmarkStart w:id="155" w:name="ref-Svolik2019-zi"/>
+    <w:bookmarkEnd w:id="170"/>
+    <w:bookmarkStart w:id="172" w:name="ref-Svolik2019-zi"/>
     <w:p>
       <w:pPr>
         <w:pStyle w:val="Bibliography"/>
@@ -7398,7 +8036,7 @@
       <w:r>
         <w:t xml:space="preserve"> </w:t>
       </w:r>
-      <w:hyperlink r:id="rId154">
+      <w:hyperlink r:id="rId171">
         <w:r>
           <w:rPr>
             <w:rStyle w:val="Hyperlink"/>
@@ -7410,8 +8048,8 @@
         <w:t xml:space="preserve">.</w:t>
       </w:r>
     </w:p>
-    <w:bookmarkEnd w:id="155"/>
-    <w:bookmarkStart w:id="157" w:name="ref-Taber2006-kx"/>
+    <w:bookmarkEnd w:id="172"/>
+    <w:bookmarkStart w:id="174" w:name="ref-Taber2006-kx"/>
     <w:p>
       <w:pPr>
         <w:pStyle w:val="Bibliography"/>
@@ -7450,7 +8088,7 @@
       <w:r>
         <w:t xml:space="preserve"> </w:t>
       </w:r>
-      <w:hyperlink r:id="rId156">
+      <w:hyperlink r:id="rId173">
         <w:r>
           <w:rPr>
             <w:rStyle w:val="Hyperlink"/>
@@ -7462,8 +8100,8 @@
         <w:t xml:space="preserve">.</w:t>
       </w:r>
     </w:p>
-    <w:bookmarkEnd w:id="157"/>
-    <w:bookmarkStart w:id="159" w:name="ref-Waldner2018-yw"/>
+    <w:bookmarkEnd w:id="174"/>
+    <w:bookmarkStart w:id="176" w:name="ref-Waldner2018-yw"/>
     <w:p>
       <w:pPr>
         <w:pStyle w:val="Bibliography"/>
@@ -7502,7 +8140,7 @@
       <w:r>
         <w:t xml:space="preserve"> </w:t>
       </w:r>
-      <w:hyperlink r:id="rId158">
+      <w:hyperlink r:id="rId175">
         <w:r>
           <w:rPr>
             <w:rStyle w:val="Hyperlink"/>
@@ -7514,8 +8152,8 @@
         <w:t xml:space="preserve">.</w:t>
       </w:r>
     </w:p>
-    <w:bookmarkEnd w:id="159"/>
-    <w:bookmarkStart w:id="161" w:name="ref-Wu2022-hz"/>
+    <w:bookmarkEnd w:id="176"/>
+    <w:bookmarkStart w:id="178" w:name="ref-Wu2022-hz"/>
     <w:p>
       <w:pPr>
         <w:pStyle w:val="Bibliography"/>
@@ -7560,7 +8198,7 @@
       <w:r>
         <w:t xml:space="preserve"> </w:t>
       </w:r>
-      <w:hyperlink r:id="rId160">
+      <w:hyperlink r:id="rId177">
         <w:r>
           <w:rPr>
             <w:rStyle w:val="Hyperlink"/>
@@ -7572,9 +8210,67 @@
         <w:t xml:space="preserve">.</w:t>
       </w:r>
     </w:p>
-    <w:bookmarkEnd w:id="161"/>
-    <w:bookmarkEnd w:id="162"/>
-    <w:bookmarkEnd w:id="163"/>
+    <w:bookmarkEnd w:id="178"/>
+    <w:bookmarkStart w:id="180" w:name="ref-Wuttke2022-wv"/>
+    <w:p>
+      <w:pPr>
+        <w:pStyle w:val="Bibliography"/>
+      </w:pPr>
+      <w:r>
+        <w:t xml:space="preserve">Wuttke, Alexander, Konstantin Gavras, and Harald Schoen. 2022.</w:t>
+      </w:r>
+      <w:r>
+        <w:t xml:space="preserve"> </w:t>
+      </w:r>
+      <w:r>
+        <w:t xml:space="preserve">“</w:t>
+      </w:r>
+      <w:r>
+        <w:t xml:space="preserve">Have Europeans grown tired of democracy? New evidence from eighteen consolidated democracies,</w:t>
+      </w:r>
+      <w:r>
+        <w:t xml:space="preserve"> </w:t>
+      </w:r>
+      <w:r>
+        <w:t xml:space="preserve">1981–2018</w:t>
+      </w:r>
+      <w:r>
+        <w:t xml:space="preserve">.”</w:t>
+      </w:r>
+      <w:r>
+        <w:t xml:space="preserve"> </w:t>
+      </w:r>
+      <w:r>
+        <w:rPr>
+          <w:i/>
+          <w:iCs/>
+        </w:rPr>
+        <w:t xml:space="preserve">British Journal of Political Science</w:t>
+      </w:r>
+      <w:r>
+        <w:t xml:space="preserve"> </w:t>
+      </w:r>
+      <w:r>
+        <w:t xml:space="preserve">52 (January): 416–28.</w:t>
+      </w:r>
+      <w:r>
+        <w:t xml:space="preserve"> </w:t>
+      </w:r>
+      <w:hyperlink r:id="rId179">
+        <w:r>
+          <w:rPr>
+            <w:rStyle w:val="Hyperlink"/>
+          </w:rPr>
+          <w:t xml:space="preserve">https://doi.org/10.1017/s0007123420000149</w:t>
+        </w:r>
+      </w:hyperlink>
+      <w:r>
+        <w:t xml:space="preserve">.</w:t>
+      </w:r>
+    </w:p>
+    <w:bookmarkEnd w:id="180"/>
+    <w:bookmarkEnd w:id="181"/>
+    <w:bookmarkEnd w:id="182"/>
     <w:sectPr>
       <w:footnotePr>
         <w:numRestart w:val="eachSect"/>
@@ -7604,7 +8300,7 @@
       </w:r>
     </w:p>
   </w:footnote>
-  <w:footnote w:id="26">
+  <w:footnote w:id="20">
     <w:p>
       <w:pPr>
         <w:pStyle w:val="FootnoteText"/>
@@ -7638,7 +8334,7 @@
         <w:t xml:space="preserve"> </w:t>
       </w:r>
       <w:r>
-        <w:t xml:space="preserve">The full ABS dataset across the eleven countries and four waves contains approximately 75,000 respondents. Restrictions to those who reported a vote choice, could be classified as winner or loser, and completed at least one item on the democratic conceptions battery yield the analytic sample of 23,464. Appendix B details sample construction and attrition at each stage.</w:t>
+        <w:t xml:space="preserve">The full ABS dataset across the eleven countries and four waves contains approximately 75,000 respondents. Restrictions to those who reported a vote choice, could be classified as winner or loser, and completed at least one item on the democratic conceptions battery yield the analytic sample of 23,464. The largest source of exclusion is non-voting (approximately 15% across country-waves), followed by missing or refused vote-choice responses (8–12% in most countries, rising to 51% in Thailand Wave 4 where military rule suppressed political disclosure). If respondents who conceal their vote choice under authoritarian conditions hold systematically different democratic conceptions—plausibly more procedural, given the circumstances that motivate concealment—then the estimated loser effect in Thailand Wave 4 is conservative. Appendix B details sample construction and attrition at each stage.</w:t>
       </w:r>
     </w:p>
   </w:footnote>

</xml_diff>

<commit_message>
multi-paper: uncommitted work across papers 02, 03b, 04, 05, 06, 09
_data_config: add afro_harmonized_path
paper 02: manuscript edits, remove stale bib files, rerender outputs
paper 03b: R2 reviewer response analyses (cohort moderation, cutpoints,
  factor loadings, weights), remove stale bib, add manuscript txt
paper 04: Sage submission files, reviewer response figures, .tex/.cls
paper 05: submission bib and csl
paper 06: information asymmetry and variance decomposition scripts
paper 09: scaffold Cambodia elite capture paper
</commit_message>
<xml_diff>
--- a/papers/02_meaning_of_democracy_revision/output/manuscript/md-manuscript.docx
+++ b/papers/02_meaning_of_democracy_revision/output/manuscript/md-manuscript.docx
@@ -23,7 +23,7 @@
         <w:pStyle w:val="Date"/>
       </w:pPr>
       <w:r>
-        <w:t xml:space="preserve">2026-03-03</w:t>
+        <w:t xml:space="preserve">2026-03-05</w:t>
       </w:r>
     </w:p>
     <w:p>
@@ -39,7 +39,7 @@
         <w:pStyle w:val="Abstract"/>
       </w:pPr>
       <w:r>
-        <w:t xml:space="preserve">Does democratic erosion reshape not just how citizens evaluate democracy but what they understand it to mean? Electoral losers across eleven Asian democracies consistently gravitate toward liberal-procedural conceptions of democracy—free expression, media freedom, judicial accountability—while winners orient toward substantive outcomes like economic equality and welfare. The gap is small in the aggregate. Context makes it consequential. In Thailand, the procedural-substantive divide between winners and losers widened from near zero to over twenty percentage points across a single decade of democratic erosion culminating in the 2014 coup; in South Korea, where a constitutional crisis of comparable severity was resolved through institutional channels, it barely moved. Drawing on four waves of Asian Barometer Survey data (2005–2022, n = 23,464 respondents with vote choice and democratic conceptions items), multinomial logit models with country and wave fixed effects estimate this winner-loser gap while three mechanism tests distinguish positional updating from stable cultural sorting: the loser effect amplifies where citizens perceive elections as unfair, does not extend to non-procedural domains such as material welfare, and persists after demographic reweighting holds coalition composition constant. If exclusion from political authority—rather than prior disposition—drives how citizens define democracy, the implications for democratic resilience are troubling. Erosion concentrates procedural commitments among those whom the political system has rendered least capable of defending them.</w:t>
+        <w:t xml:space="preserve">Does democratic erosion reshape not just how citizens evaluate democracy but what they understand it to mean? Electoral losers across eleven Asian democracies consistently gravitate toward liberal-procedural conceptions of democracy—free expression, media freedom, judicial accountability—while winners orient toward substantive outcomes like economic equality and welfare. The gap is small in the aggregate. Context makes it consequential. In Thailand, the procedural-substantive divide between winners and losers widened from near zero to over twenty percentage points across a decade spanning the 2014 coup and its aftermath; in South Korea, where a constitutional crisis of comparable severity was resolved through institutional channels, it barely moved. Drawing on three main waves of Asian Barometer Survey data (2010–2022, n = 23,464) plus a structurally distinct Wave 2 baseline (2005–2008), multinomial logit models with country and wave fixed effects estimate this winner-loser gap while three mechanism tests distinguish positional updating from stable cultural sorting: the loser effect amplifies where citizens perceive elections as unfair, does not extend to non-procedural domains such as material welfare, and persists after demographic reweighting holds coalition composition constant. If exclusion from political authority—rather than prior disposition—drives how citizens define democracy, the implications for democratic resilience are troubling. Erosion concentrates procedural commitments among those whom the political system has rendered least capable of defending them.</w:t>
       </w:r>
     </w:p>
     <w:bookmarkStart w:id="21" w:name="introduction"/>
@@ -138,7 +138,7 @@
         <w:pStyle w:val="BodyText"/>
       </w:pPr>
       <w:r>
-        <w:t xml:space="preserve">I estimate multinomial logit models on four waves of Asian Barometer Survey data (2005–2022), with an analytic sample of 23,464 voters across 11 countries. Electoral losers consistently gravitate toward procedural elements of democracy—competitive elections, civil liberties, government accountability—at the expense of substantive outcomes like economic equality or welfare provision. In pooled cross-national estimates, these effects are individually small, on the order of two to four percentage points per item. But the pattern holds across twenty items drawn from five separate survey batteries, and it is the directional consistency—not any single coefficient—that constitutes the substantive finding. More importantly, the effect is not constant. It tracks democratic erosion in Thailand, holds steady amid institutional resilience in South Korea, and sits persistently high in Cambodia, where competitive authoritarianism ensured the stakes of losing were extreme from the start.</w:t>
+        <w:t xml:space="preserve">I estimate multinomial logit models on three main waves of Asian Barometer Survey data (2010–2022), with an analytic sample of 23,464 voters across 11 countries, supplemented by a structurally distinct Wave 2 baseline (2005–2008) that provides an independent replication on a different instrument. Electoral losers consistently gravitate toward procedural elements of democracy—competitive elections, civil liberties, government accountability—at the expense of substantive outcomes like economic equality or welfare provision. In pooled cross-national estimates, these effects are individually small, on the order of two to four percentage points per item. But the pattern holds across twenty items drawn from five separate survey batteries, and it is the directional consistency—not any single coefficient—that constitutes the substantive finding. More importantly, the effect is not constant. It tracks democratic erosion in Thailand, holds steady amid institutional resilience in South Korea, and sits persistently high in Cambodia, where competitive authoritarianism ensured the stakes of losing were extreme from the start.</w:t>
       </w:r>
     </w:p>
     <w:p>
@@ -146,7 +146,7 @@
         <w:pStyle w:val="BodyText"/>
       </w:pPr>
       <w:r>
-        <w:t xml:space="preserve">I interpret this pattern through a framework I call positional updating: citizens excluded from political authority gravitate toward procedural safeguards—the institutional architecture that might restore their access to power. The strongest evidence for this reading comes from the fairness mechanism test—the loser effect amplifies sharply among respondents who perceive elections as unfair, exactly the circumstance in which procedural threat is most palpable. That the amplification does not spill over into material welfare perceptions rules out generalized discontent as the driver. A demographic reweighting exercise, meanwhile, confirms that Thailand’s widening gap is not an artifact of changing coalition composition. None of these tests establishes causation definitively. But taken together, they sit uneasily with accounts that treat democratic conceptions as stable cultural orientations.</w:t>
+        <w:t xml:space="preserve">The pattern is consistent with what I term positional updating: people shut out of political authority start paying closer attention to the procedural guardrails—courts, press freedom, the right to organize—that might eventually restore their access to power. The fairness mechanism test offers the strongest backing for this reading. Among respondents who see elections as unfair, precisely the situation where procedural threat bites hardest, the loser effect sharpens considerably. It does not bleed into material welfare perceptions, which rules out generalized discontent as the driver. A demographic reweighting exercise also confirms that the widening Thai gap is not a compositional artifact. No single test here establishes causation. But collectively, these results sit badly with accounts treating democratic conceptions as stable cultural orientations.</w:t>
       </w:r>
     </w:p>
     <w:p>
@@ -154,7 +154,7 @@
         <w:pStyle w:val="BodyText"/>
       </w:pPr>
       <w:r>
-        <w:t xml:space="preserve">The weight of the evidence points toward a dynamic that complicates recent optimism about democratic resilience. Scholars have asked whether broad public commitment to democracy might function as a check on backsliding</w:t>
+        <w:t xml:space="preserve">What emerges complicates recent optimism about democratic resilience. Can broad public commitment to democracy check backsliding</w:t>
       </w:r>
       <w:r>
         <w:t xml:space="preserve"> </w:t>
@@ -163,7 +163,7 @@
         <w:t xml:space="preserve">(Claassen 2020; Svolik 2019; Graham and Svolik 2020)</w:t>
       </w:r>
       <w:r>
-        <w:t xml:space="preserve">. The results here suggest something closer to the opposite: in the places where erosion cuts deepest, it is the people with the least political leverage who end up caring most about procedural safeguards. Winners who benefit from the prevailing order feel no particular need to define democracy in terms of free elections and civil liberties. Losers do—but they cannot do anything about it. If this dynamic is widespread, then aggregate measures of democratic support may paint an overly reassuring picture, averaging together winners who do not care much about procedures and losers who care deeply but lack the power to defend them.</w:t>
+        <w:t xml:space="preserve">? The evidence here points the other way. Where erosion cuts deepest, the citizens who care most about procedural safeguards are the ones with the least political leverage. Winners coasting on the prevailing order have little reason to define democracy around free elections or civil liberties. Losers have every reason—and no power to act on it. If this dynamic is widespread, aggregate democratic support measures may be painting too rosy a picture: winners indifferent to procedures and losers passionate about them but sidelined, all averaged into a single reassuring number.</w:t>
       </w:r>
     </w:p>
     <w:p>
@@ -171,7 +171,7 @@
         <w:pStyle w:val="BodyText"/>
       </w:pPr>
       <w:r>
-        <w:t xml:space="preserve">The item-level results—visible regardless of modeling approach but preserved by the multinomial specification’s refusal to collapse responses into binary indicators—highlight one further pattern worth flagging. Losers’ procedural orientation centers on the liberal components of democracy—media freedom, free expression, the right to organize—not elections per se. The distinction matters for how we understand the relationship between electoral experience and democratic commitment, and I return to it in the discussion.</w:t>
+        <w:t xml:space="preserve">One further pattern deserves attention, visible regardless of modeling approach but preserved by the multinomial specification’s refusal to collapse responses into binary indicators. What losers gravitate toward is not elections per se but the liberal infrastructure of democracy—media freedom, free expression, the right to organize. That distinction reshapes how we should think about electoral experience and democratic commitment. I return to it in the discussion.</w:t>
       </w:r>
     </w:p>
     <w:bookmarkEnd w:id="21"/>
@@ -206,7 +206,7 @@
         <w:pStyle w:val="FirstParagraph"/>
       </w:pPr>
       <w:r>
-        <w:t xml:space="preserve">A foundational line of comparative research draws a distinction between procedural and substantive visions of democracy. On one side sit definitions anchored in rules and institutions—competitive elections, civil liberties, the rule of law, and the accountability mechanisms that keep officeholders in check</w:t>
+        <w:t xml:space="preserve">Comparative research has long distinguished procedural from substantive visions of democracy. On one side sit definitions anchored in rules and institutions—competitive elections, civil liberties, the rule of law, and the accountability mechanisms that keep officeholders in check</w:t>
       </w:r>
       <w:r>
         <w:t xml:space="preserve"> </w:t>
@@ -215,7 +215,7 @@
         <w:t xml:space="preserve">(Dahl 1977; Schumpeter 2013; Schedler 1998)</w:t>
       </w:r>
       <w:r>
-        <w:t xml:space="preserve">. On the other sit definitions organized around what government actually delivers: reduced inequality, social protection, and responsiveness to popular demands</w:t>
+        <w:t xml:space="preserve">. On the other, definitions organized around government delivery: reduced inequality, social protection, responsiveness to popular demands</w:t>
       </w:r>
       <w:r>
         <w:t xml:space="preserve"> </w:t>
@@ -224,7 +224,7 @@
         <w:t xml:space="preserve">(Diamond 1999; Linz and Stepan 1996)</w:t>
       </w:r>
       <w:r>
-        <w:t xml:space="preserve">. Survey research has repeatedly shown that ordinary people hold both kinds of conceptions, though the balance tips depending on context. Publics in younger democracies lean toward substantive criteria, while citizens in consolidated democracies invoke procedural ones more readily</w:t>
+        <w:t xml:space="preserve">. Ordinary people hold both kinds of conceptions. The balance tips with context—publics in younger democracies lean substantive, those in consolidated democracies lean procedural</w:t>
       </w:r>
       <w:r>
         <w:t xml:space="preserve"> </w:t>
@@ -233,7 +233,7 @@
         <w:t xml:space="preserve">(Dalton and Klingemann 2007; Bratton and Mattes 2001)</w:t>
       </w:r>
       <w:r>
-        <w:t xml:space="preserve">. Across Asia, the picture is especially layered: people blend procedural and substantive elements in ways that vary enormously both across and within countries</w:t>
+        <w:t xml:space="preserve">—but nowhere is the mix as variegated as in Asia, where procedural and substantive elements blend in ways that vary enormously across and within countries</w:t>
       </w:r>
       <w:r>
         <w:t xml:space="preserve"> </w:t>
@@ -242,7 +242,7 @@
         <w:t xml:space="preserve">(Chu et al. 2008; Chu and Huang 2010; Cho 2014; Shin and Kim 2018)</w:t>
       </w:r>
       <w:r>
-        <w:t xml:space="preserve">. Partisan dynamics matter too.</w:t>
+        <w:t xml:space="preserve">. Partisanship complicates things further.</w:t>
       </w:r>
       <w:r>
         <w:t xml:space="preserve"> </w:t>
@@ -254,7 +254,7 @@
         <w:t xml:space="preserve"> </w:t>
       </w:r>
       <w:r>
-        <w:t xml:space="preserve">demonstrate that affective polarization in Taiwan attenuates support for democracy, indicating that political position—not just cultural background—mediates how citizens relate to democratic principles.</w:t>
+        <w:t xml:space="preserve">show that affective polarization in Taiwan erodes support for democracy, evidence that political position—not just cultural inheritance—shapes how citizens relate to democratic principles.</w:t>
       </w:r>
     </w:p>
     <w:p>
@@ -262,7 +262,7 @@
         <w:pStyle w:val="BodyText"/>
       </w:pPr>
       <w:r>
-        <w:t xml:space="preserve">The stakes of this variation are concrete: how citizens define democracy shapes how they evaluate it. If democracy means free elections, competitive voting may suffice for legitimacy; if it means economic equality, procedural compliance without material progress breeds disillusionment. Yet existing scholarship has largely treated conceptions as stable attributes of individuals or societies: cultural inheritances shaped by historical experience, regime type, or modernization trajectories</w:t>
+        <w:t xml:space="preserve">The stakes are concrete. If democracy means free elections, then competitive voting may suffice for legitimacy; if it means economic equality, procedural compliance without material progress breeds disillusionment. How citizens define democracy shapes how they evaluate it. Yet the dominant scholarly treatment has been to view conceptions as stable—cultural inheritances shaped by historical experience, regime type, or modernization trajectories</w:t>
       </w:r>
       <w:r>
         <w:t xml:space="preserve"> </w:t>
@@ -271,7 +271,7 @@
         <w:t xml:space="preserve">(Shin 2011; Inglehart 1997; Canache 2012; Ferrin and Kriesi 2016)</w:t>
       </w:r>
       <w:r>
-        <w:t xml:space="preserve">. What remains largely unexplored is what drives</w:t>
+        <w:t xml:space="preserve">. The question of what drives</w:t>
       </w:r>
       <w:r>
         <w:t xml:space="preserve"> </w:t>
@@ -287,7 +287,7 @@
         <w:t xml:space="preserve"> </w:t>
       </w:r>
       <w:r>
-        <w:t xml:space="preserve">variation in how individual citizens conceptualize democracy.</w:t>
+        <w:t xml:space="preserve">variation in how individual citizens conceptualize democracy has gone largely unasked.</w:t>
       </w:r>
     </w:p>
     <w:bookmarkEnd w:id="22"/>
@@ -464,7 +464,23 @@
         <w:t xml:space="preserve"> </w:t>
       </w:r>
       <w:r>
-        <w:t xml:space="preserve">take up the conceptual question directly, using the same Asian Barometer data employed here to show that the winner-loser gap in liberal democratic values is substantially larger in competitive authoritarian regimes than in democracies—a finding consistent with H2 above. Yet their framework treats regime type as a static cross-sectional moderator; the analysis cannot capture the emergence of conceptual divergence as a country slides from democracy into authoritarianism, which is precisely what the Thai trajectory documents.</w:t>
+        <w:t xml:space="preserve">take up the conceptual question directly. Using the same Asian Barometer data I employ here, they find that the winner-loser gap in liberal democratic values is substantially larger in competitive authoritarian regimes than in democracies—consistent with the expectation—formalized as H2 below—that the gap should be larger where losing carries higher stakes. But their framework holds regime type fixed as a cross-sectional moderator, which means it cannot track the</w:t>
+      </w:r>
+      <w:r>
+        <w:t xml:space="preserve"> </w:t>
+      </w:r>
+      <w:r>
+        <w:rPr>
+          <w:i/>
+          <w:iCs/>
+        </w:rPr>
+        <w:t xml:space="preserve">emergence</w:t>
+      </w:r>
+      <w:r>
+        <w:t xml:space="preserve"> </w:t>
+      </w:r>
+      <w:r>
+        <w:t xml:space="preserve">of conceptual divergence as a country slides from democracy into authoritarianism. That is precisely what the Thai trajectory documents.</w:t>
       </w:r>
       <w:r>
         <w:t xml:space="preserve"> </w:t>
@@ -476,7 +492,7 @@
         <w:t xml:space="preserve"> </w:t>
       </w:r>
       <w:r>
-        <w:t xml:space="preserve">pushes furthest, demonstrating across seventy-four countries that partisans in power hold more illiberal conceptions of democracy while maintaining explicit support for the democratic label, framing the pattern as partisan-motivated reasoning operating universally. The global scope is impressive, but the universality of the account is also its limitation: if conceptual divergence is a general feature of being in power, then it should appear everywhere and always, which sits uneasily with cases like South Korea where the gap remains negligible despite dramatic political upheaval. The positional updating framework advanced here differs from all three in specifying democratic erosion as the conditioning variable—not a single authoritarian victory</w:t>
+        <w:t xml:space="preserve">goes furthest, showing across seventy-four countries that partisans in power hold more illiberal conceptions of democracy while still professing support for the democratic label—a pattern he frames as universal partisan-motivated reasoning. The global scope is impressive. The universality, though, is also the problem: if conceptual divergence is simply what holding power does to people, it should appear everywhere and always. South Korea’s negligible gap despite dramatic political upheaval is hard to explain on those terms. Where my framework departs from all three is in specifying democratic erosion as the conditioning variable. Not a single authoritarian victory</w:t>
       </w:r>
       <w:r>
         <w:t xml:space="preserve"> </w:t>
@@ -485,7 +501,7 @@
         <w:t xml:space="preserve">(Cohen et al. 2023)</w:t>
       </w:r>
       <w:r>
-        <w:t xml:space="preserve">, not a static regime category</w:t>
+        <w:t xml:space="preserve">. Not a static regime category</w:t>
       </w:r>
       <w:r>
         <w:t xml:space="preserve"> </w:t>
@@ -494,7 +510,7 @@
         <w:t xml:space="preserve">(Wu and Wu 2022)</w:t>
       </w:r>
       <w:r>
-        <w:t xml:space="preserve">, and not an unconditional cognitive bias (Bryan), but a dynamic process that raises the stakes of exclusion and thereby amplifies losers’ procedural orientation.</w:t>
+        <w:t xml:space="preserve">. Not an unconditional cognitive bias (Bryan). A dynamic process—one that raises the stakes of exclusion and, in doing so, sharpens losers’ procedural orientation.</w:t>
       </w:r>
     </w:p>
     <w:bookmarkEnd w:id="23"/>
@@ -512,7 +528,7 @@
         <w:pStyle w:val="FirstParagraph"/>
       </w:pPr>
       <w:r>
-        <w:t xml:space="preserve">I propose that electoral status shapes democratic conceptions through what I call positional updating. The core logic turns on asymmetric salience: procedures and outcomes carry different weight depending on whether one is in or out of power. If your party runs the government, your attention naturally drifts toward policy outputs—what is being built, distributed, reformed. If your party lost, you start to care a great deal about the rules of the game: Is there a fair shot at winning next time? Can the press still criticize? Can the courts still push back?</w:t>
+        <w:t xml:space="preserve">I propose that electoral status shapes democratic conceptions through what I call positional updating. The core logic turns on asymmetric salience: procedures and outcomes carry different weight depending on whether one is in or out of power. If your party runs the government, your attention naturally drifts toward policy outputs—what is being built, distributed, reformed. If your party lost, the rules of the game suddenly matter a great deal. Is there a fair shot at winning next time? Can the press still criticize? Can the courts still push back?</w:t>
       </w:r>
     </w:p>
     <w:p>
@@ -520,7 +536,7 @@
         <w:pStyle w:val="BodyText"/>
       </w:pPr>
       <w:r>
-        <w:t xml:space="preserve">Experimental and quasi-experimental evidence reinforces this logic:</w:t>
+        <w:t xml:space="preserve">Experimental and quasi-experimental work supports this logic.</w:t>
       </w:r>
       <w:r>
         <w:t xml:space="preserve"> </w:t>
@@ -532,7 +548,7 @@
         <w:t xml:space="preserve"> </w:t>
       </w:r>
       <w:r>
-        <w:t xml:space="preserve">show that the winner-loser gap in democratic satisfaction forms only once electoral uncertainty resolves, suggesting the operative mechanism is the experience of</w:t>
+        <w:t xml:space="preserve">find that the winner-loser gap in democratic satisfaction forms only after electoral uncertainty resolves—it is the experience of</w:t>
       </w:r>
       <w:r>
         <w:t xml:space="preserve"> </w:t>
@@ -548,7 +564,7 @@
         <w:t xml:space="preserve"> </w:t>
       </w:r>
       <w:r>
-        <w:t xml:space="preserve">one’s status rather than pre-existing dispositional differences. This selective attention runs on motivated cognition</w:t>
+        <w:t xml:space="preserve">one’s status, not pre-existing dispositional differences, that does the work. The underlying cognitive process is motivated cognition</w:t>
       </w:r>
       <w:r>
         <w:t xml:space="preserve"> </w:t>
@@ -557,7 +573,7 @@
         <w:t xml:space="preserve">(Kunda 1990; Taber and Lodge 2006)</w:t>
       </w:r>
       <w:r>
-        <w:t xml:space="preserve">. Citizens do not arrive at their understanding of democracy through disinterested reflection; rather, they attend to and weight those dimensions of democracy that are instrumentally relevant to their political position. Losers orient toward procedural features because procedures are the tools of the excluded—the mechanisms through which power can be contested, checked, and ultimately recaptured. Winners orient toward substantive outcomes because they occupy the position from which outcomes are delivered. In this sense, the mechanism parallels the political conditioning of economic perceptions documented in other domains: just as partisan position shapes whether citizens view the economy favorably</w:t>
+        <w:t xml:space="preserve">. People do not arrive at their understanding of democracy through disinterested reflection. They attend to whichever dimensions of democracy bear most directly on their political position. Losers orient toward procedural features because procedures are the tools of the excluded—the mechanisms through which power can be contested, checked, and ultimately recaptured. Winners orient toward substantive outcomes because they occupy the position from which outcomes are delivered. In this sense, the mechanism parallels the political conditioning of economic perceptions documented in other domains: just as partisan position shapes whether citizens view the economy favorably</w:t>
       </w:r>
       <w:r>
         <w:t xml:space="preserve"> </w:t>
@@ -705,6 +721,51 @@
       </w:pPr>
       <w:r>
         <w:t xml:space="preserve">H3 is the hypothesis that most sharply distinguishes the positional account from its alternatives, and the one whose confirmation would represent the strongest evidence for the theoretical framework advanced here. The within-country trajectories examined below provide the most direct test.</w:t>
+      </w:r>
+    </w:p>
+    <w:p>
+      <w:pPr>
+        <w:pStyle w:val="BodyText"/>
+      </w:pPr>
+      <w:r>
+        <w:t xml:space="preserve">One further distinction follows from the positional logic and bears stating before turning to the evidence. Not all procedural elements of democracy serve losers equally. Constraint-based safeguards—an independent judiciary, media freedom, the right to free expression and association—protect political minorities regardless of who governs. Their value to the excluded is unconditional: courts and a free press constrain incumbents whether or not elections are fair. Selection-based mechanisms—elections themselves, multiparty competition—serve a different function: they are the instruments through which power changes hands. When elections work, losers have every reason to prize them. But when democratic erosion has corrupted the electoral process, the very institution that is supposed to enable turnover becomes suspect. The positional framework therefore predicts not a uniform procedural orientation among losers but a</w:t>
+      </w:r>
+      <w:r>
+        <w:t xml:space="preserve"> </w:t>
+      </w:r>
+      <w:r>
+        <w:rPr>
+          <w:i/>
+          <w:iCs/>
+        </w:rPr>
+        <w:t xml:space="preserve">structured</w:t>
+      </w:r>
+      <w:r>
+        <w:t xml:space="preserve"> </w:t>
+      </w:r>
+      <w:r>
+        <w:t xml:space="preserve">one: losers should gravitate toward protective procedures under all conditions, while their orientation toward participatory procedures should be conditional on whether they perceive the electoral mechanism as intact. This protective-participatory distinction, which has been implicit in theoretical treatments from</w:t>
+      </w:r>
+      <w:r>
+        <w:t xml:space="preserve"> </w:t>
+      </w:r>
+      <w:r>
+        <w:t xml:space="preserve">Dahl (1977)</w:t>
+      </w:r>
+      <w:r>
+        <w:t xml:space="preserve"> </w:t>
+      </w:r>
+      <w:r>
+        <w:t xml:space="preserve">through</w:t>
+      </w:r>
+      <w:r>
+        <w:t xml:space="preserve"> </w:t>
+      </w:r>
+      <w:r>
+        <w:t xml:space="preserve">Schedler (1998)</w:t>
+      </w:r>
+      <w:r>
+        <w:t xml:space="preserve">, generates specific expectations for the fairness interaction test reported below.</w:t>
       </w:r>
     </w:p>
     <w:bookmarkEnd w:id="24"/>
@@ -730,7 +791,7 @@
         <w:pStyle w:val="BodyText"/>
       </w:pPr>
       <w:r>
-        <w:t xml:space="preserve">Two observable implications distinguish the mechanisms—imperfectly but usefully. Elite cueing predicts that the procedural shift should concentrate among strong partisans with high exposure to party messaging. Positional updating, by contrast, predicts a broader effect: even weakly attached losers and supporters of minor parties, who lack a coherent elite signal, should exhibit procedural orientations if the operative mechanism is exclusion from governing authority rather than absorption of party rhetoric. The three-way decomposition in Appendix J provides suggestive evidence on this point. Other Losers—a category that includes minor party supporters and independents with minimal exposure to organized opposition messaging—display procedural orientations comparable to Key Opposition supporters in all three countries where the decomposition is feasible. The loser effect does not appear to be an artifact of opposition party mobilization alone.</w:t>
+        <w:t xml:space="preserve">Two observable implications distinguish the mechanisms—imperfectly but usefully. Elite cueing predicts that the procedural shift should concentrate among strong partisans with high exposure to party messaging. Positional updating, by contrast, predicts a broader effect: even weakly attached losers and supporters of minor parties, who lack a coherent elite signal, should exhibit procedural orientations if the operative mechanism is exclusion from governing authority rather than absorption of party rhetoric. Appendix J’s three-way decomposition speaks to this. Other Losers—minor party supporters and independents with minimal exposure to organized opposition messaging—turn out to hold procedural orientations comparable to Key Opposition supporters in all three countries where the decomposition is feasible. The loser effect does not appear to be an artifact of opposition party mobilization alone.</w:t>
       </w:r>
     </w:p>
     <w:p>
@@ -790,7 +851,7 @@
         <w:pStyle w:val="FirstParagraph"/>
       </w:pPr>
       <w:r>
-        <w:t xml:space="preserve">The analysis draws on the Asian Barometer Survey (ABS), a regional comparative project tracking democratic values across Asia since 2001. The ABS covers countries spanning the full range of regime types</w:t>
+        <w:t xml:space="preserve">I use the Asian Barometer Survey (ABS), a regional comparative project that has tracked democratic values across Asia since 2001. The ABS spans the full range of regime types</w:t>
       </w:r>
       <w:r>
         <w:t xml:space="preserve"> </w:t>
@@ -802,7 +863,7 @@
         <w:t xml:space="preserve"> </w:t>
       </w:r>
       <w:r>
-        <w:t xml:space="preserve">and employs forced-choice items requiring respondents to prioritize among competing democratic values, providing cleaner identification of relative orientations than agree-disagree batteries.</w:t>
+        <w:t xml:space="preserve">and—crucially for present purposes—employs forced-choice items that require respondents to prioritize among competing democratic values, which provides sharper identification of relative orientations than agree-disagree batteries.</w:t>
       </w:r>
     </w:p>
     <w:p>
@@ -971,7 +1032,7 @@
         <w:t xml:space="preserve"> </w:t>
       </w:r>
       <w:r>
-        <w:t xml:space="preserve">of person supporting winners versus losers shifts across waves—could mimic updating even if no individual changes their views. Demographic reweighting tests (Appendix G) address this partially but cannot rule out realignment on unobserved political dimensions. Elite cueing, where parties reframe democratic rhetoric and supporters absorb it, represents a complementary rather than competing mechanism; the Discussion addresses how the observable implications differ.</w:t>
+        <w:t xml:space="preserve">of person supporting winners versus losers shifts across waves—could mimic updating even if no individual changes their views. Demographic reweighting tests (Appendix G) address this partially but cannot rule out realignment on unobserved political dimensions. Elite cueing—parties reframing democratic rhetoric, supporters absorbing it—is better understood as complementary than competing; the Discussion takes up how the observable implications diverge.</w:t>
       </w:r>
     </w:p>
     <w:p>
@@ -979,7 +1040,7 @@
         <w:pStyle w:val="BodyText"/>
       </w:pPr>
       <w:r>
-        <w:t xml:space="preserve">What would falsify the positional interpretation? Panel data showing that individual citizens do not revise their conceptions after switching from winner to loser status—or vice versa—would be the most direct disconfirmation. Short of that, two cross-sectional patterns would weaken the case substantially: if the fairness amplification extended equally to non-procedural domains (suggesting generalized negativity rather than procedural-specific updating), or if Thailand’s trajectory could be accounted for by observable demographic realignment between winning and losing coalitions. The mechanism tests below probe exactly these possibilities.</w:t>
+        <w:t xml:space="preserve">What would falsify the positional interpretation? Most directly, panel data showing that individual citizens do not actually revise their conceptions when they switch from winner to loser status, or vice versa. Short of that, two cross-sectional patterns would seriously weaken the case: if the fairness amplification extended equally to non-procedural domains—suggesting generalized negativity, not procedural-specific updating—or if Thailand’s trajectory turned out to be an artifact of observable demographic realignment between winning and losing coalitions. The mechanism tests that follow probe both possibilities.</w:t>
       </w:r>
     </w:p>
     <w:p>
@@ -987,19 +1048,19 @@
         <w:pStyle w:val="BodyText"/>
       </w:pPr>
       <w:r>
-        <w:t xml:space="preserve">Throughout the analysis, claims are calibrated to the design.</w:t>
-      </w:r>
-      <w:r>
-        <w:t xml:space="preserve"> </w:t>
-      </w:r>
-      <w:r>
-        <w:t xml:space="preserve">“The loser effect widens”</w:t>
-      </w:r>
-      <w:r>
-        <w:t xml:space="preserve"> </w:t>
-      </w:r>
-      <w:r>
-        <w:t xml:space="preserve">refers to the cross-sectional gap measured at different time points, not to individual trajectories.</w:t>
+        <w:t xml:space="preserve">I calibrate all claims to what the design can bear. When I write</w:t>
+      </w:r>
+      <w:r>
+        <w:t xml:space="preserve"> </w:t>
+      </w:r>
+      <w:r>
+        <w:t xml:space="preserve">“the loser effect widens,”</w:t>
+      </w:r>
+      <w:r>
+        <w:t xml:space="preserve"> </w:t>
+      </w:r>
+      <w:r>
+        <w:t xml:space="preserve">I mean the cross-sectional gap measured at different time points, not individual trajectories.</w:t>
       </w:r>
       <w:r>
         <w:t xml:space="preserve"> </w:t>
@@ -1011,7 +1072,7 @@
         <w:t xml:space="preserve"> </w:t>
       </w:r>
       <w:r>
-        <w:t xml:space="preserve">denotes a pattern that the updating framework predicts and that rival accounts do not straightforwardly explain—not a demonstration that updating occurred.</w:t>
+        <w:t xml:space="preserve">means the updating framework predicts the pattern and rival accounts do not straightforwardly explain it—not that updating has been demonstrated.</w:t>
       </w:r>
     </w:p>
     <w:bookmarkEnd w:id="31"/>
@@ -1029,7 +1090,7 @@
         <w:pStyle w:val="FirstParagraph"/>
       </w:pPr>
       <w:r>
-        <w:t xml:space="preserve">Collapsing responses into a binary procedural–substantive indicator would sacrifice the item-level heterogeneity that is central to the analysis. Instead, each item set is modeled as a separate multinomial logistic regression, preserving all four response categories within each set. For Waves 3, 4, and 6, which share a common instrument of four item sets (Sets 1–4), data are pooled across waves and modeled jointly. Each set takes the form:</w:t>
+        <w:t xml:space="preserve">A binary procedural–substantive indicator would throw away the item-level heterogeneity that is central to this analysis. Instead, each item set is modeled as a separate multinomial logistic regression, preserving all four response categories within each set. For Waves 3, 4, and 6, which share a common instrument of four item sets (Sets 1–4), data are pooled across waves and modeled jointly. Each set takes the form:</w:t>
       </w:r>
     </w:p>
     <w:p>
@@ -3045,7 +3106,7 @@
         <w:pStyle w:val="BodyText"/>
       </w:pPr>
       <w:r>
-        <w:t xml:space="preserve">The governance items reveal an additional pattern that complicates any account framing the winner-loser divide as purely procedural versus substantive. Winners are consistently more likely to select governance items emphasizing order and state capacity, with Law and order showing the largest effect (-5.0 pp,</w:t>
+        <w:t xml:space="preserve">The governance items add a wrinkle that complicates any neat procedural-versus-substantive framing. Winners gravitate consistently toward governance items emphasizing order and state capacity, with Law and order showing the largest effect (-5.0 pp,</w:t>
       </w:r>
       <w:r>
         <w:t xml:space="preserve"> </w:t>
@@ -3059,7 +3120,23 @@
         <w:t xml:space="preserve"> </w:t>
       </w:r>
       <w:r>
-        <w:t xml:space="preserve">&lt; 0.001)—the single largest coefficient in Table 1, exceeding even media freedom. Winners do not merely favor substantive outcomes; they favor a vision of democracy organized around stability, effective administration, and the suppression of disorder. This parallels</w:t>
+        <w:t xml:space="preserve">&lt; 0.001)—the single largest coefficient in Table 1, bigger than even media freedom. What winners favor is not just substantive outcomes in the abstract but a particular</w:t>
+      </w:r>
+      <w:r>
+        <w:t xml:space="preserve"> </w:t>
+      </w:r>
+      <w:r>
+        <w:rPr>
+          <w:i/>
+          <w:iCs/>
+        </w:rPr>
+        <w:t xml:space="preserve">vision</w:t>
+      </w:r>
+      <w:r>
+        <w:t xml:space="preserve"> </w:t>
+      </w:r>
+      <w:r>
+        <w:t xml:space="preserve">of democracy: stability, effective administration, the suppression of disorder.</w:t>
       </w:r>
       <w:r>
         <w:t xml:space="preserve"> </w:t>
@@ -3068,7 +3145,10 @@
         <w:t xml:space="preserve">Eck and Paulis (2025)</w:t>
       </w:r>
       <w:r>
-        <w:t xml:space="preserve">’s finding that electoral winners are less supportive of referendums and other institutional alternatives that might disrupt the status quo, especially under conditions of affective polarization. Losers, conversely, do not merely favor procedures; they favor the procedures of</w:t>
+        <w:t xml:space="preserve"> </w:t>
+      </w:r>
+      <w:r>
+        <w:t xml:space="preserve">report something parallel—electoral winners are less supportive of referendums and other institutional alternatives that might upset the status quo, especially where affective polarization runs high. And losers do not merely favor procedures in general. They favor the procedures of</w:t>
       </w:r>
       <w:r>
         <w:t xml:space="preserve"> </w:t>
@@ -3081,7 +3161,7 @@
         <w:t xml:space="preserve">contestation</w:t>
       </w:r>
       <w:r>
-        <w:t xml:space="preserve">—the institutional infrastructure that enables challenge to incumbent power. The procedural-substantive gap computation used throughout this article, which sets governance items aside, is therefore conservative: it measures the dimension most directly predicted by the theory while leaving aside a pattern that reinforces the broader finding from a different angle. The order-versus-contestation tension is explored further in the discussion.</w:t>
+        <w:t xml:space="preserve">—the institutional machinery that enables challenges to incumbent power. The procedural-substantive gap computation I use throughout, which sets governance items aside, is therefore conservative. It captures the dimension most directly predicted by the theory while leaving aside a pattern that reinforces the broader finding from a different angle. The order-versus-contestation tension is explored further in the discussion.</w:t>
       </w:r>
     </w:p>
     <w:bookmarkStart w:id="34" w:name="a-note-on-effect-sizes"/>
@@ -3098,7 +3178,7 @@
         <w:pStyle w:val="FirstParagraph"/>
       </w:pPr>
       <w:r>
-        <w:t xml:space="preserve">Individual item AMEs are small—typically one to three percentage points—which invites the objection that the loser effect is statistically detectable but substantively trivial. Two considerations complicate that conclusion. First, these are average marginal effects from a multinomial outcome with twenty items; probability mass that shifts toward one item must come from others. The consistency of the pattern—9 of 10 procedural items positive, 6 of 6 substantive items negative—matters more than any single coefficient. Under the null hypothesis that loser status is unrelated to democratic conceptions, each item has a 50% probability of showing a positive (or negative) loser effect. The observed directional consistency (15 of 16 items in the predicted direction) yields</w:t>
+        <w:t xml:space="preserve">Individual item AMEs are small—typically one to three percentage points—which invites the objection that the loser effect is statistically detectable but substantively trivial. Two considerations complicate that conclusion. First, these are average marginal effects from a multinomial outcome with twenty items; probability mass that shifts toward one item must come from others. The consistency of the pattern—9 of 10 procedural items positive, 6 of 6 substantive items negative—matters more than any single coefficient. Under the null hypothesis that loser status is unrelated to democratic conceptions, each item has a 50% probability of showing a positive (or negative) loser effect. Across the sixteen Sets 1–4 items where procedural and substantive predictions are unambiguous, the observed directional consistency (15 of 16 items in the predicted direction) yields</w:t>
       </w:r>
       <w:r>
         <w:t xml:space="preserve"> </w:t>
@@ -3148,7 +3228,7 @@
         <w:pStyle w:val="FirstParagraph"/>
       </w:pPr>
       <w:r>
-        <w:t xml:space="preserve">The pooled estimates establish that losers systematically favor procedural conceptions, but the theory predicts more than a cross-sectional association: it predicts that the gap should respond to changing political conditions within countries over time (H2 and H3). Figure 1 plots the procedural-substantive gap for each country across survey waves, where a positive value indicates that losers disproportionately favor procedural conceptions.</w:t>
+        <w:t xml:space="preserve">So losers lean procedural in the pooled data. But the theory predicts more than a cross-sectional association—it predicts that the gap should move with political conditions within countries over time (H2 and H3). Figure 1 plots the procedural-substantive gap by country across survey waves; positive values mean losers disproportionately favor procedural conceptions.</w:t>
       </w:r>
     </w:p>
     <w:tbl>
@@ -3976,7 +4056,7 @@
         <w:pStyle w:val="FirstParagraph"/>
       </w:pPr>
       <w:r>
-        <w:t xml:space="preserve">The twenty-item pattern and the divergent country trajectories raise the question of mechanism. Are losers actually revising what democracy means to them in response to the political stakes they face? Or are we simply observing the fact that different sorts of people end up on the winning and losing sides? Three tests, each targeting a different alternative explanation, help adjudicate.</w:t>
+        <w:t xml:space="preserve">The twenty-item pattern and the divergent country trajectories bring the mechanism question into sharp focus. Are losers actually rethinking what democracy means to them because the political stakes have shifted? Or is this simply the artifact of different sorts of people ending up on opposite sides? I use three tests, each aimed at a different alternative explanation.</w:t>
       </w:r>
     </w:p>
     <w:bookmarkStart w:id="45" w:name="test-1-fairness-amplification"/>
@@ -3993,7 +4073,7 @@
         <w:pStyle w:val="FirstParagraph"/>
       </w:pPr>
       <w:r>
-        <w:t xml:space="preserve">If conceptions reflect positional updating, the loser effect should amplify when procedural threat is salient, that is, among losers who perceive elections as unfair. If instead it reflects stable normative commitments, it should appear regardless of fairness perceptions.</w:t>
+        <w:t xml:space="preserve">If conceptions reflect positional updating, the loser effect should amplify when procedural threat is salient, that is, among losers who perceive elections as unfair. Stable normative commitments, by contrast, should produce the same pattern regardless of fairness perceptions.</w:t>
       </w:r>
     </w:p>
     <w:p>
@@ -4001,87 +4081,7 @@
         <w:pStyle w:val="BodyText"/>
       </w:pPr>
       <w:r>
-        <w:t xml:space="preserve">However, not all procedural conceptions carry the same relationship to electoral status, and specifying this structure</w:t>
-      </w:r>
-      <w:r>
-        <w:t xml:space="preserve"> </w:t>
-      </w:r>
-      <w:r>
-        <w:rPr>
-          <w:i/>
-          <w:iCs/>
-        </w:rPr>
-        <w:t xml:space="preserve">ex ante</w:t>
-      </w:r>
-      <w:r>
-        <w:t xml:space="preserve"> </w:t>
-      </w:r>
-      <w:r>
-        <w:t xml:space="preserve">disciplines the interpretation of the interaction results. A distinction can be drawn between two classes of procedural items. The first encompasses</w:t>
-      </w:r>
-      <w:r>
-        <w:t xml:space="preserve"> </w:t>
-      </w:r>
-      <w:r>
-        <w:rPr>
-          <w:i/>
-          <w:iCs/>
-        </w:rPr>
-        <w:t xml:space="preserve">protective</w:t>
-      </w:r>
-      <w:r>
-        <w:t xml:space="preserve"> </w:t>
-      </w:r>
-      <w:r>
-        <w:t xml:space="preserve">procedural elements: institutional safeguards that constrain incumbent power and protect political minorities regardless of who governs, including an independent judiciary, media freedom, and free expression. For electoral losers, these protections are unambiguously valuable—they represent the institutional infrastructure that prevents winners from converting temporary electoral mandates into permanent domination. If losers are updating their conceptions in response to positional threat, we should expect the loser effect on protective items to remain positive regardless of whether respondents think elections are fair—courts and a free press are useful to the excluded either way. But what the positional framework predicts for</w:t>
-      </w:r>
-      <w:r>
-        <w:t xml:space="preserve"> </w:t>
-      </w:r>
-      <w:r>
-        <w:rPr>
-          <w:i/>
-          <w:iCs/>
-        </w:rPr>
-        <w:t xml:space="preserve">participatory</w:t>
-      </w:r>
-      <w:r>
-        <w:t xml:space="preserve"> </w:t>
-      </w:r>
-      <w:r>
-        <w:t xml:space="preserve">items is less obvious and more interesting.</w:t>
-      </w:r>
-    </w:p>
-    <w:p>
-      <w:pPr>
-        <w:pStyle w:val="BodyText"/>
-      </w:pPr>
-      <w:r>
-        <w:t xml:space="preserve">In a well-functioning democracy, losers have good reason to prize elections: elections are how you get back into power. But when democratic erosion has corrupted the electoral process itself, losers face a bind. The institution that is supposed to enable turnover has, in their view, been rigged. Under those circumstances, losers may start to discount elections</w:t>
-      </w:r>
-      <w:r>
-        <w:t xml:space="preserve"> </w:t>
-      </w:r>
-      <w:r>
-        <w:rPr>
-          <w:i/>
-          <w:iCs/>
-        </w:rPr>
-        <w:t xml:space="preserve">specifically</w:t>
-      </w:r>
-      <w:r>
-        <w:t xml:space="preserve"> </w:t>
-      </w:r>
-      <w:r>
-        <w:t xml:space="preserve">while doubling down on non-electoral safeguards. The prediction is not a generic amplification of all procedural items among disaffected losers; it is a structured pattern where protective items strengthen and participatory items weaken or reverse.</w:t>
-      </w:r>
-    </w:p>
-    <w:p>
-      <w:pPr>
-        <w:pStyle w:val="BodyText"/>
-      </w:pPr>
-      <w:r>
-        <w:t xml:space="preserve">This yields a set of conditional expectations: (a) protective procedural items should show a positive loser effect under both fairness conditions, strengthening where elections are seen as manipulated; (b) participatory procedural items should show a positive loser effect where elections are seen as fair; and (c) participatory items should attenuate or flip negative where losers believe the electoral process itself has been compromised.</w:t>
+        <w:t xml:space="preserve">The protective-participatory distinction derived in the theory section generates specific predictions for this test. Recall the logic: constraint-based safeguards (courts, media, expression) protect losers regardless of electoral integrity, while selection-based mechanisms (elections, multiparty competition) are useful only insofar as losers trust the electoral process. This yields a set of conditional expectations: (a) protective procedural items should show a positive loser effect under both fairness conditions, strengthening where elections are seen as manipulated; (b) participatory procedural items should show a positive loser effect where elections are seen as fair; and (c) participatory items should attenuate or flip negative where losers believe the electoral process itself has been compromised.</w:t>
       </w:r>
     </w:p>
     <w:tbl>
@@ -4387,7 +4387,7 @@
         <w:t xml:space="preserve"> </w:t>
       </w:r>
       <w:r>
-        <w:t xml:space="preserve">= 23,124), indicating substantial overlap rather than collinearity. The interaction could reflect genuine updating in response to perceived procedural threat, or it could reflect motivated reasoning: losers who feel cheated may gravitate toward whichever procedural vocabulary best validates their grievance. The protective-participatory divergence constrains the set of plausible accounts—generalized negativity would not produce domain-specific patterns—but does not eliminate motivated reasoning as a contributor, since motivated cognition can itself be domain-specific. The strongest version of the positional claim is therefore not that motivated reasoning plays no role, but that the</w:t>
+        <w:t xml:space="preserve">= 23,124), indicating substantial overlap rather than collinearity. The interaction could reflect genuine updating in response to perceived procedural threat, or it could reflect motivated reasoning: losers who feel cheated may gravitate toward whichever procedural vocabulary best validates their grievance. The protective-participatory divergence constrains the set of plausible accounts—generalized negativity would not produce domain-specific patterns—but does not eliminate motivated reasoning as a contributor, since motivated cognition can itself be domain-specific. The strongest version of the positional claim, then, is not that motivated reasoning plays no role. It is that the</w:t>
       </w:r>
       <w:r>
         <w:t xml:space="preserve"> </w:t>
@@ -4403,7 +4403,7 @@
         <w:t xml:space="preserve"> </w:t>
       </w:r>
       <w:r>
-        <w:t xml:space="preserve">of the domain-specific pattern—protective items up, participatory items down, material welfare flat—is more parsimoniously explained by differential institutional salience than by a grievance account that would need to explain why losers’ resentment selectively targets elections but not courts. An alternative specification would treat perceived fairness as a mediator rather than a moderator—electoral loss shaping fairness perceptions, which in turn shape conceptions. This causal ordering is plausible but cannot be tested with cross-sectional data; the two framings yield complementary rather than competing insights. Because this test alone cannot definitively distinguish the mechanisms, two additional tests are needed.</w:t>
+        <w:t xml:space="preserve">of what we observe—protective items up, participatory items down, material welfare flat—maps more cleanly onto differential institutional salience than onto a grievance story, which would need to explain why losers’ resentment zeroes in on elections but leaves courts alone. One could also flip the specification and treat perceived fairness as a mediator rather than a moderator—electoral loss shaping fairness perceptions, which then shape conceptions. That ordering is plausible; cross-sectional data cannot adjudicate between them. The two framings are complementary, not competing. Because this test alone cannot definitively distinguish the mechanisms, two additional tests are needed.</w:t>
       </w:r>
     </w:p>
     <w:bookmarkEnd w:id="45"/>
@@ -4500,7 +4500,7 @@
         <w:pStyle w:val="FirstParagraph"/>
       </w:pPr>
       <w:r>
-        <w:t xml:space="preserve">Thailand’s dramatic trajectory—from near-zero to over 20 percentage points—invites a compositional objection. Perhaps opposition coalitions reshuffled over the decade, pulling in more urban and educated voters who were already predisposed toward procedural definitions. If so, the gap could widen without anyone actually changing their mind.</w:t>
+        <w:t xml:space="preserve">Thailand’s dramatic trajectory—near-zero to over 20 percentage points—invites a compositional objection. Maybe opposition coalitions reshuffled over the decade, drawing in more urban, more educated voters already inclined toward procedural definitions. If so, the gap could widen without anyone actually changing their mind.</w:t>
       </w:r>
     </w:p>
     <w:p>
@@ -4508,7 +4508,7 @@
         <w:pStyle w:val="BodyText"/>
       </w:pPr>
       <w:r>
-        <w:t xml:space="preserve">To address this, I reweight each Thailand wave to match the Wave 3 demographic profile along age, gender, education, and urban residence, creating a counterfactual trajectory that holds demographics constant. The exercise barely moves the needle. Loser effects shift by an average of 0.83 percentage points (the largest shift is 1.75pp, for Services (Set 2)). Only 1 of 16 item-level effects changes sign, and the item in question (Courts (Set 4): +0.4pp → -0.8pp) flips between values that are both essentially zero. Every substantively meaningful effect keeps its direction and its size.</w:t>
+        <w:t xml:space="preserve">I address this by reweighting each Thailand wave to match the Wave 3 demographic profile on age, gender, education, and urban residence, creating a counterfactual trajectory that holds demographics constant. It barely matters. Loser effects shift by an average of 0.83 percentage points (the largest shift is 1.75pp, for Services (Set 2)). Only 1 of 16 item-level effects changes sign, and that item (Courts (Set 4): +0.4pp → -0.8pp) flips between values both essentially zero. Every substantively meaningful effect keeps its direction and size.</w:t>
       </w:r>
     </w:p>
     <w:p>
@@ -4516,7 +4516,7 @@
         <w:pStyle w:val="BodyText"/>
       </w:pPr>
       <w:r>
-        <w:t xml:space="preserve">The trajectory, then, is not about who ended up in the winner and loser camps—it is about how people in those camps differ in how they conceptualize democracy, with that divergence growing across waves. The reweighting covers age, gender, education, and urban residence—the observable dimensions that most powerfully structure Thai political alignments</w:t>
+        <w:t xml:space="preserve">What the trajectory tracks, then, is not who ended up in the winner and loser camps but how people in those camps differ in how they think about democracy—and how that divergence grew across waves. Age, gender, education, and urban residence are the observable dimensions that most powerfully structure Thai political alignments</w:t>
       </w:r>
       <w:r>
         <w:t xml:space="preserve"> </w:t>
@@ -4525,7 +4525,7 @@
         <w:t xml:space="preserve">(Ockey 2004; McCargo 2019)</w:t>
       </w:r>
       <w:r>
-        <w:t xml:space="preserve">—and controlling for them changes almost nothing. Realignment along unmeasured dimensions (partisan ideology, media consumption, political sophistication) remains a possible confound that these data cannot rule out. Adding political interest as a control changes the mean procedural average marginal effect by 0.1 percentage point, indicating the trajectory is not driven by differential political engagement across coalitions.</w:t>
+        <w:t xml:space="preserve">. Controlling for them changes almost nothing. Realignment along unmeasured dimensions—partisan ideology, media consumption, political sophistication—remains a possible confound these data cannot rule out. Adding political interest as a control shifts the mean procedural average marginal effect by 0.1 percentage point, so differential political engagement across coalitions is not driving the trajectory either.</w:t>
       </w:r>
     </w:p>
     <w:bookmarkEnd w:id="47"/>
@@ -4543,7 +4543,7 @@
         <w:pStyle w:val="FirstParagraph"/>
       </w:pPr>
       <w:r>
-        <w:t xml:space="preserve">No single test is definitive. But the three converge on the positional interpretation in a way that would be hard to orchestrate from any of the rival accounts. The fairness amplification shows that the loser effect responds to perceived threat—5–8 percentage points for liberal items among those perceiving unfair elections, compared with 2–3 among those perceiving fairness. That the placebo test finds no such amplification for basic necessities (1.1pp, p = 0.564) rules out generalized discontent as the driver. And Thailand’s demographic story holds up under reweighting: pinning age, education, gender, and urban residence to their Wave 3 distributions shifts the loser effects by 0.8pp on average, with a single near-zero sign flip.</w:t>
+        <w:t xml:space="preserve">No single test is definitive. But the three converge on the positional interpretation, and it would be hard to orchestrate that convergence from any of the rival accounts. The fairness amplification shows that the loser effect responds to perceived threat—5–8 percentage points for liberal items among those perceiving unfair elections, compared with 2–3 among those perceiving fairness. That the placebo test finds no such amplification for basic necessities (1.1pp, p = 0.564) rules out generalized discontent as the driver. And Thailand’s demographic story holds up under reweighting: pinning age, education, gender, and urban residence to their Wave 3 distributions shifts the loser effects by 0.8pp on average, with a single near-zero sign flip.</w:t>
       </w:r>
     </w:p>
     <w:p>
@@ -4551,7 +4551,7 @@
         <w:pStyle w:val="BodyText"/>
       </w:pPr>
       <w:r>
-        <w:t xml:space="preserve">A supplementary within-loser analysis sharpens the mechanism interpretation. Restricting the sample to electoral losers and examining variation in perceived electoral fairness, protective procedural items—media freedom, free expression, legislative oversight, protest freedom—show a mean unfairness amplification of approximately 2.2 percentage points among the 30.8% of losers who perceive elections as unfair, while participatory items (free elections, party competition) show a smaller and less consistent pattern. The domain structure—concentrated on liberal protections rather than elections or material welfare—is consistent with perceived threat activating specific institutional commitments rather than generalized negativity.</w:t>
+        <w:t xml:space="preserve">A supplementary within-loser analysis sharpens the picture. When I restrict the sample to electoral losers and examine variation in perceived electoral fairness, protective procedural items—media freedom, free expression, legislative oversight, protest freedom—show a mean unfairness amplification of roughly 2.2 percentage points among the 30.8% of losers who perceive elections as unfair. Participatory items (free elections, party competition) show a smaller and less consistent pattern. The domain structure—concentrated on liberal protections, not elections or material welfare—fits perceived threat activating specific institutional commitments rather than generalized negativity.</w:t>
       </w:r>
     </w:p>
     <w:p>
@@ -4559,7 +4559,7 @@
         <w:pStyle w:val="BodyText"/>
       </w:pPr>
       <w:r>
-        <w:t xml:space="preserve">These tests do not amount to proof that individuals changed their minds. But the patterns are hard to square with the idea that democratic conceptions are stable cultural inheritances, hardwired personality traits, or byproducts of coalition shuffling. The evidence at hand, taken as a whole, fits the positional account better than any of the alternatives considered: the patterns are systematically organized in ways that stable cultural accounts do not predict and that compositional change does not explain.</w:t>
+        <w:t xml:space="preserve">None of this amounts to proof that individuals changed their minds. But the patterns are hard to reconcile with democratic conceptions as stable cultural inheritances, hardwired personality traits, or byproducts of coalition shuffling. Taken together, the evidence fits the positional account better than any alternative I have considered. The patterns are organized in ways that stable cultural accounts do not predict and compositional change does not explain.</w:t>
       </w:r>
     </w:p>
     <w:bookmarkEnd w:id="48"/>
@@ -4714,7 +4714,7 @@
         <w:pStyle w:val="BodyText"/>
       </w:pPr>
       <w:r>
-        <w:t xml:space="preserve">Non-voters provide another angle on the voter-restriction choice. Their procedural-substantive gap (14.3 pp) resembles that of winners (13.9 pp) rather than losers (17.3 pp), confirming that restricting the sample to voters does not inflate the estimated loser effect (Appendix H). A three-way decomposition distinguishing key opposition supporters from other losers pushes on the mechanism from a different direction: both subgroups display comparable procedural orientations across the three countries where decomposition was feasible (Appendix J). If the effect were driven by partisan strategic signaling—opposition leaders rallying their base around procedural rhetoric—it should concentrate among principal opposition supporters. That it does not is more consistent with the exclusion-based mechanism, where distance from state authority rather than organizational affiliation drives procedural attention.</w:t>
+        <w:t xml:space="preserve">Non-voters provide another angle on the voter-restriction choice. Computing the unconditional difference between procedural and substantive item selection—without conditioning on winner-loser status, which is undefined for non-voters—yields a gap of 14.3 pp, close to the winner mean (13.9 pp) and well below the loser mean (17.3 pp). This confirms that restricting the sample to voters does not inflate the estimated loser effect (Appendix H). A three-way decomposition distinguishing key opposition supporters from other losers pushes on the mechanism from a different direction: both subgroups display comparable procedural orientations across the three countries where decomposition was feasible (Appendix J). If the effect were driven by partisan strategic signaling—opposition leaders rallying their base around procedural rhetoric—it should concentrate among principal opposition supporters. That it does not is more consistent with the exclusion-based mechanism, where distance from state authority rather than organizational affiliation drives procedural attention.</w:t>
       </w:r>
     </w:p>
     <w:p>
@@ -4722,7 +4722,7 @@
         <w:pStyle w:val="BodyText"/>
       </w:pPr>
       <w:r>
-        <w:t xml:space="preserve">Party loyalties in Thailand’s color-coded politics are notably stable, and the gap’s tracking of documented political events, rather than gradual demographic shifts, favors the positional interpretation over compositional change.</w:t>
+        <w:t xml:space="preserve">Thailand’s color-coded party loyalties are notably stable over this period. That the gap tracks documented political events—coups, judicial dissolutions, elections—rather than gradual demographic shifts weighs in favor of the positional interpretation over compositional change.</w:t>
       </w:r>
     </w:p>
     <w:bookmarkEnd w:id="52"/>
@@ -4740,7 +4740,7 @@
         <w:pStyle w:val="FirstParagraph"/>
       </w:pPr>
       <w:r>
-        <w:t xml:space="preserve">The central finding of this article is not simply that electoral losers prefer procedural democracy, though they do, consistently, across twenty items and eleven countries. The more consequential finding is that this association varies systematically with political context. Thailand’s trajectory from near-zero to over twenty percentage points across a single decade of democratic erosion is difficult to reconcile with accounts treating democratic conceptions as stable cultural inheritances or fixed psychological dispositions</w:t>
+        <w:t xml:space="preserve">What this article documents is not simply that electoral losers prefer procedural democracy. They do—consistently, across twenty items and eleven countries. The more consequential finding is that the association varies with political context, and it does so in patterned ways. Thailand’s trajectory from near-zero to over twenty percentage points across a single decade of democratic erosion is hard to square with accounts treating democratic conceptions as stable cultural inheritances or fixed psychological dispositions</w:t>
       </w:r>
       <w:r>
         <w:t xml:space="preserve"> </w:t>
@@ -4749,7 +4749,7 @@
         <w:t xml:space="preserve">(Norris 2011; Inglehart 1997)</w:t>
       </w:r>
       <w:r>
-        <w:t xml:space="preserve">. Nor is it plausibly compositional: Thailand’s color-coded partisan alignments remained remarkably stable even as the parties themselves were repeatedly dissolved and reconstituted</w:t>
+        <w:t xml:space="preserve">. A compositional story does not hold up either: Thailand’s color-coded partisan alignments remained remarkably stable even as the parties themselves were repeatedly dissolved and reconstituted</w:t>
       </w:r>
       <w:r>
         <w:t xml:space="preserve"> </w:t>
@@ -4758,7 +4758,7 @@
         <w:t xml:space="preserve">(Sinpeng 2021; McCargo 2019)</w:t>
       </w:r>
       <w:r>
-        <w:t xml:space="preserve">. The geographic concentration of pro-Thaksin support in the north and northeast was effectively unchanged across the three elections bracketing this period</w:t>
+        <w:t xml:space="preserve">. Pro-Thaksin support in the north and northeast was effectively unchanged across the three elections bracketing this period</w:t>
       </w:r>
       <w:r>
         <w:t xml:space="preserve"> </w:t>
@@ -4767,7 +4767,7 @@
         <w:t xml:space="preserve">(Ricks 2019; McCargo 2019)</w:t>
       </w:r>
       <w:r>
-        <w:t xml:space="preserve">, and the demographic reweighting exercise (Appendix G)—which holds the age, education, gender, and urban-rural profile of winning and losing coalitions constant at their Wave 3 distributions—shifts the loser effects by less than one percentage point on average. The cumulative evidence—fairness amplification, domain specificity, and compositional stability—tilts toward the positional interpretation.</w:t>
+        <w:t xml:space="preserve">, and the demographic reweighting exercise (Appendix G)—which pins the age, education, gender, and urban-rural profile of winning and losing coalitions to their Wave 3 distributions—shifts the loser effects by less than one percentage point on average. Fairness amplification, domain specificity, compositional stability: the cumulative evidence tilts toward the positional interpretation.</w:t>
       </w:r>
     </w:p>
     <w:p>
@@ -4775,7 +4775,7 @@
         <w:pStyle w:val="BodyText"/>
       </w:pPr>
       <w:r>
-        <w:t xml:space="preserve">The within-country dynamics—especially the Thailand–South Korea contrast—are more readily explained by the positional account than by stable sorting on unobservable characteristics, though repeated cross-sections cannot pin down individual-level attitude change and a definitive test awaits panel data. The strongest alternative is not cultural determinism but ideological sorting: the possibility that Thai winners and losers diverged on procedural values because the coalitions themselves were reshuffled along ideological lines that the demographic reweighting does not capture—media consumption, political sophistication, urban-rural identity beyond the binary control variable. For this sorting account to explain the full pattern, ideological or dispositional differences between winning and losing coalitions would need to have widened dramatically in Thailand during this period while staying flat in South Korea, Cambodia, and nearly everywhere else. No independent evidence supports that kind of asymmetric realignment, but the possibility cannot be ruled out with the available data. The conditional character of the effect also helps distinguish positional updating from the motivated reasoning account advanced by</w:t>
+        <w:t xml:space="preserve">The within-country dynamics—the Thailand–South Korea contrast above all—fit the positional account more naturally than stable sorting on unobservables, though repeated cross-sections cannot track individual-level attitude change and a definitive test awaits panel data. The strongest rival is not cultural determinism but ideological sorting. Perhaps Thai winners and losers diverged on procedural values because the coalitions themselves reshuffled along ideological lines the demographic reweighting cannot capture—media consumption, political sophistication, the texture of urban-rural identity beyond a binary control variable. But for sorting to explain the full pattern, ideological or dispositional differences between winning and losing coalitions would need to have widened dramatically in Thailand while staying flat in South Korea, Cambodia, and nearly everywhere else. I know of no independent evidence for that kind of asymmetric realignment. The possibility remains open, but the data do not support it. The conditional character of the effect also separates positional updating from the motivated reasoning account in</w:t>
       </w:r>
       <w:r>
         <w:t xml:space="preserve"> </w:t>
@@ -4784,7 +4784,7 @@
         <w:t xml:space="preserve">Bryan (2023)</w:t>
       </w:r>
       <w:r>
-        <w:t xml:space="preserve">, who treats conceptual divergence as an automatic consequence of holding power. If the mechanism were purely cognitive—partisans reflexively molding democratic meaning to fit their position—then South Korea’s crisis should have produced comparable divergence, since both cases involved sharp partisan conflict over institutional legitimacy. That it did not suggests the mechanism responds to the institutional stakes of exclusion rather than to partisan status per se.</w:t>
+        <w:t xml:space="preserve">, who treats conceptual divergence as an automatic consequence of holding power. If the mechanism were purely cognitive—partisans reflexively reshaping what democracy means to match their position—South Korea’s crisis should have produced comparable divergence. Both cases involved sharp partisan conflict over institutional legitimacy. That the gap barely moved in South Korea points to the institutional stakes of exclusion, not partisan status per se, as the operative variable.</w:t>
       </w:r>
     </w:p>
     <w:p>
@@ -4792,6 +4792,79 @@
         <w:pStyle w:val="BodyText"/>
       </w:pPr>
       <w:r>
+        <w:t xml:space="preserve">A related concern is whether</w:t>
+      </w:r>
+      <w:r>
+        <w:t xml:space="preserve"> </w:t>
+      </w:r>
+      <w:r>
+        <w:t xml:space="preserve">“winning”</w:t>
+      </w:r>
+      <w:r>
+        <w:t xml:space="preserve"> </w:t>
+      </w:r>
+      <w:r>
+        <w:t xml:space="preserve">means the same thing across Thai waves. In Wave 3, winners are Democrat Party voters governing through a parliamentary coalition. In Wave 6, winners are supporters of the military-aligned Palang Pracharath Party governing under a constitution designed to entrench military influence. If the kind of person who identifies as a winner shifted from moderate urban professionals to conservative royalist-military supporters, the widening gap could partly reflect this realignment rather than positional updating—even if the demographic profile looks stable on the four observable dimensions. The ABS does not include ideological self-placement, which limits what can be done with the available data. But the geographic and social-structural stability of Thailand’s color-coded alignments documented by</w:t>
+      </w:r>
+      <w:r>
+        <w:t xml:space="preserve"> </w:t>
+      </w:r>
+      <w:r>
+        <w:t xml:space="preserve">McCargo (2019)</w:t>
+      </w:r>
+      <w:r>
+        <w:t xml:space="preserve"> </w:t>
+      </w:r>
+      <w:r>
+        <w:t xml:space="preserve">and</w:t>
+      </w:r>
+      <w:r>
+        <w:t xml:space="preserve"> </w:t>
+      </w:r>
+      <w:r>
+        <w:t xml:space="preserve">Sinpeng (2021)</w:t>
+      </w:r>
+      <w:r>
+        <w:t xml:space="preserve">—the same northern and northeastern base backing Thaksin-aligned parties across repeated dissolutions and reconstitutions—suggests that the coalitions’</w:t>
+      </w:r>
+      <w:r>
+        <w:t xml:space="preserve"> </w:t>
+      </w:r>
+      <w:r>
+        <w:rPr>
+          <w:i/>
+          <w:iCs/>
+        </w:rPr>
+        <w:t xml:space="preserve">composition</w:t>
+      </w:r>
+      <w:r>
+        <w:t xml:space="preserve"> </w:t>
+      </w:r>
+      <w:r>
+        <w:t xml:space="preserve">changed less than the institutional</w:t>
+      </w:r>
+      <w:r>
+        <w:t xml:space="preserve"> </w:t>
+      </w:r>
+      <w:r>
+        <w:rPr>
+          <w:i/>
+          <w:iCs/>
+        </w:rPr>
+        <w:t xml:space="preserve">meaning</w:t>
+      </w:r>
+      <w:r>
+        <w:t xml:space="preserve"> </w:t>
+      </w:r>
+      <w:r>
+        <w:t xml:space="preserve">of their victory or defeat. That distinction matters: under the positional framework, it is precisely the changing stakes of exclusion that should drive conceptual divergence, and a shift from democratic governance to military-backed rule represents a dramatic escalation of those stakes.</w:t>
+      </w:r>
+    </w:p>
+    <w:p>
+      <w:pPr>
+        <w:pStyle w:val="BodyText"/>
+      </w:pPr>
+      <w:r>
         <w:t xml:space="preserve">What does this mean for democratic resilience? The answer depends on whether we are looking at updating or sorting, and the two scenarios lead to quite different places. A growing body of work has asked whether broadly shared democratic attitudes can act as a brake on backsliding</w:t>
       </w:r>
       <w:r>
@@ -4822,7 +4895,7 @@
         <w:t xml:space="preserve"> </w:t>
       </w:r>
       <w:r>
-        <w:t xml:space="preserve">document a parallel dynamic in Brazil: after Bolsonaro’s victory, winners who expressed broad support for the democratic system simultaneously became more willing to countenance executive overreach, suggesting that system-level endorsement and procedural commitment can move in opposite directions.</w:t>
+        <w:t xml:space="preserve">trace a parallel dynamic in Brazil. After Bolsonaro’s victory, winners who professed broad support for the democratic system simultaneously grew more willing to countenance executive overreach—system-level endorsement and procedural commitment moving in opposite directions.</w:t>
       </w:r>
       <w:r>
         <w:t xml:space="preserve"> </w:t>
@@ -4834,7 +4907,7 @@
         <w:t xml:space="preserve"> </w:t>
       </w:r>
       <w:r>
-        <w:t xml:space="preserve">identifies a similar paradox in Poland, where democratic backsliding under PiS was accompanied by</w:t>
+        <w:t xml:space="preserve">documents something similar in Poland: democratic backsliding under PiS coincided with</w:t>
       </w:r>
       <w:r>
         <w:t xml:space="preserve"> </w:t>
@@ -4850,7 +4923,7 @@
         <w:t xml:space="preserve"> </w:t>
       </w:r>
       <w:r>
-        <w:t xml:space="preserve">aggregate support for democracy—a pattern consistent with losers intensifying their procedural commitments even as winners hollowed them out. The Asian patterns reported here indicate that this decoupling is not confined to dramatic authoritarian victories but unfolds gradually across extended erosion trajectories.</w:t>
+        <w:t xml:space="preserve">aggregate support for democracy, a pattern that maps onto losers intensifying their procedural commitments even as winners hollowed them out. What the Asian patterns add is that this decoupling need not be triggered by a single dramatic authoritarian victory. It can unfold gradually, across extended erosion trajectories.</w:t>
       </w:r>
     </w:p>
     <w:p>
@@ -4927,7 +5000,7 @@
         <w:t xml:space="preserve"> </w:t>
       </w:r>
       <w:r>
-        <w:t xml:space="preserve">identify this problem in the East Asian context specifically, noting that in competitive authoritarian regimes, ruling party supporters who report high</w:t>
+        <w:t xml:space="preserve">flag this problem in the East Asian context specifically: in competitive authoritarian regimes, ruling party supporters reporting high</w:t>
       </w:r>
       <w:r>
         <w:t xml:space="preserve"> </w:t>
@@ -4939,7 +5012,7 @@
         <w:t xml:space="preserve"> </w:t>
       </w:r>
       <w:r>
-        <w:t xml:space="preserve">may be endorsing a substantive vision centered on economic delivery rather than the procedural safeguards that external observers associate with the term. The present findings extend their insight temporally: the measurement disconnect is not simply a feature of regime type but one that deepens as democratic institutions erode within a given country.</w:t>
+        <w:t xml:space="preserve">may be endorsing a substantive vision centered on economic delivery, not the procedural safeguards that external observers associate with the term. What I add is a temporal dimension. The measurement disconnect is not simply a feature of regime type. It deepens as democratic institutions erode within a given country.</w:t>
       </w:r>
     </w:p>
     <w:p>
@@ -4963,7 +5036,7 @@
         <w:t xml:space="preserve"> </w:t>
       </w:r>
       <w:r>
-        <w:t xml:space="preserve">one. Losers gravitate toward media freedom, free expression, the right to organize, and judicial accountability—the institutional infrastructure that sustains political opposition—rather than toward elections per se. The protective-participatory distinction introduced in the fairness analysis clarifies this pattern: losers consistently favor protective procedural elements (non-electoral safeguards that constrain incumbent power) while their orientation toward participatory elements (elections and multiparty competition) is conditional on whether they perceive the electoral process as compromised. The negative fairness interaction on the free elections item reflects not an anomaly but a coherent response—citizens who believe the mechanism of democratic alternation has been corrupted shift their definitional emphasis toward safeguards that operate independently of elections. The protective-participatory distinction, which has been implicit in theoretical treatments from</w:t>
+        <w:t xml:space="preserve">one. Losers gravitate toward media freedom, free expression, the right to organize, and judicial accountability—the institutional infrastructure that sustains political opposition—rather than toward elections per se. The protective-participatory distinction derived in the theory section and tested in the fairness analysis clarifies this pattern: losers consistently favor protective procedural elements (non-electoral safeguards that constrain incumbent power) while their orientation toward participatory elements (elections and multiparty competition) is conditional on whether they perceive the electoral process as compromised. The negative fairness interaction on the free elections item reflects not an anomaly but a coherent response—citizens who believe the mechanism of democratic alternation has been corrupted shift their definitional emphasis toward safeguards that operate independently of elections. The protective-participatory distinction, which has been implicit in theoretical treatments from</w:t>
       </w:r>
       <w:r>
         <w:t xml:space="preserve"> </w:t>
@@ -5016,7 +5089,7 @@
         <w:t xml:space="preserve"> </w:t>
       </w:r>
       <w:r>
-        <w:t xml:space="preserve">has called the politics of order in Southeast Asia. Where democratic institutions are sturdy enough, these two impulses—order and contestation—coexist in a productive tension. Where institutions are weak, the two visions of democracy can become mutually exclusive. In an era of global democratic recession</w:t>
+        <w:t xml:space="preserve">has called the politics of order in Southeast Asia. Where democratic institutions are sturdy enough, these two impulses—order and contestation—coexist in a productive tension. Where institutions are weak, the two visions become mutually exclusive. And in an era of global democratic recession</w:t>
       </w:r>
       <w:r>
         <w:t xml:space="preserve"> </w:t>
@@ -5025,7 +5098,7 @@
         <w:t xml:space="preserve">(Diamond 2015; Foa and Mounk 2016; though see Norris 2017; Wuttke et al. 2022 for challenges to the deconsolidation thesis)</w:t>
       </w:r>
       <w:r>
-        <w:t xml:space="preserve">, knowing which vision predominates, and among whom, matters well beyond the region examined here.</w:t>
+        <w:t xml:space="preserve">, knowing which vision predominates—and among whom—matters well beyond Asia.</w:t>
       </w:r>
     </w:p>
     <w:p>
@@ -5033,7 +5106,7 @@
         <w:pStyle w:val="BodyText"/>
       </w:pPr>
       <w:r>
-        <w:t xml:space="preserve">The analysis faces limitations that constrain interpretation. The repeated cross-sectional design—the most consequential constraint, discussed in detail in the methods section—means the within-country trajectories are suggestive rather than dispositive. Recent causal evidence on the winner-loser gap in satisfaction underscores both the challenge and the potential distinctiveness of the conceptual dimension studied here:</w:t>
+        <w:t xml:space="preserve">Several limitations constrain interpretation. The repeated cross-sectional design is the most consequential, discussed in detail in the methods section. The within-country trajectories are suggestive, not dispositive. Recent causal work on the winner-loser satisfaction gap sharpens the point.</w:t>
       </w:r>
       <w:r>
         <w:t xml:space="preserve"> </w:t>
@@ -5045,7 +5118,7 @@
         <w:t xml:space="preserve"> </w:t>
       </w:r>
       <w:r>
-        <w:t xml:space="preserve">use a regression discontinuity design around government formation and find that the causal impact of winning or losing on satisfaction is indistinguishable from zero, while</w:t>
+        <w:t xml:space="preserve">use a regression discontinuity design around government formation and find that the causal impact of winning or losing on satisfaction is indistinguishable from zero;</w:t>
       </w:r>
       <w:r>
         <w:t xml:space="preserve"> </w:t>
@@ -5054,10 +5127,7 @@
         <w:t xml:space="preserve">Erhardt (2023)</w:t>
       </w:r>
       <w:r>
-        <w:t xml:space="preserve"> </w:t>
-      </w:r>
-      <w:r>
-        <w:t xml:space="preserve">shows with Dutch panel data that satisfaction effects are largely short-run. If the satisfaction gap is causally fragile, the persistent and context-sensitive</w:t>
+        <w:t xml:space="preserve">, working with Dutch panel data, shows that satisfaction effects are largely short-run. If the satisfaction gap turns out to be causally fragile, then the persistent, context-sensitive</w:t>
       </w:r>
       <w:r>
         <w:t xml:space="preserve"> </w:t>
@@ -5073,7 +5143,7 @@
         <w:t xml:space="preserve"> </w:t>
       </w:r>
       <w:r>
-        <w:t xml:space="preserve">gap documented here may operate through a different mechanism entirely—one that panel data on democratic conceptions, when available, could help identify. Eleven countries is not a large sample for cross-national inference—though it is worth noting that the Asian Barometer is among the very few surveys that has tracked democratic conceptions with forced-choice items over nearly two decades, and the consistency of the loser effect across such diverse political systems is itself informative. The compression of the gap in Wave 6 across most countries outside Thailand remains a puzzle. A natural candidate explanation—that the pandemic made state capacity salient for everyone, compressing the winner-loser distinction by pulling respondents toward governance-oriented definitions—is not supported by the data. Governance items (no waste, quality services, law and order, clean politics) fell by an average of 3.8 percentage points from Wave 4 to Wave 6 rather than rising, ruling out a blanket pandemic-salience account. The compression is real but unexplained, and future survey rounds in the post-pandemic period will be needed to determine whether it persists or proves transient. Political engagement is a further concern: unobserved shifts in political interest or partisan intensity within winning and losing coalitions could account for some portion of the within-country trajectories. The ABS includes a political interest measure with coverage exceeding 95% across Thailand’s survey waves. Adding political interest as a control to the Thailand-specific models changes the mean procedural AME by 0.1 percentage point—a negligible shift that indicates the trajectory is not driven by differential political engagement across coalitions. Partisan intensity, however, is not directly measured in the ABS and remains a plausible unmeasured confounder. The demographic reweighting results (Appendix G), which hold coalition composition constant on age, education, gender, and urban residence without altering the substantive findings, provide partial reassurance. And the restriction to voters, while theoretically justified, means the findings describe the electorally active public, not the population at large.</w:t>
+        <w:t xml:space="preserve">gap I have documented may operate through a different mechanism altogether—one that panel data on democratic conceptions, when they become available, could help identify. Eleven countries is not a large sample for cross-national inference—though it is worth noting that the Asian Barometer is among the very few surveys that has tracked democratic conceptions with forced-choice items over nearly two decades, and the consistency of the loser effect across such diverse political systems is itself informative. The compression of the gap in Wave 6 across most countries outside Thailand remains a puzzle. A natural candidate explanation—that the pandemic made state capacity salient for everyone, compressing the winner-loser distinction by pulling respondents toward governance-oriented definitions—is not supported by the data. Governance items (no waste, quality services, law and order, clean politics) fell by an average of 3.8 percentage points from Wave 4 to Wave 6 rather than rising, ruling out a blanket pandemic-salience account. The compression is real. I cannot explain it, and future survey rounds in the post-pandemic period will be needed to determine whether it persists or proves transient. Political engagement raises a further concern. Unobserved shifts in political interest or partisan intensity within winning and losing coalitions could account for some portion of the within-country trajectories. The ABS does include a political interest measure, with coverage exceeding 95% across Thailand’s survey waves. Adding it as a control to the Thailand-specific models shifts the mean procedural AME by 0.1 percentage point—negligible, and evidence that differential political engagement across coalitions is not the driver. Partisan intensity is another matter. It is not directly measured in the ABS and remains a plausible unmeasured confounder. The demographic reweighting results (Appendix G) offer partial reassurance: holding coalition composition constant on age, education, gender, and urban residence does not alter the substantive findings. And the restriction to voters, while theoretically justified, means the findings describe the electorally active public, not the population at large.</w:t>
       </w:r>
     </w:p>
     <w:bookmarkEnd w:id="53"/>
@@ -5107,11 +5177,11 @@
         <w:pStyle w:val="BodyText"/>
       </w:pPr>
       <w:r>
-        <w:t xml:space="preserve">The associations documented here—their consistency across items, their responsiveness to political context, their concentration among those who perceive procedural threats—point toward a dynamic relationship between electoral experience and democratic meaning that previous work has overlooked. Whether that relationship is best described as updating, sorting, or some blend of the two remains to be settled. What the evidence does suggest, fairly clearly, is that the positional account has more going for it than cultural determinism does.</w:t>
+        <w:t xml:space="preserve">Consistency across items, responsiveness to political context, concentration among those who perceive procedural threats: these associations point toward a dynamic relationship between electoral experience and democratic meaning that previous work has not engaged with. Whether updating, sorting, or some blend of the two best describes that relationship remains an open question. What I can say, on the weight of the evidence assembled here, is that the positional account has considerably more going for it than cultural determinism.</w:t>
       </w:r>
     </w:p>
     <w:bookmarkEnd w:id="54"/>
-    <w:bookmarkStart w:id="182" w:name="references"/>
+    <w:bookmarkStart w:id="183" w:name="references"/>
     <w:p>
       <w:pPr>
         <w:pStyle w:val="Heading1"/>
@@ -5120,7 +5190,7 @@
         <w:t xml:space="preserve">References</w:t>
       </w:r>
     </w:p>
-    <w:bookmarkStart w:id="181" w:name="refs"/>
+    <w:bookmarkStart w:id="182" w:name="refs"/>
     <w:bookmarkStart w:id="56" w:name="ref-Anderson2005-uk"/>
     <w:p>
       <w:pPr>
@@ -5574,7 +5644,7 @@
       </w:r>
     </w:p>
     <w:bookmarkEnd w:id="72"/>
-    <w:bookmarkStart w:id="73" w:name="ref-Chu2016-va"/>
+    <w:bookmarkStart w:id="74" w:name="ref-Chu2016-va"/>
     <w:p>
       <w:pPr>
         <w:pStyle w:val="Bibliography"/>
@@ -5595,9 +5665,23 @@
       <w:r>
         <w:t xml:space="preserve">. Research Report Report 120. Asian Barometer.</w:t>
       </w:r>
-    </w:p>
-    <w:bookmarkEnd w:id="73"/>
-    <w:bookmarkStart w:id="75" w:name="ref-Chu2008-fk"/>
+      <w:r>
+        <w:t xml:space="preserve"> </w:t>
+      </w:r>
+      <w:hyperlink r:id="rId73">
+        <w:r>
+          <w:rPr>
+            <w:rStyle w:val="Hyperlink"/>
+          </w:rPr>
+          <w:t xml:space="preserve">https://asianbarometer.org</w:t>
+        </w:r>
+      </w:hyperlink>
+      <w:r>
+        <w:t xml:space="preserve">.</w:t>
+      </w:r>
+    </w:p>
+    <w:bookmarkEnd w:id="74"/>
+    <w:bookmarkStart w:id="76" w:name="ref-Chu2008-fk"/>
     <w:p>
       <w:pPr>
         <w:pStyle w:val="Bibliography"/>
@@ -5621,7 +5705,7 @@
       <w:r>
         <w:t xml:space="preserve"> </w:t>
       </w:r>
-      <w:hyperlink r:id="rId74">
+      <w:hyperlink r:id="rId75">
         <w:r>
           <w:rPr>
             <w:rStyle w:val="Hyperlink"/>
@@ -5633,8 +5717,8 @@
         <w:t xml:space="preserve">.</w:t>
       </w:r>
     </w:p>
-    <w:bookmarkEnd w:id="75"/>
-    <w:bookmarkStart w:id="77" w:name="ref-Chu2010-nb"/>
+    <w:bookmarkEnd w:id="76"/>
+    <w:bookmarkStart w:id="78" w:name="ref-Chu2010-nb"/>
     <w:p>
       <w:pPr>
         <w:pStyle w:val="Bibliography"/>
@@ -5673,7 +5757,7 @@
       <w:r>
         <w:t xml:space="preserve"> </w:t>
       </w:r>
-      <w:hyperlink r:id="rId76">
+      <w:hyperlink r:id="rId77">
         <w:r>
           <w:rPr>
             <w:rStyle w:val="Hyperlink"/>
@@ -5685,8 +5769,8 @@
         <w:t xml:space="preserve">.</w:t>
       </w:r>
     </w:p>
-    <w:bookmarkEnd w:id="77"/>
-    <w:bookmarkStart w:id="78" w:name="ref-ABS-W6"/>
+    <w:bookmarkEnd w:id="78"/>
+    <w:bookmarkStart w:id="79" w:name="ref-ABS-W6"/>
     <w:p>
       <w:pPr>
         <w:pStyle w:val="Bibliography"/>
@@ -5708,8 +5792,8 @@
         <w:t xml:space="preserve">. Taipei: National Taiwan University; Academia Sinica.</w:t>
       </w:r>
     </w:p>
-    <w:bookmarkEnd w:id="78"/>
-    <w:bookmarkStart w:id="80" w:name="ref-Claassen2020-hk"/>
+    <w:bookmarkEnd w:id="79"/>
+    <w:bookmarkStart w:id="81" w:name="ref-Claassen2020-hk"/>
     <w:p>
       <w:pPr>
         <w:pStyle w:val="Bibliography"/>
@@ -5748,7 +5832,7 @@
       <w:r>
         <w:t xml:space="preserve"> </w:t>
       </w:r>
-      <w:hyperlink r:id="rId79">
+      <w:hyperlink r:id="rId80">
         <w:r>
           <w:rPr>
             <w:rStyle w:val="Hyperlink"/>
@@ -5760,8 +5844,8 @@
         <w:t xml:space="preserve">.</w:t>
       </w:r>
     </w:p>
-    <w:bookmarkEnd w:id="80"/>
-    <w:bookmarkStart w:id="82" w:name="ref-Cohen2023-sm"/>
+    <w:bookmarkEnd w:id="81"/>
+    <w:bookmarkStart w:id="83" w:name="ref-Cohen2023-sm"/>
     <w:p>
       <w:pPr>
         <w:pStyle w:val="Bibliography"/>
@@ -5800,7 +5884,7 @@
       <w:r>
         <w:t xml:space="preserve"> </w:t>
       </w:r>
-      <w:hyperlink r:id="rId81">
+      <w:hyperlink r:id="rId82">
         <w:r>
           <w:rPr>
             <w:rStyle w:val="Hyperlink"/>
@@ -5812,8 +5896,8 @@
         <w:t xml:space="preserve">.</w:t>
       </w:r>
     </w:p>
-    <w:bookmarkEnd w:id="82"/>
-    <w:bookmarkStart w:id="83" w:name="ref-Dahl1977-wj"/>
+    <w:bookmarkEnd w:id="83"/>
+    <w:bookmarkStart w:id="84" w:name="ref-Dahl1977-wj"/>
     <w:p>
       <w:pPr>
         <w:pStyle w:val="Bibliography"/>
@@ -5835,8 +5919,8 @@
         <w:t xml:space="preserve">. Yale University Press.</w:t>
       </w:r>
     </w:p>
-    <w:bookmarkEnd w:id="83"/>
-    <w:bookmarkStart w:id="85" w:name="ref-Dalton2007-ei"/>
+    <w:bookmarkEnd w:id="84"/>
+    <w:bookmarkStart w:id="86" w:name="ref-Dalton2007-ei"/>
     <w:p>
       <w:pPr>
         <w:pStyle w:val="Bibliography"/>
@@ -5930,7 +6014,7 @@
       <w:r>
         <w:t xml:space="preserve"> </w:t>
       </w:r>
-      <w:hyperlink r:id="rId84">
+      <w:hyperlink r:id="rId85">
         <w:r>
           <w:rPr>
             <w:rStyle w:val="Hyperlink"/>
@@ -5942,8 +6026,8 @@
         <w:t xml:space="preserve">.</w:t>
       </w:r>
     </w:p>
-    <w:bookmarkEnd w:id="85"/>
-    <w:bookmarkStart w:id="87" w:name="ref-Daoust2024-ie"/>
+    <w:bookmarkEnd w:id="86"/>
+    <w:bookmarkStart w:id="88" w:name="ref-Daoust2024-ie"/>
     <w:p>
       <w:pPr>
         <w:pStyle w:val="Bibliography"/>
@@ -5982,7 +6066,7 @@
       <w:r>
         <w:t xml:space="preserve"> </w:t>
       </w:r>
-      <w:hyperlink r:id="rId86">
+      <w:hyperlink r:id="rId87">
         <w:r>
           <w:rPr>
             <w:rStyle w:val="Hyperlink"/>
@@ -5994,8 +6078,8 @@
         <w:t xml:space="preserve">.</w:t>
       </w:r>
     </w:p>
-    <w:bookmarkEnd w:id="87"/>
-    <w:bookmarkStart w:id="89" w:name="ref-Diamond1999-wd"/>
+    <w:bookmarkEnd w:id="88"/>
+    <w:bookmarkStart w:id="90" w:name="ref-Diamond1999-wd"/>
     <w:p>
       <w:pPr>
         <w:pStyle w:val="Bibliography"/>
@@ -6019,7 +6103,7 @@
       <w:r>
         <w:t xml:space="preserve"> </w:t>
       </w:r>
-      <w:hyperlink r:id="rId88">
+      <w:hyperlink r:id="rId89">
         <w:r>
           <w:rPr>
             <w:rStyle w:val="Hyperlink"/>
@@ -6031,8 +6115,8 @@
         <w:t xml:space="preserve">.</w:t>
       </w:r>
     </w:p>
-    <w:bookmarkEnd w:id="89"/>
-    <w:bookmarkStart w:id="91" w:name="ref-Diamond2015-yb"/>
+    <w:bookmarkEnd w:id="90"/>
+    <w:bookmarkStart w:id="92" w:name="ref-Diamond2015-yb"/>
     <w:p>
       <w:pPr>
         <w:pStyle w:val="Bibliography"/>
@@ -6071,7 +6155,7 @@
       <w:r>
         <w:t xml:space="preserve"> </w:t>
       </w:r>
-      <w:hyperlink r:id="rId90">
+      <w:hyperlink r:id="rId91">
         <w:r>
           <w:rPr>
             <w:rStyle w:val="Hyperlink"/>
@@ -6083,8 +6167,8 @@
         <w:t xml:space="preserve">.</w:t>
       </w:r>
     </w:p>
-    <w:bookmarkEnd w:id="91"/>
-    <w:bookmarkStart w:id="93" w:name="ref-Eck2025-jl"/>
+    <w:bookmarkEnd w:id="92"/>
+    <w:bookmarkStart w:id="94" w:name="ref-Eck2025-jl"/>
     <w:p>
       <w:pPr>
         <w:pStyle w:val="Bibliography"/>
@@ -6123,7 +6207,7 @@
       <w:r>
         <w:t xml:space="preserve"> </w:t>
       </w:r>
-      <w:hyperlink r:id="rId92">
+      <w:hyperlink r:id="rId93">
         <w:r>
           <w:rPr>
             <w:rStyle w:val="Hyperlink"/>
@@ -6135,8 +6219,8 @@
         <w:t xml:space="preserve">.</w:t>
       </w:r>
     </w:p>
-    <w:bookmarkEnd w:id="93"/>
-    <w:bookmarkStart w:id="95" w:name="ref-Erhardt2023-um"/>
+    <w:bookmarkEnd w:id="94"/>
+    <w:bookmarkStart w:id="96" w:name="ref-Erhardt2023-um"/>
     <w:p>
       <w:pPr>
         <w:pStyle w:val="Bibliography"/>
@@ -6175,7 +6259,7 @@
       <w:r>
         <w:t xml:space="preserve"> </w:t>
       </w:r>
-      <w:hyperlink r:id="rId94">
+      <w:hyperlink r:id="rId95">
         <w:r>
           <w:rPr>
             <w:rStyle w:val="Hyperlink"/>
@@ -6187,8 +6271,8 @@
         <w:t xml:space="preserve">.</w:t>
       </w:r>
     </w:p>
-    <w:bookmarkEnd w:id="95"/>
-    <w:bookmarkStart w:id="97" w:name="ref-Esaiasson2011-po"/>
+    <w:bookmarkEnd w:id="96"/>
+    <w:bookmarkStart w:id="98" w:name="ref-Esaiasson2011-po"/>
     <w:p>
       <w:pPr>
         <w:pStyle w:val="Bibliography"/>
@@ -6227,7 +6311,7 @@
       <w:r>
         <w:t xml:space="preserve"> </w:t>
       </w:r>
-      <w:hyperlink r:id="rId96">
+      <w:hyperlink r:id="rId97">
         <w:r>
           <w:rPr>
             <w:rStyle w:val="Hyperlink"/>
@@ -6239,8 +6323,8 @@
         <w:t xml:space="preserve">.</w:t>
       </w:r>
     </w:p>
-    <w:bookmarkEnd w:id="97"/>
-    <w:bookmarkStart w:id="99" w:name="ref-Esaiasson2020-av"/>
+    <w:bookmarkEnd w:id="98"/>
+    <w:bookmarkStart w:id="100" w:name="ref-Esaiasson2020-av"/>
     <w:p>
       <w:pPr>
         <w:pStyle w:val="Bibliography"/>
@@ -6279,7 +6363,7 @@
       <w:r>
         <w:t xml:space="preserve"> </w:t>
       </w:r>
-      <w:hyperlink r:id="rId98">
+      <w:hyperlink r:id="rId99">
         <w:r>
           <w:rPr>
             <w:rStyle w:val="Hyperlink"/>
@@ -6291,8 +6375,8 @@
         <w:t xml:space="preserve">.</w:t>
       </w:r>
     </w:p>
-    <w:bookmarkEnd w:id="99"/>
-    <w:bookmarkStart w:id="101" w:name="ref-Evans2006-np"/>
+    <w:bookmarkEnd w:id="100"/>
+    <w:bookmarkStart w:id="102" w:name="ref-Evans2006-np"/>
     <w:p>
       <w:pPr>
         <w:pStyle w:val="Bibliography"/>
@@ -6331,7 +6415,7 @@
       <w:r>
         <w:t xml:space="preserve"> </w:t>
       </w:r>
-      <w:hyperlink r:id="rId100">
+      <w:hyperlink r:id="rId101">
         <w:r>
           <w:rPr>
             <w:rStyle w:val="Hyperlink"/>
@@ -6343,8 +6427,8 @@
         <w:t xml:space="preserve">.</w:t>
       </w:r>
     </w:p>
-    <w:bookmarkEnd w:id="101"/>
-    <w:bookmarkStart w:id="103" w:name="ref-Ferrin2016-se"/>
+    <w:bookmarkEnd w:id="102"/>
+    <w:bookmarkStart w:id="104" w:name="ref-Ferrin2016-se"/>
     <w:p>
       <w:pPr>
         <w:pStyle w:val="Bibliography"/>
@@ -6368,7 +6452,7 @@
       <w:r>
         <w:t xml:space="preserve"> </w:t>
       </w:r>
-      <w:hyperlink r:id="rId102">
+      <w:hyperlink r:id="rId103">
         <w:r>
           <w:rPr>
             <w:rStyle w:val="Hyperlink"/>
@@ -6380,8 +6464,8 @@
         <w:t xml:space="preserve">.</w:t>
       </w:r>
     </w:p>
-    <w:bookmarkEnd w:id="103"/>
-    <w:bookmarkStart w:id="105" w:name="ref-Fiorina1978-wf"/>
+    <w:bookmarkEnd w:id="104"/>
+    <w:bookmarkStart w:id="106" w:name="ref-Fiorina1978-wf"/>
     <w:p>
       <w:pPr>
         <w:pStyle w:val="Bibliography"/>
@@ -6420,7 +6504,7 @@
       <w:r>
         <w:t xml:space="preserve"> </w:t>
       </w:r>
-      <w:hyperlink r:id="rId104">
+      <w:hyperlink r:id="rId105">
         <w:r>
           <w:rPr>
             <w:rStyle w:val="Hyperlink"/>
@@ -6432,8 +6516,8 @@
         <w:t xml:space="preserve">.</w:t>
       </w:r>
     </w:p>
-    <w:bookmarkEnd w:id="105"/>
-    <w:bookmarkStart w:id="107" w:name="ref-Foa2016-lq"/>
+    <w:bookmarkEnd w:id="106"/>
+    <w:bookmarkStart w:id="108" w:name="ref-Foa2016-lq"/>
     <w:p>
       <w:pPr>
         <w:pStyle w:val="Bibliography"/>
@@ -6472,7 +6556,7 @@
       <w:r>
         <w:t xml:space="preserve"> </w:t>
       </w:r>
-      <w:hyperlink r:id="rId106">
+      <w:hyperlink r:id="rId107">
         <w:r>
           <w:rPr>
             <w:rStyle w:val="Hyperlink"/>
@@ -6484,8 +6568,8 @@
         <w:t xml:space="preserve">.</w:t>
       </w:r>
     </w:p>
-    <w:bookmarkEnd w:id="107"/>
-    <w:bookmarkStart w:id="109" w:name="ref-Graham2020-jr"/>
+    <w:bookmarkEnd w:id="108"/>
+    <w:bookmarkStart w:id="110" w:name="ref-Graham2020-jr"/>
     <w:p>
       <w:pPr>
         <w:pStyle w:val="Bibliography"/>
@@ -6524,7 +6608,7 @@
       <w:r>
         <w:t xml:space="preserve"> </w:t>
       </w:r>
-      <w:hyperlink r:id="rId108">
+      <w:hyperlink r:id="rId109">
         <w:r>
           <w:rPr>
             <w:rStyle w:val="Hyperlink"/>
@@ -6536,8 +6620,8 @@
         <w:t xml:space="preserve">.</w:t>
       </w:r>
     </w:p>
-    <w:bookmarkEnd w:id="109"/>
-    <w:bookmarkStart w:id="111" w:name="ref-Halliez2023-zu"/>
+    <w:bookmarkEnd w:id="110"/>
+    <w:bookmarkStart w:id="112" w:name="ref-Halliez2023-zu"/>
     <w:p>
       <w:pPr>
         <w:pStyle w:val="Bibliography"/>
@@ -6576,7 +6660,7 @@
       <w:r>
         <w:t xml:space="preserve"> </w:t>
       </w:r>
-      <w:hyperlink r:id="rId110">
+      <w:hyperlink r:id="rId111">
         <w:r>
           <w:rPr>
             <w:rStyle w:val="Hyperlink"/>
@@ -6588,8 +6672,8 @@
         <w:t xml:space="preserve">.</w:t>
       </w:r>
     </w:p>
-    <w:bookmarkEnd w:id="111"/>
-    <w:bookmarkStart w:id="113" w:name="ref-Hsiao2020-fz"/>
+    <w:bookmarkEnd w:id="112"/>
+    <w:bookmarkStart w:id="114" w:name="ref-Hsiao2020-fz"/>
     <w:p>
       <w:pPr>
         <w:pStyle w:val="Bibliography"/>
@@ -6628,7 +6712,7 @@
       <w:r>
         <w:t xml:space="preserve"> </w:t>
       </w:r>
-      <w:hyperlink r:id="rId112">
+      <w:hyperlink r:id="rId113">
         <w:r>
           <w:rPr>
             <w:rStyle w:val="Hyperlink"/>
@@ -6640,8 +6724,8 @@
         <w:t xml:space="preserve">.</w:t>
       </w:r>
     </w:p>
-    <w:bookmarkEnd w:id="113"/>
-    <w:bookmarkStart w:id="114" w:name="ref-ABS-W2"/>
+    <w:bookmarkEnd w:id="114"/>
+    <w:bookmarkStart w:id="115" w:name="ref-ABS-W2"/>
     <w:p>
       <w:pPr>
         <w:pStyle w:val="Bibliography"/>
@@ -6663,8 +6747,8 @@
         <w:t xml:space="preserve">. Taipei: National Taiwan University; Academia Sinica.</w:t>
       </w:r>
     </w:p>
-    <w:bookmarkEnd w:id="114"/>
-    <w:bookmarkStart w:id="115" w:name="ref-ABS-W3"/>
+    <w:bookmarkEnd w:id="115"/>
+    <w:bookmarkStart w:id="116" w:name="ref-ABS-W3"/>
     <w:p>
       <w:pPr>
         <w:pStyle w:val="Bibliography"/>
@@ -6686,8 +6770,8 @@
         <w:t xml:space="preserve">. Taipei: National Taiwan University; Academia Sinica.</w:t>
       </w:r>
     </w:p>
-    <w:bookmarkEnd w:id="115"/>
-    <w:bookmarkStart w:id="116" w:name="ref-ABS-W4"/>
+    <w:bookmarkEnd w:id="116"/>
+    <w:bookmarkStart w:id="117" w:name="ref-ABS-W4"/>
     <w:p>
       <w:pPr>
         <w:pStyle w:val="Bibliography"/>
@@ -6709,8 +6793,8 @@
         <w:t xml:space="preserve">. Taipei: National Taiwan University; Academia Sinica.</w:t>
       </w:r>
     </w:p>
-    <w:bookmarkEnd w:id="116"/>
-    <w:bookmarkStart w:id="118" w:name="ref-Inglehart1997-gw"/>
+    <w:bookmarkEnd w:id="117"/>
+    <w:bookmarkStart w:id="119" w:name="ref-Inglehart1997-gw"/>
     <w:p>
       <w:pPr>
         <w:pStyle w:val="Bibliography"/>
@@ -6734,7 +6818,7 @@
       <w:r>
         <w:t xml:space="preserve"> </w:t>
       </w:r>
-      <w:hyperlink r:id="rId117">
+      <w:hyperlink r:id="rId118">
         <w:r>
           <w:rPr>
             <w:rStyle w:val="Hyperlink"/>
@@ -6746,8 +6830,8 @@
         <w:t xml:space="preserve">.</w:t>
       </w:r>
     </w:p>
-    <w:bookmarkEnd w:id="118"/>
-    <w:bookmarkStart w:id="120" w:name="ref-Kahneman1979-af"/>
+    <w:bookmarkEnd w:id="119"/>
+    <w:bookmarkStart w:id="121" w:name="ref-Kahneman1979-af"/>
     <w:p>
       <w:pPr>
         <w:pStyle w:val="Bibliography"/>
@@ -6786,7 +6870,7 @@
       <w:r>
         <w:t xml:space="preserve"> </w:t>
       </w:r>
-      <w:hyperlink r:id="rId119">
+      <w:hyperlink r:id="rId120">
         <w:r>
           <w:rPr>
             <w:rStyle w:val="Hyperlink"/>
@@ -6798,8 +6882,8 @@
         <w:t xml:space="preserve">.</w:t>
       </w:r>
     </w:p>
-    <w:bookmarkEnd w:id="120"/>
-    <w:bookmarkStart w:id="122" w:name="ref-Kuhonta2014-qk"/>
+    <w:bookmarkEnd w:id="121"/>
+    <w:bookmarkStart w:id="123" w:name="ref-Kuhonta2014-qk"/>
     <w:p>
       <w:pPr>
         <w:pStyle w:val="Bibliography"/>
@@ -6838,7 +6922,7 @@
       <w:r>
         <w:t xml:space="preserve"> </w:t>
       </w:r>
-      <w:hyperlink r:id="rId121">
+      <w:hyperlink r:id="rId122">
         <w:r>
           <w:rPr>
             <w:rStyle w:val="Hyperlink"/>
@@ -6850,8 +6934,8 @@
         <w:t xml:space="preserve">.</w:t>
       </w:r>
     </w:p>
-    <w:bookmarkEnd w:id="122"/>
-    <w:bookmarkStart w:id="124" w:name="ref-Kunda1990-uw"/>
+    <w:bookmarkEnd w:id="123"/>
+    <w:bookmarkStart w:id="125" w:name="ref-Kunda1990-uw"/>
     <w:p>
       <w:pPr>
         <w:pStyle w:val="Bibliography"/>
@@ -6890,7 +6974,7 @@
       <w:r>
         <w:t xml:space="preserve"> </w:t>
       </w:r>
-      <w:hyperlink r:id="rId123">
+      <w:hyperlink r:id="rId124">
         <w:r>
           <w:rPr>
             <w:rStyle w:val="Hyperlink"/>
@@ -6902,8 +6986,8 @@
         <w:t xml:space="preserve">.</w:t>
       </w:r>
     </w:p>
-    <w:bookmarkEnd w:id="124"/>
-    <w:bookmarkStart w:id="125" w:name="ref-Levitsky2018-dd"/>
+    <w:bookmarkEnd w:id="125"/>
+    <w:bookmarkStart w:id="126" w:name="ref-Levitsky2018-dd"/>
     <w:p>
       <w:pPr>
         <w:pStyle w:val="Bibliography"/>
@@ -6925,8 +7009,8 @@
         <w:t xml:space="preserve">. Viking.</w:t>
       </w:r>
     </w:p>
-    <w:bookmarkEnd w:id="125"/>
-    <w:bookmarkStart w:id="127" w:name="ref-Linz1996-qs"/>
+    <w:bookmarkEnd w:id="126"/>
+    <w:bookmarkStart w:id="128" w:name="ref-Linz1996-qs"/>
     <w:p>
       <w:pPr>
         <w:pStyle w:val="Bibliography"/>
@@ -6965,7 +7049,7 @@
       <w:r>
         <w:t xml:space="preserve"> </w:t>
       </w:r>
-      <w:hyperlink r:id="rId126">
+      <w:hyperlink r:id="rId127">
         <w:r>
           <w:rPr>
             <w:rStyle w:val="Hyperlink"/>
@@ -6977,8 +7061,8 @@
         <w:t xml:space="preserve">.</w:t>
       </w:r>
     </w:p>
-    <w:bookmarkEnd w:id="127"/>
-    <w:bookmarkStart w:id="129" w:name="ref-Luhrmann2019-ow"/>
+    <w:bookmarkEnd w:id="128"/>
+    <w:bookmarkStart w:id="130" w:name="ref-Luhrmann2019-ow"/>
     <w:p>
       <w:pPr>
         <w:pStyle w:val="Bibliography"/>
@@ -7017,7 +7101,7 @@
       <w:r>
         <w:t xml:space="preserve"> </w:t>
       </w:r>
-      <w:hyperlink r:id="rId128">
+      <w:hyperlink r:id="rId129">
         <w:r>
           <w:rPr>
             <w:rStyle w:val="Hyperlink"/>
@@ -7029,8 +7113,8 @@
         <w:t xml:space="preserve">.</w:t>
       </w:r>
     </w:p>
-    <w:bookmarkEnd w:id="129"/>
-    <w:bookmarkStart w:id="131" w:name="ref-Mauk2020-bu"/>
+    <w:bookmarkEnd w:id="130"/>
+    <w:bookmarkStart w:id="132" w:name="ref-Mauk2020-bu"/>
     <w:p>
       <w:pPr>
         <w:pStyle w:val="Bibliography"/>
@@ -7054,7 +7138,7 @@
       <w:r>
         <w:t xml:space="preserve"> </w:t>
       </w:r>
-      <w:hyperlink r:id="rId130">
+      <w:hyperlink r:id="rId131">
         <w:r>
           <w:rPr>
             <w:rStyle w:val="Hyperlink"/>
@@ -7066,8 +7150,8 @@
         <w:t xml:space="preserve">.</w:t>
       </w:r>
     </w:p>
-    <w:bookmarkEnd w:id="131"/>
-    <w:bookmarkStart w:id="133" w:name="ref-McCargo2019-rx"/>
+    <w:bookmarkEnd w:id="132"/>
+    <w:bookmarkStart w:id="134" w:name="ref-McCargo2019-rx"/>
     <w:p>
       <w:pPr>
         <w:pStyle w:val="Bibliography"/>
@@ -7106,7 +7190,7 @@
       <w:r>
         <w:t xml:space="preserve"> </w:t>
       </w:r>
-      <w:hyperlink r:id="rId132">
+      <w:hyperlink r:id="rId133">
         <w:r>
           <w:rPr>
             <w:rStyle w:val="Hyperlink"/>
@@ -7118,8 +7202,8 @@
         <w:t xml:space="preserve">.</w:t>
       </w:r>
     </w:p>
-    <w:bookmarkEnd w:id="133"/>
-    <w:bookmarkStart w:id="135" w:name="ref-Mietzner2021-jr"/>
+    <w:bookmarkEnd w:id="134"/>
+    <w:bookmarkStart w:id="136" w:name="ref-Mietzner2021-jr"/>
     <w:p>
       <w:pPr>
         <w:pStyle w:val="Bibliography"/>
@@ -7143,7 +7227,7 @@
       <w:r>
         <w:t xml:space="preserve"> </w:t>
       </w:r>
-      <w:hyperlink r:id="rId134">
+      <w:hyperlink r:id="rId135">
         <w:r>
           <w:rPr>
             <w:rStyle w:val="Hyperlink"/>
@@ -7155,8 +7239,8 @@
         <w:t xml:space="preserve">.</w:t>
       </w:r>
     </w:p>
-    <w:bookmarkEnd w:id="135"/>
-    <w:bookmarkStart w:id="137" w:name="ref-Monsivais-Carrillo2020-ck"/>
+    <w:bookmarkEnd w:id="136"/>
+    <w:bookmarkStart w:id="138" w:name="ref-Monsivais-Carrillo2020-ck"/>
     <w:p>
       <w:pPr>
         <w:pStyle w:val="Bibliography"/>
@@ -7190,22 +7274,25 @@
         <w:t xml:space="preserve"> </w:t>
       </w:r>
       <w:r>
-        <w:t xml:space="preserve">70: 173–94. https://doi.org/</w:t>
-      </w:r>
-      <w:hyperlink r:id="rId136">
+        <w:t xml:space="preserve">70: 173–94.</w:t>
+      </w:r>
+      <w:r>
+        <w:t xml:space="preserve"> </w:t>
+      </w:r>
+      <w:hyperlink r:id="rId137">
         <w:r>
           <w:rPr>
             <w:rStyle w:val="Hyperlink"/>
           </w:rPr>
-          <w:t xml:space="preserve">10.1177/0032321720952230https://doi.org/10.1177/0032321720952230the</w:t>
+          <w:t xml:space="preserve">https://doi.org/10.1177/0032321720952230</w:t>
         </w:r>
       </w:hyperlink>
       <w:r>
         <w:t xml:space="preserve">.</w:t>
       </w:r>
     </w:p>
-    <w:bookmarkEnd w:id="137"/>
-    <w:bookmarkStart w:id="139" w:name="ref-Nadeau1993-vo"/>
+    <w:bookmarkEnd w:id="138"/>
+    <w:bookmarkStart w:id="140" w:name="ref-Nadeau1993-vo"/>
     <w:p>
       <w:pPr>
         <w:pStyle w:val="Bibliography"/>
@@ -7244,7 +7331,7 @@
       <w:r>
         <w:t xml:space="preserve"> </w:t>
       </w:r>
-      <w:hyperlink r:id="rId138">
+      <w:hyperlink r:id="rId139">
         <w:r>
           <w:rPr>
             <w:rStyle w:val="Hyperlink"/>
@@ -7256,8 +7343,8 @@
         <w:t xml:space="preserve">.</w:t>
       </w:r>
     </w:p>
-    <w:bookmarkEnd w:id="139"/>
-    <w:bookmarkStart w:id="141" w:name="ref-Norris2011-qz"/>
+    <w:bookmarkEnd w:id="140"/>
+    <w:bookmarkStart w:id="142" w:name="ref-Norris2011-qz"/>
     <w:p>
       <w:pPr>
         <w:pStyle w:val="Bibliography"/>
@@ -7281,7 +7368,7 @@
       <w:r>
         <w:t xml:space="preserve"> </w:t>
       </w:r>
-      <w:hyperlink r:id="rId140">
+      <w:hyperlink r:id="rId141">
         <w:r>
           <w:rPr>
             <w:rStyle w:val="Hyperlink"/>
@@ -7293,8 +7380,8 @@
         <w:t xml:space="preserve">.</w:t>
       </w:r>
     </w:p>
-    <w:bookmarkEnd w:id="141"/>
-    <w:bookmarkStart w:id="143" w:name="ref-Norris2012-er"/>
+    <w:bookmarkEnd w:id="142"/>
+    <w:bookmarkStart w:id="144" w:name="ref-Norris2012-er"/>
     <w:p>
       <w:pPr>
         <w:pStyle w:val="Bibliography"/>
@@ -7318,7 +7405,7 @@
       <w:r>
         <w:t xml:space="preserve"> </w:t>
       </w:r>
-      <w:hyperlink r:id="rId142">
+      <w:hyperlink r:id="rId143">
         <w:r>
           <w:rPr>
             <w:rStyle w:val="Hyperlink"/>
@@ -7330,8 +7417,8 @@
         <w:t xml:space="preserve">.</w:t>
       </w:r>
     </w:p>
-    <w:bookmarkEnd w:id="143"/>
-    <w:bookmarkStart w:id="144" w:name="ref-Norris2017-mk"/>
+    <w:bookmarkEnd w:id="144"/>
+    <w:bookmarkStart w:id="145" w:name="ref-Norris2017-mk"/>
     <w:p>
       <w:pPr>
         <w:pStyle w:val="Bibliography"/>
@@ -7365,8 +7452,8 @@
         <w:t xml:space="preserve">.</w:t>
       </w:r>
     </w:p>
-    <w:bookmarkEnd w:id="144"/>
-    <w:bookmarkStart w:id="146" w:name="ref-Ockey2004-ek"/>
+    <w:bookmarkEnd w:id="145"/>
+    <w:bookmarkStart w:id="147" w:name="ref-Ockey2004-ek"/>
     <w:p>
       <w:pPr>
         <w:pStyle w:val="Bibliography"/>
@@ -7390,7 +7477,7 @@
       <w:r>
         <w:t xml:space="preserve"> </w:t>
       </w:r>
-      <w:hyperlink r:id="rId145">
+      <w:hyperlink r:id="rId146">
         <w:r>
           <w:rPr>
             <w:rStyle w:val="Hyperlink"/>
@@ -7402,8 +7489,8 @@
         <w:t xml:space="preserve">.</w:t>
       </w:r>
     </w:p>
-    <w:bookmarkEnd w:id="146"/>
-    <w:bookmarkStart w:id="148" w:name="ref-Pankaew2022-pr"/>
+    <w:bookmarkEnd w:id="147"/>
+    <w:bookmarkStart w:id="149" w:name="ref-Pankaew2022-pr"/>
     <w:p>
       <w:pPr>
         <w:pStyle w:val="Bibliography"/>
@@ -7442,7 +7529,7 @@
       <w:r>
         <w:t xml:space="preserve"> </w:t>
       </w:r>
-      <w:hyperlink r:id="rId147">
+      <w:hyperlink r:id="rId148">
         <w:r>
           <w:rPr>
             <w:rStyle w:val="Hyperlink"/>
@@ -7454,8 +7541,8 @@
         <w:t xml:space="preserve">.</w:t>
       </w:r>
     </w:p>
-    <w:bookmarkEnd w:id="148"/>
-    <w:bookmarkStart w:id="150" w:name="ref-Rich2025-sf"/>
+    <w:bookmarkEnd w:id="149"/>
+    <w:bookmarkStart w:id="151" w:name="ref-Rich2025-sf"/>
     <w:p>
       <w:pPr>
         <w:pStyle w:val="Bibliography"/>
@@ -7494,7 +7581,7 @@
       <w:r>
         <w:t xml:space="preserve"> </w:t>
       </w:r>
-      <w:hyperlink r:id="rId149">
+      <w:hyperlink r:id="rId150">
         <w:r>
           <w:rPr>
             <w:rStyle w:val="Hyperlink"/>
@@ -7506,8 +7593,8 @@
         <w:t xml:space="preserve">.</w:t>
       </w:r>
     </w:p>
-    <w:bookmarkEnd w:id="150"/>
-    <w:bookmarkStart w:id="152" w:name="ref-Ricks2019-hs"/>
+    <w:bookmarkEnd w:id="151"/>
+    <w:bookmarkStart w:id="153" w:name="ref-Ricks2019-hs"/>
     <w:p>
       <w:pPr>
         <w:pStyle w:val="Bibliography"/>
@@ -7546,7 +7633,7 @@
       <w:r>
         <w:t xml:space="preserve"> </w:t>
       </w:r>
-      <w:hyperlink r:id="rId151">
+      <w:hyperlink r:id="rId152">
         <w:r>
           <w:rPr>
             <w:rStyle w:val="Hyperlink"/>
@@ -7558,8 +7645,8 @@
         <w:t xml:space="preserve">.</w:t>
       </w:r>
     </w:p>
-    <w:bookmarkEnd w:id="152"/>
-    <w:bookmarkStart w:id="154" w:name="ref-Ricks2025-il"/>
+    <w:bookmarkEnd w:id="153"/>
+    <w:bookmarkStart w:id="155" w:name="ref-Ricks2025-il"/>
     <w:p>
       <w:pPr>
         <w:pStyle w:val="Bibliography"/>
@@ -7598,7 +7685,7 @@
       <w:r>
         <w:t xml:space="preserve"> </w:t>
       </w:r>
-      <w:hyperlink r:id="rId153">
+      <w:hyperlink r:id="rId154">
         <w:r>
           <w:rPr>
             <w:rStyle w:val="Hyperlink"/>
@@ -7610,8 +7697,8 @@
         <w:t xml:space="preserve">.</w:t>
       </w:r>
     </w:p>
-    <w:bookmarkEnd w:id="154"/>
-    <w:bookmarkStart w:id="156" w:name="ref-Sadowski2024-wq"/>
+    <w:bookmarkEnd w:id="155"/>
+    <w:bookmarkStart w:id="157" w:name="ref-Sadowski2024-wq"/>
     <w:p>
       <w:pPr>
         <w:pStyle w:val="Bibliography"/>
@@ -7650,7 +7737,7 @@
       <w:r>
         <w:t xml:space="preserve"> </w:t>
       </w:r>
-      <w:hyperlink r:id="rId155">
+      <w:hyperlink r:id="rId156">
         <w:r>
           <w:rPr>
             <w:rStyle w:val="Hyperlink"/>
@@ -7662,8 +7749,8 @@
         <w:t xml:space="preserve">.</w:t>
       </w:r>
     </w:p>
-    <w:bookmarkEnd w:id="156"/>
-    <w:bookmarkStart w:id="158" w:name="ref-Schedler1998-dl"/>
+    <w:bookmarkEnd w:id="157"/>
+    <w:bookmarkStart w:id="159" w:name="ref-Schedler1998-dl"/>
     <w:p>
       <w:pPr>
         <w:pStyle w:val="Bibliography"/>
@@ -7702,7 +7789,7 @@
       <w:r>
         <w:t xml:space="preserve"> </w:t>
       </w:r>
-      <w:hyperlink r:id="rId157">
+      <w:hyperlink r:id="rId158">
         <w:r>
           <w:rPr>
             <w:rStyle w:val="Hyperlink"/>
@@ -7714,8 +7801,8 @@
         <w:t xml:space="preserve">.</w:t>
       </w:r>
     </w:p>
-    <w:bookmarkEnd w:id="158"/>
-    <w:bookmarkStart w:id="160" w:name="ref-Schumpeter2013-em"/>
+    <w:bookmarkEnd w:id="159"/>
+    <w:bookmarkStart w:id="161" w:name="ref-Schumpeter2013-em"/>
     <w:p>
       <w:pPr>
         <w:pStyle w:val="Bibliography"/>
@@ -7739,7 +7826,7 @@
       <w:r>
         <w:t xml:space="preserve"> </w:t>
       </w:r>
-      <w:hyperlink r:id="rId159">
+      <w:hyperlink r:id="rId160">
         <w:r>
           <w:rPr>
             <w:rStyle w:val="Hyperlink"/>
@@ -7751,8 +7838,8 @@
         <w:t xml:space="preserve">.</w:t>
       </w:r>
     </w:p>
-    <w:bookmarkEnd w:id="160"/>
-    <w:bookmarkStart w:id="162" w:name="ref-Shin2011-kc"/>
+    <w:bookmarkEnd w:id="161"/>
+    <w:bookmarkStart w:id="163" w:name="ref-Shin2011-kc"/>
     <w:p>
       <w:pPr>
         <w:pStyle w:val="Bibliography"/>
@@ -7776,7 +7863,7 @@
       <w:r>
         <w:t xml:space="preserve"> </w:t>
       </w:r>
-      <w:hyperlink r:id="rId161">
+      <w:hyperlink r:id="rId162">
         <w:r>
           <w:rPr>
             <w:rStyle w:val="Hyperlink"/>
@@ -7788,8 +7875,8 @@
         <w:t xml:space="preserve">.</w:t>
       </w:r>
     </w:p>
-    <w:bookmarkEnd w:id="162"/>
-    <w:bookmarkStart w:id="164" w:name="ref-Shin2018-mq"/>
+    <w:bookmarkEnd w:id="163"/>
+    <w:bookmarkStart w:id="165" w:name="ref-Shin2018-mq"/>
     <w:p>
       <w:pPr>
         <w:pStyle w:val="Bibliography"/>
@@ -7828,7 +7915,7 @@
       <w:r>
         <w:t xml:space="preserve"> </w:t>
       </w:r>
-      <w:hyperlink r:id="rId163">
+      <w:hyperlink r:id="rId164">
         <w:r>
           <w:rPr>
             <w:rStyle w:val="Hyperlink"/>
@@ -7840,8 +7927,8 @@
         <w:t xml:space="preserve">.</w:t>
       </w:r>
     </w:p>
-    <w:bookmarkEnd w:id="164"/>
-    <w:bookmarkStart w:id="166" w:name="ref-Singh2012-hj"/>
+    <w:bookmarkEnd w:id="165"/>
+    <w:bookmarkStart w:id="167" w:name="ref-Singh2012-hj"/>
     <w:p>
       <w:pPr>
         <w:pStyle w:val="Bibliography"/>
@@ -7880,7 +7967,7 @@
       <w:r>
         <w:t xml:space="preserve"> </w:t>
       </w:r>
-      <w:hyperlink r:id="rId165">
+      <w:hyperlink r:id="rId166">
         <w:r>
           <w:rPr>
             <w:rStyle w:val="Hyperlink"/>
@@ -7892,8 +7979,8 @@
         <w:t xml:space="preserve">.</w:t>
       </w:r>
     </w:p>
-    <w:bookmarkEnd w:id="166"/>
-    <w:bookmarkStart w:id="168" w:name="ref-Sinpeng2021-hd"/>
+    <w:bookmarkEnd w:id="167"/>
+    <w:bookmarkStart w:id="169" w:name="ref-Sinpeng2021-hd"/>
     <w:p>
       <w:pPr>
         <w:pStyle w:val="Bibliography"/>
@@ -7947,7 +8034,7 @@
       <w:r>
         <w:t xml:space="preserve"> </w:t>
       </w:r>
-      <w:hyperlink r:id="rId167">
+      <w:hyperlink r:id="rId168">
         <w:r>
           <w:rPr>
             <w:rStyle w:val="Hyperlink"/>
@@ -7959,8 +8046,8 @@
         <w:t xml:space="preserve">.</w:t>
       </w:r>
     </w:p>
-    <w:bookmarkEnd w:id="168"/>
-    <w:bookmarkStart w:id="170" w:name="ref-Slater2010-ba"/>
+    <w:bookmarkEnd w:id="169"/>
+    <w:bookmarkStart w:id="171" w:name="ref-Slater2010-ba"/>
     <w:p>
       <w:pPr>
         <w:pStyle w:val="Bibliography"/>
@@ -7984,7 +8071,7 @@
       <w:r>
         <w:t xml:space="preserve"> </w:t>
       </w:r>
-      <w:hyperlink r:id="rId169">
+      <w:hyperlink r:id="rId170">
         <w:r>
           <w:rPr>
             <w:rStyle w:val="Hyperlink"/>
@@ -7996,8 +8083,8 @@
         <w:t xml:space="preserve">.</w:t>
       </w:r>
     </w:p>
-    <w:bookmarkEnd w:id="170"/>
-    <w:bookmarkStart w:id="172" w:name="ref-Svolik2019-zi"/>
+    <w:bookmarkEnd w:id="171"/>
+    <w:bookmarkStart w:id="173" w:name="ref-Svolik2019-zi"/>
     <w:p>
       <w:pPr>
         <w:pStyle w:val="Bibliography"/>
@@ -8036,7 +8123,7 @@
       <w:r>
         <w:t xml:space="preserve"> </w:t>
       </w:r>
-      <w:hyperlink r:id="rId171">
+      <w:hyperlink r:id="rId172">
         <w:r>
           <w:rPr>
             <w:rStyle w:val="Hyperlink"/>
@@ -8048,8 +8135,8 @@
         <w:t xml:space="preserve">.</w:t>
       </w:r>
     </w:p>
-    <w:bookmarkEnd w:id="172"/>
-    <w:bookmarkStart w:id="174" w:name="ref-Taber2006-kx"/>
+    <w:bookmarkEnd w:id="173"/>
+    <w:bookmarkStart w:id="175" w:name="ref-Taber2006-kx"/>
     <w:p>
       <w:pPr>
         <w:pStyle w:val="Bibliography"/>
@@ -8088,7 +8175,7 @@
       <w:r>
         <w:t xml:space="preserve"> </w:t>
       </w:r>
-      <w:hyperlink r:id="rId173">
+      <w:hyperlink r:id="rId174">
         <w:r>
           <w:rPr>
             <w:rStyle w:val="Hyperlink"/>
@@ -8100,8 +8187,8 @@
         <w:t xml:space="preserve">.</w:t>
       </w:r>
     </w:p>
-    <w:bookmarkEnd w:id="174"/>
-    <w:bookmarkStart w:id="176" w:name="ref-Waldner2018-yw"/>
+    <w:bookmarkEnd w:id="175"/>
+    <w:bookmarkStart w:id="177" w:name="ref-Waldner2018-yw"/>
     <w:p>
       <w:pPr>
         <w:pStyle w:val="Bibliography"/>
@@ -8140,7 +8227,7 @@
       <w:r>
         <w:t xml:space="preserve"> </w:t>
       </w:r>
-      <w:hyperlink r:id="rId175">
+      <w:hyperlink r:id="rId176">
         <w:r>
           <w:rPr>
             <w:rStyle w:val="Hyperlink"/>
@@ -8152,8 +8239,8 @@
         <w:t xml:space="preserve">.</w:t>
       </w:r>
     </w:p>
-    <w:bookmarkEnd w:id="176"/>
-    <w:bookmarkStart w:id="178" w:name="ref-Wu2022-hz"/>
+    <w:bookmarkEnd w:id="177"/>
+    <w:bookmarkStart w:id="179" w:name="ref-Wu2022-hz"/>
     <w:p>
       <w:pPr>
         <w:pStyle w:val="Bibliography"/>
@@ -8198,7 +8285,7 @@
       <w:r>
         <w:t xml:space="preserve"> </w:t>
       </w:r>
-      <w:hyperlink r:id="rId177">
+      <w:hyperlink r:id="rId178">
         <w:r>
           <w:rPr>
             <w:rStyle w:val="Hyperlink"/>
@@ -8210,8 +8297,8 @@
         <w:t xml:space="preserve">.</w:t>
       </w:r>
     </w:p>
-    <w:bookmarkEnd w:id="178"/>
-    <w:bookmarkStart w:id="180" w:name="ref-Wuttke2022-wv"/>
+    <w:bookmarkEnd w:id="179"/>
+    <w:bookmarkStart w:id="181" w:name="ref-Wuttke2022-wv"/>
     <w:p>
       <w:pPr>
         <w:pStyle w:val="Bibliography"/>
@@ -8256,7 +8343,7 @@
       <w:r>
         <w:t xml:space="preserve"> </w:t>
       </w:r>
-      <w:hyperlink r:id="rId179">
+      <w:hyperlink r:id="rId180">
         <w:r>
           <w:rPr>
             <w:rStyle w:val="Hyperlink"/>
@@ -8268,9 +8355,9 @@
         <w:t xml:space="preserve">.</w:t>
       </w:r>
     </w:p>
-    <w:bookmarkEnd w:id="180"/>
     <w:bookmarkEnd w:id="181"/>
     <w:bookmarkEnd w:id="182"/>
+    <w:bookmarkEnd w:id="183"/>
     <w:sectPr>
       <w:footnotePr>
         <w:numRestart w:val="eachSect"/>

</xml_diff>